<commit_message>
Fix Table 1 column widths to prevent field-name wrapping and numeric overlap
</commit_message>
<xml_diff>
--- a/manuscrito/manuscript.docx
+++ b/manuscrito/manuscript.docx
@@ -1642,13 +1642,13 @@
         <w:tblLook w:firstRow="1" w:lastRow="0" w:firstColumn="0" w:lastColumn="0" w:noHBand="0" w:noVBand="0" w:val="0020"/>
       </w:tblPr>
       <w:tblGrid>
-        <w:gridCol w:w="880"/>
-        <w:gridCol w:w="1173"/>
-        <w:gridCol w:w="1173"/>
-        <w:gridCol w:w="1173"/>
-        <w:gridCol w:w="1173"/>
-        <w:gridCol w:w="1173"/>
-        <w:gridCol w:w="1173"/>
+        <w:gridCol w:w="2146"/>
+        <w:gridCol w:w="868"/>
+        <w:gridCol w:w="919"/>
+        <w:gridCol w:w="1021"/>
+        <w:gridCol w:w="766"/>
+        <w:gridCol w:w="970"/>
+        <w:gridCol w:w="1226"/>
       </w:tblGrid>
       <w:tr>
         <w:tc>
@@ -1666,7 +1666,7 @@
           <w:p>
             <w:pPr>
               <w:pStyle w:val="Compact"/>
-              <w:jc w:val="right"/>
+              <w:jc w:val="left"/>
             </w:pPr>
             <w:r>
               <w:t xml:space="preserve">Articles (n)</w:t>
@@ -1677,7 +1677,7 @@
           <w:p>
             <w:pPr>
               <w:pStyle w:val="Compact"/>
-              <w:jc w:val="right"/>
+              <w:jc w:val="left"/>
             </w:pPr>
             <w:r>
               <w:t xml:space="preserve">Network nodes</w:t>
@@ -1688,7 +1688,7 @@
           <w:p>
             <w:pPr>
               <w:pStyle w:val="Compact"/>
-              <w:jc w:val="right"/>
+              <w:jc w:val="left"/>
             </w:pPr>
             <w:r>
               <w:t xml:space="preserve">Perspectives</w:t>
@@ -1699,7 +1699,7 @@
           <w:p>
             <w:pPr>
               <w:pStyle w:val="Compact"/>
-              <w:jc w:val="right"/>
+              <w:jc w:val="left"/>
             </w:pPr>
             <w:r>
               <w:t xml:space="preserve">IFP</w:t>
@@ -1710,7 +1710,7 @@
           <w:p>
             <w:pPr>
               <w:pStyle w:val="Compact"/>
-              <w:jc w:val="right"/>
+              <w:jc w:val="left"/>
             </w:pPr>
             <w:r>
               <w:t xml:space="preserve">Modularity (Q)</w:t>
@@ -1721,7 +1721,7 @@
           <w:p>
             <w:pPr>
               <w:pStyle w:val="Compact"/>
-              <w:jc w:val="right"/>
+              <w:jc w:val="left"/>
             </w:pPr>
             <w:r>
               <w:t xml:space="preserve">Inter-cluster prop.</w:t>
@@ -1744,66 +1744,84 @@
         <w:tc>
           <w:p>
             <w:pPr>
-              <w:pStyle w:val="Compact"/>
-              <w:jc w:val="right"/>
-            </w:pPr>
-            <w:r>
-              <w:t xml:space="preserve">534</w:t>
-            </w:r>
-          </w:p>
-        </w:tc>
-        <w:tc>
-          <w:p>
-            <w:pPr>
-              <w:pStyle w:val="Compact"/>
-              <w:jc w:val="right"/>
-            </w:pPr>
-            <w:r>
-              <w:t xml:space="preserve">1,892</w:t>
-            </w:r>
-          </w:p>
-        </w:tc>
-        <w:tc>
-          <w:p>
-            <w:pPr>
-              <w:pStyle w:val="Compact"/>
-              <w:jc w:val="right"/>
-            </w:pPr>
-            <w:r>
-              <w:t xml:space="preserve">3</w:t>
-            </w:r>
-          </w:p>
-        </w:tc>
-        <w:tc>
-          <w:p>
-            <w:pPr>
-              <w:pStyle w:val="Compact"/>
-              <w:jc w:val="right"/>
-            </w:pPr>
-            <w:r>
-              <w:t xml:space="preserve">0.328</w:t>
-            </w:r>
-          </w:p>
-        </w:tc>
-        <w:tc>
-          <w:p>
-            <w:pPr>
-              <w:pStyle w:val="Compact"/>
-              <w:jc w:val="right"/>
-            </w:pPr>
-            <w:r>
-              <w:t xml:space="preserve">0.297</w:t>
-            </w:r>
-          </w:p>
-        </w:tc>
-        <w:tc>
-          <w:p>
-            <w:pPr>
-              <w:pStyle w:val="Compact"/>
-              <w:jc w:val="right"/>
-            </w:pPr>
-            <w:r>
-              <w:t xml:space="preserve">0.313</w:t>
+              <w:pStyle w:val="SourceCode"/>
+              <w:jc w:val="left"/>
+            </w:pPr>
+            <w:r>
+              <w:rPr>
+                <w:rStyle w:val="VerbatimChar"/>
+              </w:rPr>
+              <w:t xml:space="preserve">       534</w:t>
+            </w:r>
+          </w:p>
+        </w:tc>
+        <w:tc>
+          <w:p>
+            <w:pPr>
+              <w:pStyle w:val="SourceCode"/>
+              <w:jc w:val="left"/>
+            </w:pPr>
+            <w:r>
+              <w:rPr>
+                <w:rStyle w:val="VerbatimChar"/>
+              </w:rPr>
+              <w:t xml:space="preserve">      1,892</w:t>
+            </w:r>
+          </w:p>
+        </w:tc>
+        <w:tc>
+          <w:p>
+            <w:pPr>
+              <w:pStyle w:val="SourceCode"/>
+              <w:jc w:val="left"/>
+            </w:pPr>
+            <w:r>
+              <w:rPr>
+                <w:rStyle w:val="VerbatimChar"/>
+              </w:rPr>
+              <w:t xml:space="preserve">            3</w:t>
+            </w:r>
+          </w:p>
+        </w:tc>
+        <w:tc>
+          <w:p>
+            <w:pPr>
+              <w:pStyle w:val="SourceCode"/>
+              <w:jc w:val="left"/>
+            </w:pPr>
+            <w:r>
+              <w:rPr>
+                <w:rStyle w:val="VerbatimChar"/>
+              </w:rPr>
+              <w:t xml:space="preserve">   0.328</w:t>
+            </w:r>
+          </w:p>
+        </w:tc>
+        <w:tc>
+          <w:p>
+            <w:pPr>
+              <w:pStyle w:val="SourceCode"/>
+              <w:jc w:val="left"/>
+            </w:pPr>
+            <w:r>
+              <w:rPr>
+                <w:rStyle w:val="VerbatimChar"/>
+              </w:rPr>
+              <w:t xml:space="preserve">       0.297</w:t>
+            </w:r>
+          </w:p>
+        </w:tc>
+        <w:tc>
+          <w:p>
+            <w:pPr>
+              <w:pStyle w:val="SourceCode"/>
+              <w:jc w:val="left"/>
+            </w:pPr>
+            <w:r>
+              <w:rPr>
+                <w:rStyle w:val="VerbatimChar"/>
+              </w:rPr>
+              <w:t xml:space="preserve">            0.313</w:t>
             </w:r>
           </w:p>
         </w:tc>
@@ -1823,66 +1841,84 @@
         <w:tc>
           <w:p>
             <w:pPr>
-              <w:pStyle w:val="Compact"/>
-              <w:jc w:val="right"/>
-            </w:pPr>
-            <w:r>
-              <w:t xml:space="preserve">1,053</w:t>
-            </w:r>
-          </w:p>
-        </w:tc>
-        <w:tc>
-          <w:p>
-            <w:pPr>
-              <w:pStyle w:val="Compact"/>
-              <w:jc w:val="right"/>
-            </w:pPr>
-            <w:r>
-              <w:t xml:space="preserve">1,956</w:t>
-            </w:r>
-          </w:p>
-        </w:tc>
-        <w:tc>
-          <w:p>
-            <w:pPr>
-              <w:pStyle w:val="Compact"/>
-              <w:jc w:val="right"/>
-            </w:pPr>
-            <w:r>
-              <w:t xml:space="preserve">4</w:t>
-            </w:r>
-          </w:p>
-        </w:tc>
-        <w:tc>
-          <w:p>
-            <w:pPr>
-              <w:pStyle w:val="Compact"/>
-              <w:jc w:val="right"/>
-            </w:pPr>
-            <w:r>
-              <w:t xml:space="preserve">0.370</w:t>
-            </w:r>
-          </w:p>
-        </w:tc>
-        <w:tc>
-          <w:p>
-            <w:pPr>
-              <w:pStyle w:val="Compact"/>
-              <w:jc w:val="right"/>
-            </w:pPr>
-            <w:r>
-              <w:t xml:space="preserve">0.536</w:t>
-            </w:r>
-          </w:p>
-        </w:tc>
-        <w:tc>
-          <w:p>
-            <w:pPr>
-              <w:pStyle w:val="Compact"/>
-              <w:jc w:val="right"/>
-            </w:pPr>
-            <w:r>
-              <w:t xml:space="preserve">0.075</w:t>
+              <w:pStyle w:val="SourceCode"/>
+              <w:jc w:val="left"/>
+            </w:pPr>
+            <w:r>
+              <w:rPr>
+                <w:rStyle w:val="VerbatimChar"/>
+              </w:rPr>
+              <w:t xml:space="preserve">     1,053</w:t>
+            </w:r>
+          </w:p>
+        </w:tc>
+        <w:tc>
+          <w:p>
+            <w:pPr>
+              <w:pStyle w:val="SourceCode"/>
+              <w:jc w:val="left"/>
+            </w:pPr>
+            <w:r>
+              <w:rPr>
+                <w:rStyle w:val="VerbatimChar"/>
+              </w:rPr>
+              <w:t xml:space="preserve">      1,956</w:t>
+            </w:r>
+          </w:p>
+        </w:tc>
+        <w:tc>
+          <w:p>
+            <w:pPr>
+              <w:pStyle w:val="SourceCode"/>
+              <w:jc w:val="left"/>
+            </w:pPr>
+            <w:r>
+              <w:rPr>
+                <w:rStyle w:val="VerbatimChar"/>
+              </w:rPr>
+              <w:t xml:space="preserve">            4</w:t>
+            </w:r>
+          </w:p>
+        </w:tc>
+        <w:tc>
+          <w:p>
+            <w:pPr>
+              <w:pStyle w:val="SourceCode"/>
+              <w:jc w:val="left"/>
+            </w:pPr>
+            <w:r>
+              <w:rPr>
+                <w:rStyle w:val="VerbatimChar"/>
+              </w:rPr>
+              <w:t xml:space="preserve">   0.370</w:t>
+            </w:r>
+          </w:p>
+        </w:tc>
+        <w:tc>
+          <w:p>
+            <w:pPr>
+              <w:pStyle w:val="SourceCode"/>
+              <w:jc w:val="left"/>
+            </w:pPr>
+            <w:r>
+              <w:rPr>
+                <w:rStyle w:val="VerbatimChar"/>
+              </w:rPr>
+              <w:t xml:space="preserve">       0.536</w:t>
+            </w:r>
+          </w:p>
+        </w:tc>
+        <w:tc>
+          <w:p>
+            <w:pPr>
+              <w:pStyle w:val="SourceCode"/>
+              <w:jc w:val="left"/>
+            </w:pPr>
+            <w:r>
+              <w:rPr>
+                <w:rStyle w:val="VerbatimChar"/>
+              </w:rPr>
+              <w:t xml:space="preserve">            0.075</w:t>
             </w:r>
           </w:p>
         </w:tc>
@@ -1902,66 +1938,84 @@
         <w:tc>
           <w:p>
             <w:pPr>
-              <w:pStyle w:val="Compact"/>
-              <w:jc w:val="right"/>
-            </w:pPr>
-            <w:r>
-              <w:t xml:space="preserve">1,617</w:t>
-            </w:r>
-          </w:p>
-        </w:tc>
-        <w:tc>
-          <w:p>
-            <w:pPr>
-              <w:pStyle w:val="Compact"/>
-              <w:jc w:val="right"/>
-            </w:pPr>
-            <w:r>
-              <w:t xml:space="preserve">2,075</w:t>
-            </w:r>
-          </w:p>
-        </w:tc>
-        <w:tc>
-          <w:p>
-            <w:pPr>
-              <w:pStyle w:val="Compact"/>
-              <w:jc w:val="right"/>
-            </w:pPr>
-            <w:r>
-              <w:t xml:space="preserve">4</w:t>
-            </w:r>
-          </w:p>
-        </w:tc>
-        <w:tc>
-          <w:p>
-            <w:pPr>
-              <w:pStyle w:val="Compact"/>
-              <w:jc w:val="right"/>
-            </w:pPr>
-            <w:r>
-              <w:t xml:space="preserve">0.372</w:t>
-            </w:r>
-          </w:p>
-        </w:tc>
-        <w:tc>
-          <w:p>
-            <w:pPr>
-              <w:pStyle w:val="Compact"/>
-              <w:jc w:val="right"/>
-            </w:pPr>
-            <w:r>
-              <w:t xml:space="preserve">0.359</w:t>
-            </w:r>
-          </w:p>
-        </w:tc>
-        <w:tc>
-          <w:p>
-            <w:pPr>
-              <w:pStyle w:val="Compact"/>
-              <w:jc w:val="right"/>
-            </w:pPr>
-            <w:r>
-              <w:t xml:space="preserve">0.256</w:t>
+              <w:pStyle w:val="SourceCode"/>
+              <w:jc w:val="left"/>
+            </w:pPr>
+            <w:r>
+              <w:rPr>
+                <w:rStyle w:val="VerbatimChar"/>
+              </w:rPr>
+              <w:t xml:space="preserve">     1,617</w:t>
+            </w:r>
+          </w:p>
+        </w:tc>
+        <w:tc>
+          <w:p>
+            <w:pPr>
+              <w:pStyle w:val="SourceCode"/>
+              <w:jc w:val="left"/>
+            </w:pPr>
+            <w:r>
+              <w:rPr>
+                <w:rStyle w:val="VerbatimChar"/>
+              </w:rPr>
+              <w:t xml:space="preserve">      2,075</w:t>
+            </w:r>
+          </w:p>
+        </w:tc>
+        <w:tc>
+          <w:p>
+            <w:pPr>
+              <w:pStyle w:val="SourceCode"/>
+              <w:jc w:val="left"/>
+            </w:pPr>
+            <w:r>
+              <w:rPr>
+                <w:rStyle w:val="VerbatimChar"/>
+              </w:rPr>
+              <w:t xml:space="preserve">            4</w:t>
+            </w:r>
+          </w:p>
+        </w:tc>
+        <w:tc>
+          <w:p>
+            <w:pPr>
+              <w:pStyle w:val="SourceCode"/>
+              <w:jc w:val="left"/>
+            </w:pPr>
+            <w:r>
+              <w:rPr>
+                <w:rStyle w:val="VerbatimChar"/>
+              </w:rPr>
+              <w:t xml:space="preserve">   0.372</w:t>
+            </w:r>
+          </w:p>
+        </w:tc>
+        <w:tc>
+          <w:p>
+            <w:pPr>
+              <w:pStyle w:val="SourceCode"/>
+              <w:jc w:val="left"/>
+            </w:pPr>
+            <w:r>
+              <w:rPr>
+                <w:rStyle w:val="VerbatimChar"/>
+              </w:rPr>
+              <w:t xml:space="preserve">       0.359</w:t>
+            </w:r>
+          </w:p>
+        </w:tc>
+        <w:tc>
+          <w:p>
+            <w:pPr>
+              <w:pStyle w:val="SourceCode"/>
+              <w:jc w:val="left"/>
+            </w:pPr>
+            <w:r>
+              <w:rPr>
+                <w:rStyle w:val="VerbatimChar"/>
+              </w:rPr>
+              <w:t xml:space="preserve">            0.256</w:t>
             </w:r>
           </w:p>
         </w:tc>
@@ -1981,66 +2035,84 @@
         <w:tc>
           <w:p>
             <w:pPr>
-              <w:pStyle w:val="Compact"/>
-              <w:jc w:val="right"/>
-            </w:pPr>
-            <w:r>
-              <w:t xml:space="preserve">1,592</w:t>
-            </w:r>
-          </w:p>
-        </w:tc>
-        <w:tc>
-          <w:p>
-            <w:pPr>
-              <w:pStyle w:val="Compact"/>
-              <w:jc w:val="right"/>
-            </w:pPr>
-            <w:r>
-              <w:t xml:space="preserve">2,123</w:t>
-            </w:r>
-          </w:p>
-        </w:tc>
-        <w:tc>
-          <w:p>
-            <w:pPr>
-              <w:pStyle w:val="Compact"/>
-              <w:jc w:val="right"/>
-            </w:pPr>
-            <w:r>
-              <w:t xml:space="preserve">4</w:t>
-            </w:r>
-          </w:p>
-        </w:tc>
-        <w:tc>
-          <w:p>
-            <w:pPr>
-              <w:pStyle w:val="Compact"/>
-              <w:jc w:val="right"/>
-            </w:pPr>
-            <w:r>
-              <w:t xml:space="preserve">0.379</w:t>
-            </w:r>
-          </w:p>
-        </w:tc>
-        <w:tc>
-          <w:p>
-            <w:pPr>
-              <w:pStyle w:val="Compact"/>
-              <w:jc w:val="right"/>
-            </w:pPr>
-            <w:r>
-              <w:t xml:space="preserve">0.308</w:t>
-            </w:r>
-          </w:p>
-        </w:tc>
-        <w:tc>
-          <w:p>
-            <w:pPr>
-              <w:pStyle w:val="Compact"/>
-              <w:jc w:val="right"/>
-            </w:pPr>
-            <w:r>
-              <w:t xml:space="preserve">0.330</w:t>
+              <w:pStyle w:val="SourceCode"/>
+              <w:jc w:val="left"/>
+            </w:pPr>
+            <w:r>
+              <w:rPr>
+                <w:rStyle w:val="VerbatimChar"/>
+              </w:rPr>
+              <w:t xml:space="preserve">     1,592</w:t>
+            </w:r>
+          </w:p>
+        </w:tc>
+        <w:tc>
+          <w:p>
+            <w:pPr>
+              <w:pStyle w:val="SourceCode"/>
+              <w:jc w:val="left"/>
+            </w:pPr>
+            <w:r>
+              <w:rPr>
+                <w:rStyle w:val="VerbatimChar"/>
+              </w:rPr>
+              <w:t xml:space="preserve">      2,123</w:t>
+            </w:r>
+          </w:p>
+        </w:tc>
+        <w:tc>
+          <w:p>
+            <w:pPr>
+              <w:pStyle w:val="SourceCode"/>
+              <w:jc w:val="left"/>
+            </w:pPr>
+            <w:r>
+              <w:rPr>
+                <w:rStyle w:val="VerbatimChar"/>
+              </w:rPr>
+              <w:t xml:space="preserve">            4</w:t>
+            </w:r>
+          </w:p>
+        </w:tc>
+        <w:tc>
+          <w:p>
+            <w:pPr>
+              <w:pStyle w:val="SourceCode"/>
+              <w:jc w:val="left"/>
+            </w:pPr>
+            <w:r>
+              <w:rPr>
+                <w:rStyle w:val="VerbatimChar"/>
+              </w:rPr>
+              <w:t xml:space="preserve">   0.379</w:t>
+            </w:r>
+          </w:p>
+        </w:tc>
+        <w:tc>
+          <w:p>
+            <w:pPr>
+              <w:pStyle w:val="SourceCode"/>
+              <w:jc w:val="left"/>
+            </w:pPr>
+            <w:r>
+              <w:rPr>
+                <w:rStyle w:val="VerbatimChar"/>
+              </w:rPr>
+              <w:t xml:space="preserve">       0.308</w:t>
+            </w:r>
+          </w:p>
+        </w:tc>
+        <w:tc>
+          <w:p>
+            <w:pPr>
+              <w:pStyle w:val="SourceCode"/>
+              <w:jc w:val="left"/>
+            </w:pPr>
+            <w:r>
+              <w:rPr>
+                <w:rStyle w:val="VerbatimChar"/>
+              </w:rPr>
+              <w:t xml:space="preserve">            0.330</w:t>
             </w:r>
           </w:p>
         </w:tc>
@@ -2060,66 +2132,84 @@
         <w:tc>
           <w:p>
             <w:pPr>
-              <w:pStyle w:val="Compact"/>
-              <w:jc w:val="right"/>
-            </w:pPr>
-            <w:r>
-              <w:t xml:space="preserve">398</w:t>
-            </w:r>
-          </w:p>
-        </w:tc>
-        <w:tc>
-          <w:p>
-            <w:pPr>
-              <w:pStyle w:val="Compact"/>
-              <w:jc w:val="right"/>
-            </w:pPr>
-            <w:r>
-              <w:t xml:space="preserve">1,217</w:t>
-            </w:r>
-          </w:p>
-        </w:tc>
-        <w:tc>
-          <w:p>
-            <w:pPr>
-              <w:pStyle w:val="Compact"/>
-              <w:jc w:val="right"/>
-            </w:pPr>
-            <w:r>
-              <w:t xml:space="preserve">5</w:t>
-            </w:r>
-          </w:p>
-        </w:tc>
-        <w:tc>
-          <w:p>
-            <w:pPr>
-              <w:pStyle w:val="Compact"/>
-              <w:jc w:val="right"/>
-            </w:pPr>
-            <w:r>
-              <w:t xml:space="preserve">0.441</w:t>
-            </w:r>
-          </w:p>
-        </w:tc>
-        <w:tc>
-          <w:p>
-            <w:pPr>
-              <w:pStyle w:val="Compact"/>
-              <w:jc w:val="right"/>
-            </w:pPr>
-            <w:r>
-              <w:t xml:space="preserve">0.572</w:t>
-            </w:r>
-          </w:p>
-        </w:tc>
-        <w:tc>
-          <w:p>
-            <w:pPr>
-              <w:pStyle w:val="Compact"/>
-              <w:jc w:val="right"/>
-            </w:pPr>
-            <w:r>
-              <w:t xml:space="preserve">0.126</w:t>
+              <w:pStyle w:val="SourceCode"/>
+              <w:jc w:val="left"/>
+            </w:pPr>
+            <w:r>
+              <w:rPr>
+                <w:rStyle w:val="VerbatimChar"/>
+              </w:rPr>
+              <w:t xml:space="preserve">       398</w:t>
+            </w:r>
+          </w:p>
+        </w:tc>
+        <w:tc>
+          <w:p>
+            <w:pPr>
+              <w:pStyle w:val="SourceCode"/>
+              <w:jc w:val="left"/>
+            </w:pPr>
+            <w:r>
+              <w:rPr>
+                <w:rStyle w:val="VerbatimChar"/>
+              </w:rPr>
+              <w:t xml:space="preserve">      1,217</w:t>
+            </w:r>
+          </w:p>
+        </w:tc>
+        <w:tc>
+          <w:p>
+            <w:pPr>
+              <w:pStyle w:val="SourceCode"/>
+              <w:jc w:val="left"/>
+            </w:pPr>
+            <w:r>
+              <w:rPr>
+                <w:rStyle w:val="VerbatimChar"/>
+              </w:rPr>
+              <w:t xml:space="preserve">            5</w:t>
+            </w:r>
+          </w:p>
+        </w:tc>
+        <w:tc>
+          <w:p>
+            <w:pPr>
+              <w:pStyle w:val="SourceCode"/>
+              <w:jc w:val="left"/>
+            </w:pPr>
+            <w:r>
+              <w:rPr>
+                <w:rStyle w:val="VerbatimChar"/>
+              </w:rPr>
+              <w:t xml:space="preserve">   0.441</w:t>
+            </w:r>
+          </w:p>
+        </w:tc>
+        <w:tc>
+          <w:p>
+            <w:pPr>
+              <w:pStyle w:val="SourceCode"/>
+              <w:jc w:val="left"/>
+            </w:pPr>
+            <w:r>
+              <w:rPr>
+                <w:rStyle w:val="VerbatimChar"/>
+              </w:rPr>
+              <w:t xml:space="preserve">       0.572</w:t>
+            </w:r>
+          </w:p>
+        </w:tc>
+        <w:tc>
+          <w:p>
+            <w:pPr>
+              <w:pStyle w:val="SourceCode"/>
+              <w:jc w:val="left"/>
+            </w:pPr>
+            <w:r>
+              <w:rPr>
+                <w:rStyle w:val="VerbatimChar"/>
+              </w:rPr>
+              <w:t xml:space="preserve">            0.126</w:t>
             </w:r>
           </w:p>
         </w:tc>
@@ -2139,66 +2229,84 @@
         <w:tc>
           <w:p>
             <w:pPr>
-              <w:pStyle w:val="Compact"/>
-              <w:jc w:val="right"/>
-            </w:pPr>
-            <w:r>
-              <w:t xml:space="preserve">890</w:t>
-            </w:r>
-          </w:p>
-        </w:tc>
-        <w:tc>
-          <w:p>
-            <w:pPr>
-              <w:pStyle w:val="Compact"/>
-              <w:jc w:val="right"/>
-            </w:pPr>
-            <w:r>
-              <w:t xml:space="preserve">2,105</w:t>
-            </w:r>
-          </w:p>
-        </w:tc>
-        <w:tc>
-          <w:p>
-            <w:pPr>
-              <w:pStyle w:val="Compact"/>
-              <w:jc w:val="right"/>
-            </w:pPr>
-            <w:r>
-              <w:t xml:space="preserve">5</w:t>
-            </w:r>
-          </w:p>
-        </w:tc>
-        <w:tc>
-          <w:p>
-            <w:pPr>
-              <w:pStyle w:val="Compact"/>
-              <w:jc w:val="right"/>
-            </w:pPr>
-            <w:r>
-              <w:t xml:space="preserve">0.450</w:t>
-            </w:r>
-          </w:p>
-        </w:tc>
-        <w:tc>
-          <w:p>
-            <w:pPr>
-              <w:pStyle w:val="Compact"/>
-              <w:jc w:val="right"/>
-            </w:pPr>
-            <w:r>
-              <w:t xml:space="preserve">0.301</w:t>
-            </w:r>
-          </w:p>
-        </w:tc>
-        <w:tc>
-          <w:p>
-            <w:pPr>
-              <w:pStyle w:val="Compact"/>
-              <w:jc w:val="right"/>
-            </w:pPr>
-            <w:r>
-              <w:t xml:space="preserve">0.424</w:t>
+              <w:pStyle w:val="SourceCode"/>
+              <w:jc w:val="left"/>
+            </w:pPr>
+            <w:r>
+              <w:rPr>
+                <w:rStyle w:val="VerbatimChar"/>
+              </w:rPr>
+              <w:t xml:space="preserve">       890</w:t>
+            </w:r>
+          </w:p>
+        </w:tc>
+        <w:tc>
+          <w:p>
+            <w:pPr>
+              <w:pStyle w:val="SourceCode"/>
+              <w:jc w:val="left"/>
+            </w:pPr>
+            <w:r>
+              <w:rPr>
+                <w:rStyle w:val="VerbatimChar"/>
+              </w:rPr>
+              <w:t xml:space="preserve">      2,105</w:t>
+            </w:r>
+          </w:p>
+        </w:tc>
+        <w:tc>
+          <w:p>
+            <w:pPr>
+              <w:pStyle w:val="SourceCode"/>
+              <w:jc w:val="left"/>
+            </w:pPr>
+            <w:r>
+              <w:rPr>
+                <w:rStyle w:val="VerbatimChar"/>
+              </w:rPr>
+              <w:t xml:space="preserve">            5</w:t>
+            </w:r>
+          </w:p>
+        </w:tc>
+        <w:tc>
+          <w:p>
+            <w:pPr>
+              <w:pStyle w:val="SourceCode"/>
+              <w:jc w:val="left"/>
+            </w:pPr>
+            <w:r>
+              <w:rPr>
+                <w:rStyle w:val="VerbatimChar"/>
+              </w:rPr>
+              <w:t xml:space="preserve">   0.450</w:t>
+            </w:r>
+          </w:p>
+        </w:tc>
+        <w:tc>
+          <w:p>
+            <w:pPr>
+              <w:pStyle w:val="SourceCode"/>
+              <w:jc w:val="left"/>
+            </w:pPr>
+            <w:r>
+              <w:rPr>
+                <w:rStyle w:val="VerbatimChar"/>
+              </w:rPr>
+              <w:t xml:space="preserve">       0.301</w:t>
+            </w:r>
+          </w:p>
+        </w:tc>
+        <w:tc>
+          <w:p>
+            <w:pPr>
+              <w:pStyle w:val="SourceCode"/>
+              <w:jc w:val="left"/>
+            </w:pPr>
+            <w:r>
+              <w:rPr>
+                <w:rStyle w:val="VerbatimChar"/>
+              </w:rPr>
+              <w:t xml:space="preserve">            0.424</w:t>
             </w:r>
           </w:p>
         </w:tc>
@@ -2218,66 +2326,84 @@
         <w:tc>
           <w:p>
             <w:pPr>
-              <w:pStyle w:val="Compact"/>
-              <w:jc w:val="right"/>
-            </w:pPr>
-            <w:r>
-              <w:t xml:space="preserve">1,204</w:t>
-            </w:r>
-          </w:p>
-        </w:tc>
-        <w:tc>
-          <w:p>
-            <w:pPr>
-              <w:pStyle w:val="Compact"/>
-              <w:jc w:val="right"/>
-            </w:pPr>
-            <w:r>
-              <w:t xml:space="preserve">2,077</w:t>
-            </w:r>
-          </w:p>
-        </w:tc>
-        <w:tc>
-          <w:p>
-            <w:pPr>
-              <w:pStyle w:val="Compact"/>
-              <w:jc w:val="right"/>
-            </w:pPr>
-            <w:r>
-              <w:t xml:space="preserve">6</w:t>
-            </w:r>
-          </w:p>
-        </w:tc>
-        <w:tc>
-          <w:p>
-            <w:pPr>
-              <w:pStyle w:val="Compact"/>
-              <w:jc w:val="right"/>
-            </w:pPr>
-            <w:r>
-              <w:t xml:space="preserve">0.494</w:t>
-            </w:r>
-          </w:p>
-        </w:tc>
-        <w:tc>
-          <w:p>
-            <w:pPr>
-              <w:pStyle w:val="Compact"/>
-              <w:jc w:val="right"/>
-            </w:pPr>
-            <w:r>
-              <w:t xml:space="preserve">0.308</w:t>
-            </w:r>
-          </w:p>
-        </w:tc>
-        <w:tc>
-          <w:p>
-            <w:pPr>
-              <w:pStyle w:val="Compact"/>
-              <w:jc w:val="right"/>
-            </w:pPr>
-            <w:r>
-              <w:t xml:space="preserve">0.422</w:t>
+              <w:pStyle w:val="SourceCode"/>
+              <w:jc w:val="left"/>
+            </w:pPr>
+            <w:r>
+              <w:rPr>
+                <w:rStyle w:val="VerbatimChar"/>
+              </w:rPr>
+              <w:t xml:space="preserve">     1,204</w:t>
+            </w:r>
+          </w:p>
+        </w:tc>
+        <w:tc>
+          <w:p>
+            <w:pPr>
+              <w:pStyle w:val="SourceCode"/>
+              <w:jc w:val="left"/>
+            </w:pPr>
+            <w:r>
+              <w:rPr>
+                <w:rStyle w:val="VerbatimChar"/>
+              </w:rPr>
+              <w:t xml:space="preserve">      2,077</w:t>
+            </w:r>
+          </w:p>
+        </w:tc>
+        <w:tc>
+          <w:p>
+            <w:pPr>
+              <w:pStyle w:val="SourceCode"/>
+              <w:jc w:val="left"/>
+            </w:pPr>
+            <w:r>
+              <w:rPr>
+                <w:rStyle w:val="VerbatimChar"/>
+              </w:rPr>
+              <w:t xml:space="preserve">            6</w:t>
+            </w:r>
+          </w:p>
+        </w:tc>
+        <w:tc>
+          <w:p>
+            <w:pPr>
+              <w:pStyle w:val="SourceCode"/>
+              <w:jc w:val="left"/>
+            </w:pPr>
+            <w:r>
+              <w:rPr>
+                <w:rStyle w:val="VerbatimChar"/>
+              </w:rPr>
+              <w:t xml:space="preserve">   0.494</w:t>
+            </w:r>
+          </w:p>
+        </w:tc>
+        <w:tc>
+          <w:p>
+            <w:pPr>
+              <w:pStyle w:val="SourceCode"/>
+              <w:jc w:val="left"/>
+            </w:pPr>
+            <w:r>
+              <w:rPr>
+                <w:rStyle w:val="VerbatimChar"/>
+              </w:rPr>
+              <w:t xml:space="preserve">       0.308</w:t>
+            </w:r>
+          </w:p>
+        </w:tc>
+        <w:tc>
+          <w:p>
+            <w:pPr>
+              <w:pStyle w:val="SourceCode"/>
+              <w:jc w:val="left"/>
+            </w:pPr>
+            <w:r>
+              <w:rPr>
+                <w:rStyle w:val="VerbatimChar"/>
+              </w:rPr>
+              <w:t xml:space="preserve">            0.422</w:t>
             </w:r>
           </w:p>
         </w:tc>
@@ -2290,73 +2416,91 @@
               <w:jc w:val="left"/>
             </w:pPr>
             <w:r>
-              <w:t xml:space="preserve">Quantum Computing</w:t>
-            </w:r>
-          </w:p>
-        </w:tc>
-        <w:tc>
-          <w:p>
-            <w:pPr>
-              <w:pStyle w:val="Compact"/>
-              <w:jc w:val="right"/>
-            </w:pPr>
-            <w:r>
-              <w:t xml:space="preserve">412</w:t>
-            </w:r>
-          </w:p>
-        </w:tc>
-        <w:tc>
-          <w:p>
-            <w:pPr>
-              <w:pStyle w:val="Compact"/>
-              <w:jc w:val="right"/>
-            </w:pPr>
-            <w:r>
-              <w:t xml:space="preserve">2,519</w:t>
-            </w:r>
-          </w:p>
-        </w:tc>
-        <w:tc>
-          <w:p>
-            <w:pPr>
-              <w:pStyle w:val="Compact"/>
-              <w:jc w:val="right"/>
-            </w:pPr>
-            <w:r>
-              <w:t xml:space="preserve">6</w:t>
-            </w:r>
-          </w:p>
-        </w:tc>
-        <w:tc>
-          <w:p>
-            <w:pPr>
-              <w:pStyle w:val="Compact"/>
-              <w:jc w:val="right"/>
-            </w:pPr>
-            <w:r>
-              <w:t xml:space="preserve">0.511</w:t>
-            </w:r>
-          </w:p>
-        </w:tc>
-        <w:tc>
-          <w:p>
-            <w:pPr>
-              <w:pStyle w:val="Compact"/>
-              <w:jc w:val="right"/>
-            </w:pPr>
-            <w:r>
-              <w:t xml:space="preserve">0.396</w:t>
-            </w:r>
-          </w:p>
-        </w:tc>
-        <w:tc>
-          <w:p>
-            <w:pPr>
-              <w:pStyle w:val="Compact"/>
-              <w:jc w:val="right"/>
-            </w:pPr>
-            <w:r>
-              <w:t xml:space="preserve">0.385</w:t>
+              <w:t xml:space="preserve">Climate Change Adaptation</w:t>
+            </w:r>
+          </w:p>
+        </w:tc>
+        <w:tc>
+          <w:p>
+            <w:pPr>
+              <w:pStyle w:val="SourceCode"/>
+              <w:jc w:val="left"/>
+            </w:pPr>
+            <w:r>
+              <w:rPr>
+                <w:rStyle w:val="VerbatimChar"/>
+              </w:rPr>
+              <w:t xml:space="preserve">     1,019</w:t>
+            </w:r>
+          </w:p>
+        </w:tc>
+        <w:tc>
+          <w:p>
+            <w:pPr>
+              <w:pStyle w:val="SourceCode"/>
+              <w:jc w:val="left"/>
+            </w:pPr>
+            <w:r>
+              <w:rPr>
+                <w:rStyle w:val="VerbatimChar"/>
+              </w:rPr>
+              <w:t xml:space="preserve">      1,181</w:t>
+            </w:r>
+          </w:p>
+        </w:tc>
+        <w:tc>
+          <w:p>
+            <w:pPr>
+              <w:pStyle w:val="SourceCode"/>
+              <w:jc w:val="left"/>
+            </w:pPr>
+            <w:r>
+              <w:rPr>
+                <w:rStyle w:val="VerbatimChar"/>
+              </w:rPr>
+              <w:t xml:space="preserve">            6</w:t>
+            </w:r>
+          </w:p>
+        </w:tc>
+        <w:tc>
+          <w:p>
+            <w:pPr>
+              <w:pStyle w:val="SourceCode"/>
+              <w:jc w:val="left"/>
+            </w:pPr>
+            <w:r>
+              <w:rPr>
+                <w:rStyle w:val="VerbatimChar"/>
+              </w:rPr>
+              <w:t xml:space="preserve">   0.502</w:t>
+            </w:r>
+          </w:p>
+        </w:tc>
+        <w:tc>
+          <w:p>
+            <w:pPr>
+              <w:pStyle w:val="SourceCode"/>
+              <w:jc w:val="left"/>
+            </w:pPr>
+            <w:r>
+              <w:rPr>
+                <w:rStyle w:val="VerbatimChar"/>
+              </w:rPr>
+              <w:t xml:space="preserve">       0.554</w:t>
+            </w:r>
+          </w:p>
+        </w:tc>
+        <w:tc>
+          <w:p>
+            <w:pPr>
+              <w:pStyle w:val="SourceCode"/>
+              <w:jc w:val="left"/>
+            </w:pPr>
+            <w:r>
+              <w:rPr>
+                <w:rStyle w:val="VerbatimChar"/>
+              </w:rPr>
+              <w:t xml:space="preserve">            0.202</w:t>
             </w:r>
           </w:p>
         </w:tc>
@@ -2369,73 +2513,91 @@
               <w:jc w:val="left"/>
             </w:pPr>
             <w:r>
-              <w:t xml:space="preserve">Climate Change Adaptation</w:t>
-            </w:r>
-          </w:p>
-        </w:tc>
-        <w:tc>
-          <w:p>
-            <w:pPr>
-              <w:pStyle w:val="Compact"/>
-              <w:jc w:val="right"/>
-            </w:pPr>
-            <w:r>
-              <w:t xml:space="preserve">1,019</w:t>
-            </w:r>
-          </w:p>
-        </w:tc>
-        <w:tc>
-          <w:p>
-            <w:pPr>
-              <w:pStyle w:val="Compact"/>
-              <w:jc w:val="right"/>
-            </w:pPr>
-            <w:r>
-              <w:t xml:space="preserve">1,181</w:t>
-            </w:r>
-          </w:p>
-        </w:tc>
-        <w:tc>
-          <w:p>
-            <w:pPr>
-              <w:pStyle w:val="Compact"/>
-              <w:jc w:val="right"/>
-            </w:pPr>
-            <w:r>
-              <w:t xml:space="preserve">6</w:t>
-            </w:r>
-          </w:p>
-        </w:tc>
-        <w:tc>
-          <w:p>
-            <w:pPr>
-              <w:pStyle w:val="Compact"/>
-              <w:jc w:val="right"/>
-            </w:pPr>
-            <w:r>
-              <w:t xml:space="preserve">0.502</w:t>
-            </w:r>
-          </w:p>
-        </w:tc>
-        <w:tc>
-          <w:p>
-            <w:pPr>
-              <w:pStyle w:val="Compact"/>
-              <w:jc w:val="right"/>
-            </w:pPr>
-            <w:r>
-              <w:t xml:space="preserve">0.555</w:t>
-            </w:r>
-          </w:p>
-        </w:tc>
-        <w:tc>
-          <w:p>
-            <w:pPr>
-              <w:pStyle w:val="Compact"/>
-              <w:jc w:val="right"/>
-            </w:pPr>
-            <w:r>
-              <w:t xml:space="preserve">0.202</w:t>
+              <w:t xml:space="preserve">Quantum Computing</w:t>
+            </w:r>
+          </w:p>
+        </w:tc>
+        <w:tc>
+          <w:p>
+            <w:pPr>
+              <w:pStyle w:val="SourceCode"/>
+              <w:jc w:val="left"/>
+            </w:pPr>
+            <w:r>
+              <w:rPr>
+                <w:rStyle w:val="VerbatimChar"/>
+              </w:rPr>
+              <w:t xml:space="preserve">       412</w:t>
+            </w:r>
+          </w:p>
+        </w:tc>
+        <w:tc>
+          <w:p>
+            <w:pPr>
+              <w:pStyle w:val="SourceCode"/>
+              <w:jc w:val="left"/>
+            </w:pPr>
+            <w:r>
+              <w:rPr>
+                <w:rStyle w:val="VerbatimChar"/>
+              </w:rPr>
+              <w:t xml:space="preserve">      2,519</w:t>
+            </w:r>
+          </w:p>
+        </w:tc>
+        <w:tc>
+          <w:p>
+            <w:pPr>
+              <w:pStyle w:val="SourceCode"/>
+              <w:jc w:val="left"/>
+            </w:pPr>
+            <w:r>
+              <w:rPr>
+                <w:rStyle w:val="VerbatimChar"/>
+              </w:rPr>
+              <w:t xml:space="preserve">            6</w:t>
+            </w:r>
+          </w:p>
+        </w:tc>
+        <w:tc>
+          <w:p>
+            <w:pPr>
+              <w:pStyle w:val="SourceCode"/>
+              <w:jc w:val="left"/>
+            </w:pPr>
+            <w:r>
+              <w:rPr>
+                <w:rStyle w:val="VerbatimChar"/>
+              </w:rPr>
+              <w:t xml:space="preserve">   0.511</w:t>
+            </w:r>
+          </w:p>
+        </w:tc>
+        <w:tc>
+          <w:p>
+            <w:pPr>
+              <w:pStyle w:val="SourceCode"/>
+              <w:jc w:val="left"/>
+            </w:pPr>
+            <w:r>
+              <w:rPr>
+                <w:rStyle w:val="VerbatimChar"/>
+              </w:rPr>
+              <w:t xml:space="preserve">       0.396</w:t>
+            </w:r>
+          </w:p>
+        </w:tc>
+        <w:tc>
+          <w:p>
+            <w:pPr>
+              <w:pStyle w:val="SourceCode"/>
+              <w:jc w:val="left"/>
+            </w:pPr>
+            <w:r>
+              <w:rPr>
+                <w:rStyle w:val="VerbatimChar"/>
+              </w:rPr>
+              <w:t xml:space="preserve">            0.385</w:t>
             </w:r>
           </w:p>
         </w:tc>
@@ -2455,66 +2617,84 @@
         <w:tc>
           <w:p>
             <w:pPr>
-              <w:pStyle w:val="Compact"/>
-              <w:jc w:val="right"/>
-            </w:pPr>
-            <w:r>
-              <w:t xml:space="preserve">702</w:t>
-            </w:r>
-          </w:p>
-        </w:tc>
-        <w:tc>
-          <w:p>
-            <w:pPr>
-              <w:pStyle w:val="Compact"/>
-              <w:jc w:val="right"/>
-            </w:pPr>
-            <w:r>
-              <w:t xml:space="preserve">823</w:t>
-            </w:r>
-          </w:p>
-        </w:tc>
-        <w:tc>
-          <w:p>
-            <w:pPr>
-              <w:pStyle w:val="Compact"/>
-              <w:jc w:val="right"/>
-            </w:pPr>
-            <w:r>
-              <w:t xml:space="preserve">6</w:t>
-            </w:r>
-          </w:p>
-        </w:tc>
-        <w:tc>
-          <w:p>
-            <w:pPr>
-              <w:pStyle w:val="Compact"/>
-              <w:jc w:val="right"/>
-            </w:pPr>
-            <w:r>
-              <w:t xml:space="preserve">0.519</w:t>
-            </w:r>
-          </w:p>
-        </w:tc>
-        <w:tc>
-          <w:p>
-            <w:pPr>
-              <w:pStyle w:val="Compact"/>
-              <w:jc w:val="right"/>
-            </w:pPr>
-            <w:r>
-              <w:t xml:space="preserve">0.708</w:t>
-            </w:r>
-          </w:p>
-        </w:tc>
-        <w:tc>
-          <w:p>
-            <w:pPr>
-              <w:pStyle w:val="Compact"/>
-              <w:jc w:val="right"/>
-            </w:pPr>
-            <w:r>
-              <w:t xml:space="preserve">0.098</w:t>
+              <w:pStyle w:val="SourceCode"/>
+              <w:jc w:val="left"/>
+            </w:pPr>
+            <w:r>
+              <w:rPr>
+                <w:rStyle w:val="VerbatimChar"/>
+              </w:rPr>
+              <w:t xml:space="preserve">       702</w:t>
+            </w:r>
+          </w:p>
+        </w:tc>
+        <w:tc>
+          <w:p>
+            <w:pPr>
+              <w:pStyle w:val="SourceCode"/>
+              <w:jc w:val="left"/>
+            </w:pPr>
+            <w:r>
+              <w:rPr>
+                <w:rStyle w:val="VerbatimChar"/>
+              </w:rPr>
+              <w:t xml:space="preserve">        823</w:t>
+            </w:r>
+          </w:p>
+        </w:tc>
+        <w:tc>
+          <w:p>
+            <w:pPr>
+              <w:pStyle w:val="SourceCode"/>
+              <w:jc w:val="left"/>
+            </w:pPr>
+            <w:r>
+              <w:rPr>
+                <w:rStyle w:val="VerbatimChar"/>
+              </w:rPr>
+              <w:t xml:space="preserve">            6</w:t>
+            </w:r>
+          </w:p>
+        </w:tc>
+        <w:tc>
+          <w:p>
+            <w:pPr>
+              <w:pStyle w:val="SourceCode"/>
+              <w:jc w:val="left"/>
+            </w:pPr>
+            <w:r>
+              <w:rPr>
+                <w:rStyle w:val="VerbatimChar"/>
+              </w:rPr>
+              <w:t xml:space="preserve">   0.519</w:t>
+            </w:r>
+          </w:p>
+        </w:tc>
+        <w:tc>
+          <w:p>
+            <w:pPr>
+              <w:pStyle w:val="SourceCode"/>
+              <w:jc w:val="left"/>
+            </w:pPr>
+            <w:r>
+              <w:rPr>
+                <w:rStyle w:val="VerbatimChar"/>
+              </w:rPr>
+              <w:t xml:space="preserve">       0.708</w:t>
+            </w:r>
+          </w:p>
+        </w:tc>
+        <w:tc>
+          <w:p>
+            <w:pPr>
+              <w:pStyle w:val="SourceCode"/>
+              <w:jc w:val="left"/>
+            </w:pPr>
+            <w:r>
+              <w:rPr>
+                <w:rStyle w:val="VerbatimChar"/>
+              </w:rPr>
+              <w:t xml:space="preserve">            0.098</w:t>
             </w:r>
           </w:p>
         </w:tc>
@@ -2527,73 +2707,91 @@
               <w:jc w:val="left"/>
             </w:pPr>
             <w:r>
-              <w:t xml:space="preserve">RVRP (anchor, validation)</w:t>
-            </w:r>
-          </w:p>
-        </w:tc>
-        <w:tc>
-          <w:p>
-            <w:pPr>
-              <w:pStyle w:val="Compact"/>
-              <w:jc w:val="right"/>
-            </w:pPr>
-            <w:r>
-              <w:t xml:space="preserve">393</w:t>
-            </w:r>
-          </w:p>
-        </w:tc>
-        <w:tc>
-          <w:p>
-            <w:pPr>
-              <w:pStyle w:val="Compact"/>
-              <w:jc w:val="right"/>
-            </w:pPr>
-            <w:r>
-              <w:t xml:space="preserve">1,630</w:t>
-            </w:r>
-          </w:p>
-        </w:tc>
-        <w:tc>
-          <w:p>
-            <w:pPr>
-              <w:pStyle w:val="Compact"/>
-              <w:jc w:val="right"/>
-            </w:pPr>
-            <w:r>
-              <w:t xml:space="preserve">6</w:t>
-            </w:r>
-          </w:p>
-        </w:tc>
-        <w:tc>
-          <w:p>
-            <w:pPr>
-              <w:pStyle w:val="Compact"/>
-              <w:jc w:val="right"/>
-            </w:pPr>
-            <w:r>
-              <w:t xml:space="preserve">0.526</w:t>
-            </w:r>
-          </w:p>
-        </w:tc>
-        <w:tc>
-          <w:p>
-            <w:pPr>
-              <w:pStyle w:val="Compact"/>
-              <w:jc w:val="right"/>
-            </w:pPr>
-            <w:r>
-              <w:t xml:space="preserve">0.613</w:t>
-            </w:r>
-          </w:p>
-        </w:tc>
-        <w:tc>
-          <w:p>
-            <w:pPr>
-              <w:pStyle w:val="Compact"/>
-              <w:jc w:val="right"/>
-            </w:pPr>
-            <w:r>
-              <w:t xml:space="preserve">0.216</w:t>
+              <w:t xml:space="preserve">RVRP (validation anchor)</w:t>
+            </w:r>
+          </w:p>
+        </w:tc>
+        <w:tc>
+          <w:p>
+            <w:pPr>
+              <w:pStyle w:val="SourceCode"/>
+              <w:jc w:val="left"/>
+            </w:pPr>
+            <w:r>
+              <w:rPr>
+                <w:rStyle w:val="VerbatimChar"/>
+              </w:rPr>
+              <w:t xml:space="preserve">       393</w:t>
+            </w:r>
+          </w:p>
+        </w:tc>
+        <w:tc>
+          <w:p>
+            <w:pPr>
+              <w:pStyle w:val="SourceCode"/>
+              <w:jc w:val="left"/>
+            </w:pPr>
+            <w:r>
+              <w:rPr>
+                <w:rStyle w:val="VerbatimChar"/>
+              </w:rPr>
+              <w:t xml:space="preserve">      1,630</w:t>
+            </w:r>
+          </w:p>
+        </w:tc>
+        <w:tc>
+          <w:p>
+            <w:pPr>
+              <w:pStyle w:val="SourceCode"/>
+              <w:jc w:val="left"/>
+            </w:pPr>
+            <w:r>
+              <w:rPr>
+                <w:rStyle w:val="VerbatimChar"/>
+              </w:rPr>
+              <w:t xml:space="preserve">            6</w:t>
+            </w:r>
+          </w:p>
+        </w:tc>
+        <w:tc>
+          <w:p>
+            <w:pPr>
+              <w:pStyle w:val="SourceCode"/>
+              <w:jc w:val="left"/>
+            </w:pPr>
+            <w:r>
+              <w:rPr>
+                <w:rStyle w:val="VerbatimChar"/>
+              </w:rPr>
+              <w:t xml:space="preserve">   0.526</w:t>
+            </w:r>
+          </w:p>
+        </w:tc>
+        <w:tc>
+          <w:p>
+            <w:pPr>
+              <w:pStyle w:val="SourceCode"/>
+              <w:jc w:val="left"/>
+            </w:pPr>
+            <w:r>
+              <w:rPr>
+                <w:rStyle w:val="VerbatimChar"/>
+              </w:rPr>
+              <w:t xml:space="preserve">       0.613</w:t>
+            </w:r>
+          </w:p>
+        </w:tc>
+        <w:tc>
+          <w:p>
+            <w:pPr>
+              <w:pStyle w:val="SourceCode"/>
+              <w:jc w:val="left"/>
+            </w:pPr>
+            <w:r>
+              <w:rPr>
+                <w:rStyle w:val="VerbatimChar"/>
+              </w:rPr>
+              <w:t xml:space="preserve">            0.216</w:t>
             </w:r>
           </w:p>
         </w:tc>
@@ -2606,73 +2804,91 @@
               <w:jc w:val="left"/>
             </w:pPr>
             <w:r>
-              <w:t xml:space="preserve">COVID-19 Vaccine Hesitancy</w:t>
-            </w:r>
-          </w:p>
-        </w:tc>
-        <w:tc>
-          <w:p>
-            <w:pPr>
-              <w:pStyle w:val="Compact"/>
-              <w:jc w:val="right"/>
-            </w:pPr>
-            <w:r>
-              <w:t xml:space="preserve">1,809</w:t>
-            </w:r>
-          </w:p>
-        </w:tc>
-        <w:tc>
-          <w:p>
-            <w:pPr>
-              <w:pStyle w:val="Compact"/>
-              <w:jc w:val="right"/>
-            </w:pPr>
-            <w:r>
-              <w:t xml:space="preserve">2,389</w:t>
-            </w:r>
-          </w:p>
-        </w:tc>
-        <w:tc>
-          <w:p>
-            <w:pPr>
-              <w:pStyle w:val="Compact"/>
-              <w:jc w:val="right"/>
-            </w:pPr>
-            <w:r>
-              <w:t xml:space="preserve">7</w:t>
-            </w:r>
-          </w:p>
-        </w:tc>
-        <w:tc>
-          <w:p>
-            <w:pPr>
-              <w:pStyle w:val="Compact"/>
-              <w:jc w:val="right"/>
-            </w:pPr>
-            <w:r>
-              <w:t xml:space="preserve">0.550</w:t>
-            </w:r>
-          </w:p>
-        </w:tc>
-        <w:tc>
-          <w:p>
-            <w:pPr>
-              <w:pStyle w:val="Compact"/>
-              <w:jc w:val="right"/>
-            </w:pPr>
-            <w:r>
-              <w:t xml:space="preserve">0.232</w:t>
-            </w:r>
-          </w:p>
-        </w:tc>
-        <w:tc>
-          <w:p>
-            <w:pPr>
-              <w:pStyle w:val="Compact"/>
-              <w:jc w:val="right"/>
-            </w:pPr>
-            <w:r>
-              <w:t xml:space="preserve">0.543</w:t>
+              <w:t xml:space="preserve">Adolescent Mental Health</w:t>
+            </w:r>
+          </w:p>
+        </w:tc>
+        <w:tc>
+          <w:p>
+            <w:pPr>
+              <w:pStyle w:val="SourceCode"/>
+              <w:jc w:val="left"/>
+            </w:pPr>
+            <w:r>
+              <w:rPr>
+                <w:rStyle w:val="VerbatimChar"/>
+              </w:rPr>
+              <w:t xml:space="preserve">     1,319</w:t>
+            </w:r>
+          </w:p>
+        </w:tc>
+        <w:tc>
+          <w:p>
+            <w:pPr>
+              <w:pStyle w:val="SourceCode"/>
+              <w:jc w:val="left"/>
+            </w:pPr>
+            <w:r>
+              <w:rPr>
+                <w:rStyle w:val="VerbatimChar"/>
+              </w:rPr>
+              <w:t xml:space="preserve">      1,376</w:t>
+            </w:r>
+          </w:p>
+        </w:tc>
+        <w:tc>
+          <w:p>
+            <w:pPr>
+              <w:pStyle w:val="SourceCode"/>
+              <w:jc w:val="left"/>
+            </w:pPr>
+            <w:r>
+              <w:rPr>
+                <w:rStyle w:val="VerbatimChar"/>
+              </w:rPr>
+              <w:t xml:space="preserve">            7</w:t>
+            </w:r>
+          </w:p>
+        </w:tc>
+        <w:tc>
+          <w:p>
+            <w:pPr>
+              <w:pStyle w:val="SourceCode"/>
+              <w:jc w:val="left"/>
+            </w:pPr>
+            <w:r>
+              <w:rPr>
+                <w:rStyle w:val="VerbatimChar"/>
+              </w:rPr>
+              <w:t xml:space="preserve">   0.544</w:t>
+            </w:r>
+          </w:p>
+        </w:tc>
+        <w:tc>
+          <w:p>
+            <w:pPr>
+              <w:pStyle w:val="SourceCode"/>
+              <w:jc w:val="left"/>
+            </w:pPr>
+            <w:r>
+              <w:rPr>
+                <w:rStyle w:val="VerbatimChar"/>
+              </w:rPr>
+              <w:t xml:space="preserve">       0.457</w:t>
+            </w:r>
+          </w:p>
+        </w:tc>
+        <w:tc>
+          <w:p>
+            <w:pPr>
+              <w:pStyle w:val="SourceCode"/>
+              <w:jc w:val="left"/>
+            </w:pPr>
+            <w:r>
+              <w:rPr>
+                <w:rStyle w:val="VerbatimChar"/>
+              </w:rPr>
+              <w:t xml:space="preserve">            0.300</w:t>
             </w:r>
           </w:p>
         </w:tc>
@@ -2685,73 +2901,91 @@
               <w:jc w:val="left"/>
             </w:pPr>
             <w:r>
-              <w:t xml:space="preserve">Blockchain in Finance &amp; Supply Chain</w:t>
-            </w:r>
-          </w:p>
-        </w:tc>
-        <w:tc>
-          <w:p>
-            <w:pPr>
-              <w:pStyle w:val="Compact"/>
-              <w:jc w:val="right"/>
-            </w:pPr>
-            <w:r>
-              <w:t xml:space="preserve">318</w:t>
-            </w:r>
-          </w:p>
-        </w:tc>
-        <w:tc>
-          <w:p>
-            <w:pPr>
-              <w:pStyle w:val="Compact"/>
-              <w:jc w:val="right"/>
-            </w:pPr>
-            <w:r>
-              <w:t xml:space="preserve">1,499</w:t>
-            </w:r>
-          </w:p>
-        </w:tc>
-        <w:tc>
-          <w:p>
-            <w:pPr>
-              <w:pStyle w:val="Compact"/>
-              <w:jc w:val="right"/>
-            </w:pPr>
-            <w:r>
-              <w:t xml:space="preserve">7</w:t>
-            </w:r>
-          </w:p>
-        </w:tc>
-        <w:tc>
-          <w:p>
-            <w:pPr>
-              <w:pStyle w:val="Compact"/>
-              <w:jc w:val="right"/>
-            </w:pPr>
-            <w:r>
-              <w:t xml:space="preserve">0.568</w:t>
-            </w:r>
-          </w:p>
-        </w:tc>
-        <w:tc>
-          <w:p>
-            <w:pPr>
-              <w:pStyle w:val="Compact"/>
-              <w:jc w:val="right"/>
-            </w:pPr>
-            <w:r>
-              <w:t xml:space="preserve">0.549</w:t>
-            </w:r>
-          </w:p>
-        </w:tc>
-        <w:tc>
-          <w:p>
-            <w:pPr>
-              <w:pStyle w:val="Compact"/>
-              <w:jc w:val="right"/>
-            </w:pPr>
-            <w:r>
-              <w:t xml:space="preserve">0.281</w:t>
+              <w:t xml:space="preserve">COVID-19 Vaccine Hesitancy</w:t>
+            </w:r>
+          </w:p>
+        </w:tc>
+        <w:tc>
+          <w:p>
+            <w:pPr>
+              <w:pStyle w:val="SourceCode"/>
+              <w:jc w:val="left"/>
+            </w:pPr>
+            <w:r>
+              <w:rPr>
+                <w:rStyle w:val="VerbatimChar"/>
+              </w:rPr>
+              <w:t xml:space="preserve">     1,809</w:t>
+            </w:r>
+          </w:p>
+        </w:tc>
+        <w:tc>
+          <w:p>
+            <w:pPr>
+              <w:pStyle w:val="SourceCode"/>
+              <w:jc w:val="left"/>
+            </w:pPr>
+            <w:r>
+              <w:rPr>
+                <w:rStyle w:val="VerbatimChar"/>
+              </w:rPr>
+              <w:t xml:space="preserve">      2,389</w:t>
+            </w:r>
+          </w:p>
+        </w:tc>
+        <w:tc>
+          <w:p>
+            <w:pPr>
+              <w:pStyle w:val="SourceCode"/>
+              <w:jc w:val="left"/>
+            </w:pPr>
+            <w:r>
+              <w:rPr>
+                <w:rStyle w:val="VerbatimChar"/>
+              </w:rPr>
+              <w:t xml:space="preserve">            7</w:t>
+            </w:r>
+          </w:p>
+        </w:tc>
+        <w:tc>
+          <w:p>
+            <w:pPr>
+              <w:pStyle w:val="SourceCode"/>
+              <w:jc w:val="left"/>
+            </w:pPr>
+            <w:r>
+              <w:rPr>
+                <w:rStyle w:val="VerbatimChar"/>
+              </w:rPr>
+              <w:t xml:space="preserve">   0.550</w:t>
+            </w:r>
+          </w:p>
+        </w:tc>
+        <w:tc>
+          <w:p>
+            <w:pPr>
+              <w:pStyle w:val="SourceCode"/>
+              <w:jc w:val="left"/>
+            </w:pPr>
+            <w:r>
+              <w:rPr>
+                <w:rStyle w:val="VerbatimChar"/>
+              </w:rPr>
+              <w:t xml:space="preserve">       0.232</w:t>
+            </w:r>
+          </w:p>
+        </w:tc>
+        <w:tc>
+          <w:p>
+            <w:pPr>
+              <w:pStyle w:val="SourceCode"/>
+              <w:jc w:val="left"/>
+            </w:pPr>
+            <w:r>
+              <w:rPr>
+                <w:rStyle w:val="VerbatimChar"/>
+              </w:rPr>
+              <w:t xml:space="preserve">            0.543</w:t>
             </w:r>
           </w:p>
         </w:tc>
@@ -2764,73 +2998,91 @@
               <w:jc w:val="left"/>
             </w:pPr>
             <w:r>
-              <w:t xml:space="preserve">Financial Literacy</w:t>
-            </w:r>
-          </w:p>
-        </w:tc>
-        <w:tc>
-          <w:p>
-            <w:pPr>
-              <w:pStyle w:val="Compact"/>
-              <w:jc w:val="right"/>
-            </w:pPr>
-            <w:r>
-              <w:t xml:space="preserve">310</w:t>
-            </w:r>
-          </w:p>
-        </w:tc>
-        <w:tc>
-          <w:p>
-            <w:pPr>
-              <w:pStyle w:val="Compact"/>
-              <w:jc w:val="right"/>
-            </w:pPr>
-            <w:r>
-              <w:t xml:space="preserve">1,962</w:t>
-            </w:r>
-          </w:p>
-        </w:tc>
-        <w:tc>
-          <w:p>
-            <w:pPr>
-              <w:pStyle w:val="Compact"/>
-              <w:jc w:val="right"/>
-            </w:pPr>
-            <w:r>
-              <w:t xml:space="preserve">7</w:t>
-            </w:r>
-          </w:p>
-        </w:tc>
-        <w:tc>
-          <w:p>
-            <w:pPr>
-              <w:pStyle w:val="Compact"/>
-              <w:jc w:val="right"/>
-            </w:pPr>
-            <w:r>
-              <w:t xml:space="preserve">0.569</w:t>
-            </w:r>
-          </w:p>
-        </w:tc>
-        <w:tc>
-          <w:p>
-            <w:pPr>
-              <w:pStyle w:val="Compact"/>
-              <w:jc w:val="right"/>
-            </w:pPr>
-            <w:r>
-              <w:t xml:space="preserve">0.451</w:t>
-            </w:r>
-          </w:p>
-        </w:tc>
-        <w:tc>
-          <w:p>
-            <w:pPr>
-              <w:pStyle w:val="Compact"/>
-              <w:jc w:val="right"/>
-            </w:pPr>
-            <w:r>
-              <w:t xml:space="preserve">0.380</w:t>
+              <w:t xml:space="preserve">Blockchain in Finance and Supply Chain</w:t>
+            </w:r>
+          </w:p>
+        </w:tc>
+        <w:tc>
+          <w:p>
+            <w:pPr>
+              <w:pStyle w:val="SourceCode"/>
+              <w:jc w:val="left"/>
+            </w:pPr>
+            <w:r>
+              <w:rPr>
+                <w:rStyle w:val="VerbatimChar"/>
+              </w:rPr>
+              <w:t xml:space="preserve">       318</w:t>
+            </w:r>
+          </w:p>
+        </w:tc>
+        <w:tc>
+          <w:p>
+            <w:pPr>
+              <w:pStyle w:val="SourceCode"/>
+              <w:jc w:val="left"/>
+            </w:pPr>
+            <w:r>
+              <w:rPr>
+                <w:rStyle w:val="VerbatimChar"/>
+              </w:rPr>
+              <w:t xml:space="preserve">      1,499</w:t>
+            </w:r>
+          </w:p>
+        </w:tc>
+        <w:tc>
+          <w:p>
+            <w:pPr>
+              <w:pStyle w:val="SourceCode"/>
+              <w:jc w:val="left"/>
+            </w:pPr>
+            <w:r>
+              <w:rPr>
+                <w:rStyle w:val="VerbatimChar"/>
+              </w:rPr>
+              <w:t xml:space="preserve">            7</w:t>
+            </w:r>
+          </w:p>
+        </w:tc>
+        <w:tc>
+          <w:p>
+            <w:pPr>
+              <w:pStyle w:val="SourceCode"/>
+              <w:jc w:val="left"/>
+            </w:pPr>
+            <w:r>
+              <w:rPr>
+                <w:rStyle w:val="VerbatimChar"/>
+              </w:rPr>
+              <w:t xml:space="preserve">   0.568</w:t>
+            </w:r>
+          </w:p>
+        </w:tc>
+        <w:tc>
+          <w:p>
+            <w:pPr>
+              <w:pStyle w:val="SourceCode"/>
+              <w:jc w:val="left"/>
+            </w:pPr>
+            <w:r>
+              <w:rPr>
+                <w:rStyle w:val="VerbatimChar"/>
+              </w:rPr>
+              <w:t xml:space="preserve">       0.549</w:t>
+            </w:r>
+          </w:p>
+        </w:tc>
+        <w:tc>
+          <w:p>
+            <w:pPr>
+              <w:pStyle w:val="SourceCode"/>
+              <w:jc w:val="left"/>
+            </w:pPr>
+            <w:r>
+              <w:rPr>
+                <w:rStyle w:val="VerbatimChar"/>
+              </w:rPr>
+              <w:t xml:space="preserve">            0.281</w:t>
             </w:r>
           </w:p>
         </w:tc>
@@ -2843,73 +3095,91 @@
               <w:jc w:val="left"/>
             </w:pPr>
             <w:r>
-              <w:t xml:space="preserve">Adolescent Mental Health</w:t>
-            </w:r>
-          </w:p>
-        </w:tc>
-        <w:tc>
-          <w:p>
-            <w:pPr>
-              <w:pStyle w:val="Compact"/>
-              <w:jc w:val="right"/>
-            </w:pPr>
-            <w:r>
-              <w:t xml:space="preserve">1,319</w:t>
-            </w:r>
-          </w:p>
-        </w:tc>
-        <w:tc>
-          <w:p>
-            <w:pPr>
-              <w:pStyle w:val="Compact"/>
-              <w:jc w:val="right"/>
-            </w:pPr>
-            <w:r>
-              <w:t xml:space="preserve">1,376</w:t>
-            </w:r>
-          </w:p>
-        </w:tc>
-        <w:tc>
-          <w:p>
-            <w:pPr>
-              <w:pStyle w:val="Compact"/>
-              <w:jc w:val="right"/>
-            </w:pPr>
-            <w:r>
-              <w:t xml:space="preserve">7</w:t>
-            </w:r>
-          </w:p>
-        </w:tc>
-        <w:tc>
-          <w:p>
-            <w:pPr>
-              <w:pStyle w:val="Compact"/>
-              <w:jc w:val="right"/>
-            </w:pPr>
-            <w:r>
-              <w:t xml:space="preserve">0.544</w:t>
-            </w:r>
-          </w:p>
-        </w:tc>
-        <w:tc>
-          <w:p>
-            <w:pPr>
-              <w:pStyle w:val="Compact"/>
-              <w:jc w:val="right"/>
-            </w:pPr>
-            <w:r>
-              <w:t xml:space="preserve">0.457</w:t>
-            </w:r>
-          </w:p>
-        </w:tc>
-        <w:tc>
-          <w:p>
-            <w:pPr>
-              <w:pStyle w:val="Compact"/>
-              <w:jc w:val="right"/>
-            </w:pPr>
-            <w:r>
-              <w:t xml:space="preserve">0.300</w:t>
+              <w:t xml:space="preserve">Financial Literacy</w:t>
+            </w:r>
+          </w:p>
+        </w:tc>
+        <w:tc>
+          <w:p>
+            <w:pPr>
+              <w:pStyle w:val="SourceCode"/>
+              <w:jc w:val="left"/>
+            </w:pPr>
+            <w:r>
+              <w:rPr>
+                <w:rStyle w:val="VerbatimChar"/>
+              </w:rPr>
+              <w:t xml:space="preserve">       310</w:t>
+            </w:r>
+          </w:p>
+        </w:tc>
+        <w:tc>
+          <w:p>
+            <w:pPr>
+              <w:pStyle w:val="SourceCode"/>
+              <w:jc w:val="left"/>
+            </w:pPr>
+            <w:r>
+              <w:rPr>
+                <w:rStyle w:val="VerbatimChar"/>
+              </w:rPr>
+              <w:t xml:space="preserve">      1,962</w:t>
+            </w:r>
+          </w:p>
+        </w:tc>
+        <w:tc>
+          <w:p>
+            <w:pPr>
+              <w:pStyle w:val="SourceCode"/>
+              <w:jc w:val="left"/>
+            </w:pPr>
+            <w:r>
+              <w:rPr>
+                <w:rStyle w:val="VerbatimChar"/>
+              </w:rPr>
+              <w:t xml:space="preserve">            7</w:t>
+            </w:r>
+          </w:p>
+        </w:tc>
+        <w:tc>
+          <w:p>
+            <w:pPr>
+              <w:pStyle w:val="SourceCode"/>
+              <w:jc w:val="left"/>
+            </w:pPr>
+            <w:r>
+              <w:rPr>
+                <w:rStyle w:val="VerbatimChar"/>
+              </w:rPr>
+              <w:t xml:space="preserve">   0.569</w:t>
+            </w:r>
+          </w:p>
+        </w:tc>
+        <w:tc>
+          <w:p>
+            <w:pPr>
+              <w:pStyle w:val="SourceCode"/>
+              <w:jc w:val="left"/>
+            </w:pPr>
+            <w:r>
+              <w:rPr>
+                <w:rStyle w:val="VerbatimChar"/>
+              </w:rPr>
+              <w:t xml:space="preserve">       0.451</w:t>
+            </w:r>
+          </w:p>
+        </w:tc>
+        <w:tc>
+          <w:p>
+            <w:pPr>
+              <w:pStyle w:val="SourceCode"/>
+              <w:jc w:val="left"/>
+            </w:pPr>
+            <w:r>
+              <w:rPr>
+                <w:rStyle w:val="VerbatimChar"/>
+              </w:rPr>
+              <w:t xml:space="preserve">            0.380</w:t>
             </w:r>
           </w:p>
         </w:tc>
@@ -2929,66 +3199,84 @@
         <w:tc>
           <w:p>
             <w:pPr>
-              <w:pStyle w:val="Compact"/>
-              <w:jc w:val="right"/>
-            </w:pPr>
-            <w:r>
-              <w:t xml:space="preserve">1,359</w:t>
-            </w:r>
-          </w:p>
-        </w:tc>
-        <w:tc>
-          <w:p>
-            <w:pPr>
-              <w:pStyle w:val="Compact"/>
-              <w:jc w:val="right"/>
-            </w:pPr>
-            <w:r>
-              <w:t xml:space="preserve">1,448</w:t>
-            </w:r>
-          </w:p>
-        </w:tc>
-        <w:tc>
-          <w:p>
-            <w:pPr>
-              <w:pStyle w:val="Compact"/>
-              <w:jc w:val="right"/>
-            </w:pPr>
-            <w:r>
-              <w:t xml:space="preserve">7</w:t>
-            </w:r>
-          </w:p>
-        </w:tc>
-        <w:tc>
-          <w:p>
-            <w:pPr>
-              <w:pStyle w:val="Compact"/>
-              <w:jc w:val="right"/>
-            </w:pPr>
-            <w:r>
-              <w:t xml:space="preserve">0.576</w:t>
-            </w:r>
-          </w:p>
-        </w:tc>
-        <w:tc>
-          <w:p>
-            <w:pPr>
-              <w:pStyle w:val="Compact"/>
-              <w:jc w:val="right"/>
-            </w:pPr>
-            <w:r>
-              <w:t xml:space="preserve">0.533</w:t>
-            </w:r>
-          </w:p>
-        </w:tc>
-        <w:tc>
-          <w:p>
-            <w:pPr>
-              <w:pStyle w:val="Compact"/>
-              <w:jc w:val="right"/>
-            </w:pPr>
-            <w:r>
-              <w:t xml:space="preserve">0.318</w:t>
+              <w:pStyle w:val="SourceCode"/>
+              <w:jc w:val="left"/>
+            </w:pPr>
+            <w:r>
+              <w:rPr>
+                <w:rStyle w:val="VerbatimChar"/>
+              </w:rPr>
+              <w:t xml:space="preserve">     1,359</w:t>
+            </w:r>
+          </w:p>
+        </w:tc>
+        <w:tc>
+          <w:p>
+            <w:pPr>
+              <w:pStyle w:val="SourceCode"/>
+              <w:jc w:val="left"/>
+            </w:pPr>
+            <w:r>
+              <w:rPr>
+                <w:rStyle w:val="VerbatimChar"/>
+              </w:rPr>
+              <w:t xml:space="preserve">      1,448</w:t>
+            </w:r>
+          </w:p>
+        </w:tc>
+        <w:tc>
+          <w:p>
+            <w:pPr>
+              <w:pStyle w:val="SourceCode"/>
+              <w:jc w:val="left"/>
+            </w:pPr>
+            <w:r>
+              <w:rPr>
+                <w:rStyle w:val="VerbatimChar"/>
+              </w:rPr>
+              <w:t xml:space="preserve">            7</w:t>
+            </w:r>
+          </w:p>
+        </w:tc>
+        <w:tc>
+          <w:p>
+            <w:pPr>
+              <w:pStyle w:val="SourceCode"/>
+              <w:jc w:val="left"/>
+            </w:pPr>
+            <w:r>
+              <w:rPr>
+                <w:rStyle w:val="VerbatimChar"/>
+              </w:rPr>
+              <w:t xml:space="preserve">   0.576</w:t>
+            </w:r>
+          </w:p>
+        </w:tc>
+        <w:tc>
+          <w:p>
+            <w:pPr>
+              <w:pStyle w:val="SourceCode"/>
+              <w:jc w:val="left"/>
+            </w:pPr>
+            <w:r>
+              <w:rPr>
+                <w:rStyle w:val="VerbatimChar"/>
+              </w:rPr>
+              <w:t xml:space="preserve">       0.533</w:t>
+            </w:r>
+          </w:p>
+        </w:tc>
+        <w:tc>
+          <w:p>
+            <w:pPr>
+              <w:pStyle w:val="SourceCode"/>
+              <w:jc w:val="left"/>
+            </w:pPr>
+            <w:r>
+              <w:rPr>
+                <w:rStyle w:val="VerbatimChar"/>
+              </w:rPr>
+              <w:t xml:space="preserve">            0.318</w:t>
             </w:r>
           </w:p>
         </w:tc>
@@ -3001,73 +3289,91 @@
               <w:jc w:val="left"/>
             </w:pPr>
             <w:r>
-              <w:t xml:space="preserve">Online / Virtual Education</w:t>
-            </w:r>
-          </w:p>
-        </w:tc>
-        <w:tc>
-          <w:p>
-            <w:pPr>
-              <w:pStyle w:val="Compact"/>
-              <w:jc w:val="right"/>
-            </w:pPr>
-            <w:r>
-              <w:t xml:space="preserve">1,122</w:t>
-            </w:r>
-          </w:p>
-        </w:tc>
-        <w:tc>
-          <w:p>
-            <w:pPr>
-              <w:pStyle w:val="Compact"/>
-              <w:jc w:val="right"/>
-            </w:pPr>
-            <w:r>
-              <w:t xml:space="preserve">1,065</w:t>
-            </w:r>
-          </w:p>
-        </w:tc>
-        <w:tc>
-          <w:p>
-            <w:pPr>
-              <w:pStyle w:val="Compact"/>
-              <w:jc w:val="right"/>
-            </w:pPr>
-            <w:r>
-              <w:t xml:space="preserve">8</w:t>
-            </w:r>
-          </w:p>
-        </w:tc>
-        <w:tc>
-          <w:p>
-            <w:pPr>
-              <w:pStyle w:val="Compact"/>
-              <w:jc w:val="right"/>
-            </w:pPr>
-            <w:r>
-              <w:t xml:space="preserve">0.594</w:t>
-            </w:r>
-          </w:p>
-        </w:tc>
-        <w:tc>
-          <w:p>
-            <w:pPr>
-              <w:pStyle w:val="Compact"/>
-              <w:jc w:val="right"/>
-            </w:pPr>
-            <w:r>
-              <w:t xml:space="preserve">0.511</w:t>
-            </w:r>
-          </w:p>
-        </w:tc>
-        <w:tc>
-          <w:p>
-            <w:pPr>
-              <w:pStyle w:val="Compact"/>
-              <w:jc w:val="right"/>
-            </w:pPr>
-            <w:r>
-              <w:t xml:space="preserve">0.272</w:t>
+              <w:t xml:space="preserve">Online Education</w:t>
+            </w:r>
+          </w:p>
+        </w:tc>
+        <w:tc>
+          <w:p>
+            <w:pPr>
+              <w:pStyle w:val="SourceCode"/>
+              <w:jc w:val="left"/>
+            </w:pPr>
+            <w:r>
+              <w:rPr>
+                <w:rStyle w:val="VerbatimChar"/>
+              </w:rPr>
+              <w:t xml:space="preserve">     1,122</w:t>
+            </w:r>
+          </w:p>
+        </w:tc>
+        <w:tc>
+          <w:p>
+            <w:pPr>
+              <w:pStyle w:val="SourceCode"/>
+              <w:jc w:val="left"/>
+            </w:pPr>
+            <w:r>
+              <w:rPr>
+                <w:rStyle w:val="VerbatimChar"/>
+              </w:rPr>
+              <w:t xml:space="preserve">      1,065</w:t>
+            </w:r>
+          </w:p>
+        </w:tc>
+        <w:tc>
+          <w:p>
+            <w:pPr>
+              <w:pStyle w:val="SourceCode"/>
+              <w:jc w:val="left"/>
+            </w:pPr>
+            <w:r>
+              <w:rPr>
+                <w:rStyle w:val="VerbatimChar"/>
+              </w:rPr>
+              <w:t xml:space="preserve">            8</w:t>
+            </w:r>
+          </w:p>
+        </w:tc>
+        <w:tc>
+          <w:p>
+            <w:pPr>
+              <w:pStyle w:val="SourceCode"/>
+              <w:jc w:val="left"/>
+            </w:pPr>
+            <w:r>
+              <w:rPr>
+                <w:rStyle w:val="VerbatimChar"/>
+              </w:rPr>
+              <w:t xml:space="preserve">   0.594</w:t>
+            </w:r>
+          </w:p>
+        </w:tc>
+        <w:tc>
+          <w:p>
+            <w:pPr>
+              <w:pStyle w:val="SourceCode"/>
+              <w:jc w:val="left"/>
+            </w:pPr>
+            <w:r>
+              <w:rPr>
+                <w:rStyle w:val="VerbatimChar"/>
+              </w:rPr>
+              <w:t xml:space="preserve">       0.511</w:t>
+            </w:r>
+          </w:p>
+        </w:tc>
+        <w:tc>
+          <w:p>
+            <w:pPr>
+              <w:pStyle w:val="SourceCode"/>
+              <w:jc w:val="left"/>
+            </w:pPr>
+            <w:r>
+              <w:rPr>
+                <w:rStyle w:val="VerbatimChar"/>
+              </w:rPr>
+              <w:t xml:space="preserve">            0.272</w:t>
             </w:r>
           </w:p>
         </w:tc>
@@ -3080,73 +3386,91 @@
               <w:jc w:val="left"/>
             </w:pPr>
             <w:r>
-              <w:t xml:space="preserve">Precision Agriculture</w:t>
-            </w:r>
-          </w:p>
-        </w:tc>
-        <w:tc>
-          <w:p>
-            <w:pPr>
-              <w:pStyle w:val="Compact"/>
-              <w:jc w:val="right"/>
-            </w:pPr>
-            <w:r>
-              <w:t xml:space="preserve">451</w:t>
-            </w:r>
-          </w:p>
-        </w:tc>
-        <w:tc>
-          <w:p>
-            <w:pPr>
-              <w:pStyle w:val="Compact"/>
-              <w:jc w:val="right"/>
-            </w:pPr>
-            <w:r>
-              <w:t xml:space="preserve">3,201</w:t>
-            </w:r>
-          </w:p>
-        </w:tc>
-        <w:tc>
-          <w:p>
-            <w:pPr>
-              <w:pStyle w:val="Compact"/>
-              <w:jc w:val="right"/>
-            </w:pPr>
-            <w:r>
-              <w:t xml:space="preserve">9</w:t>
-            </w:r>
-          </w:p>
-        </w:tc>
-        <w:tc>
-          <w:p>
-            <w:pPr>
-              <w:pStyle w:val="Compact"/>
-              <w:jc w:val="right"/>
-            </w:pPr>
-            <w:r>
-              <w:t xml:space="preserve">0.620</w:t>
-            </w:r>
-          </w:p>
-        </w:tc>
-        <w:tc>
-          <w:p>
-            <w:pPr>
-              <w:pStyle w:val="Compact"/>
-              <w:jc w:val="right"/>
-            </w:pPr>
-            <w:r>
-              <w:t xml:space="preserve">0.743</w:t>
-            </w:r>
-          </w:p>
-        </w:tc>
-        <w:tc>
-          <w:p>
-            <w:pPr>
-              <w:pStyle w:val="Compact"/>
-              <w:jc w:val="right"/>
-            </w:pPr>
-            <w:r>
-              <w:t xml:space="preserve">0.115</w:t>
+              <w:t xml:space="preserve">Renewable Energy</w:t>
+            </w:r>
+          </w:p>
+        </w:tc>
+        <w:tc>
+          <w:p>
+            <w:pPr>
+              <w:pStyle w:val="SourceCode"/>
+              <w:jc w:val="left"/>
+            </w:pPr>
+            <w:r>
+              <w:rPr>
+                <w:rStyle w:val="VerbatimChar"/>
+              </w:rPr>
+              <w:t xml:space="preserve">       886</w:t>
+            </w:r>
+          </w:p>
+        </w:tc>
+        <w:tc>
+          <w:p>
+            <w:pPr>
+              <w:pStyle w:val="SourceCode"/>
+              <w:jc w:val="left"/>
+            </w:pPr>
+            <w:r>
+              <w:rPr>
+                <w:rStyle w:val="VerbatimChar"/>
+              </w:rPr>
+              <w:t xml:space="preserve">      1,070</w:t>
+            </w:r>
+          </w:p>
+        </w:tc>
+        <w:tc>
+          <w:p>
+            <w:pPr>
+              <w:pStyle w:val="SourceCode"/>
+              <w:jc w:val="left"/>
+            </w:pPr>
+            <w:r>
+              <w:rPr>
+                <w:rStyle w:val="VerbatimChar"/>
+              </w:rPr>
+              <w:t xml:space="preserve">           10</w:t>
+            </w:r>
+          </w:p>
+        </w:tc>
+        <w:tc>
+          <w:p>
+            <w:pPr>
+              <w:pStyle w:val="SourceCode"/>
+              <w:jc w:val="left"/>
+            </w:pPr>
+            <w:r>
+              <w:rPr>
+                <w:rStyle w:val="VerbatimChar"/>
+              </w:rPr>
+              <w:t xml:space="preserve">   0.602</w:t>
+            </w:r>
+          </w:p>
+        </w:tc>
+        <w:tc>
+          <w:p>
+            <w:pPr>
+              <w:pStyle w:val="SourceCode"/>
+              <w:jc w:val="left"/>
+            </w:pPr>
+            <w:r>
+              <w:rPr>
+                <w:rStyle w:val="VerbatimChar"/>
+              </w:rPr>
+              <w:t xml:space="preserve">       0.606</w:t>
+            </w:r>
+          </w:p>
+        </w:tc>
+        <w:tc>
+          <w:p>
+            <w:pPr>
+              <w:pStyle w:val="SourceCode"/>
+              <w:jc w:val="left"/>
+            </w:pPr>
+            <w:r>
+              <w:rPr>
+                <w:rStyle w:val="VerbatimChar"/>
+              </w:rPr>
+              <w:t xml:space="preserve">            0.200</w:t>
             </w:r>
           </w:p>
         </w:tc>
@@ -3159,73 +3483,91 @@
               <w:jc w:val="left"/>
             </w:pPr>
             <w:r>
-              <w:t xml:space="preserve">Renewable Energy</w:t>
-            </w:r>
-          </w:p>
-        </w:tc>
-        <w:tc>
-          <w:p>
-            <w:pPr>
-              <w:pStyle w:val="Compact"/>
-              <w:jc w:val="right"/>
-            </w:pPr>
-            <w:r>
-              <w:t xml:space="preserve">886</w:t>
-            </w:r>
-          </w:p>
-        </w:tc>
-        <w:tc>
-          <w:p>
-            <w:pPr>
-              <w:pStyle w:val="Compact"/>
-              <w:jc w:val="right"/>
-            </w:pPr>
-            <w:r>
-              <w:t xml:space="preserve">1,070</w:t>
-            </w:r>
-          </w:p>
-        </w:tc>
-        <w:tc>
-          <w:p>
-            <w:pPr>
-              <w:pStyle w:val="Compact"/>
-              <w:jc w:val="right"/>
-            </w:pPr>
-            <w:r>
-              <w:t xml:space="preserve">10</w:t>
-            </w:r>
-          </w:p>
-        </w:tc>
-        <w:tc>
-          <w:p>
-            <w:pPr>
-              <w:pStyle w:val="Compact"/>
-              <w:jc w:val="right"/>
-            </w:pPr>
-            <w:r>
-              <w:t xml:space="preserve">0.602</w:t>
-            </w:r>
-          </w:p>
-        </w:tc>
-        <w:tc>
-          <w:p>
-            <w:pPr>
-              <w:pStyle w:val="Compact"/>
-              <w:jc w:val="right"/>
-            </w:pPr>
-            <w:r>
-              <w:t xml:space="preserve">0.606</w:t>
-            </w:r>
-          </w:p>
-        </w:tc>
-        <w:tc>
-          <w:p>
-            <w:pPr>
-              <w:pStyle w:val="Compact"/>
-              <w:jc w:val="right"/>
-            </w:pPr>
-            <w:r>
-              <w:t xml:space="preserve">0.200</w:t>
+              <w:t xml:space="preserve">Precision Agriculture</w:t>
+            </w:r>
+          </w:p>
+        </w:tc>
+        <w:tc>
+          <w:p>
+            <w:pPr>
+              <w:pStyle w:val="SourceCode"/>
+              <w:jc w:val="left"/>
+            </w:pPr>
+            <w:r>
+              <w:rPr>
+                <w:rStyle w:val="VerbatimChar"/>
+              </w:rPr>
+              <w:t xml:space="preserve">       451</w:t>
+            </w:r>
+          </w:p>
+        </w:tc>
+        <w:tc>
+          <w:p>
+            <w:pPr>
+              <w:pStyle w:val="SourceCode"/>
+              <w:jc w:val="left"/>
+            </w:pPr>
+            <w:r>
+              <w:rPr>
+                <w:rStyle w:val="VerbatimChar"/>
+              </w:rPr>
+              <w:t xml:space="preserve">      3,201</w:t>
+            </w:r>
+          </w:p>
+        </w:tc>
+        <w:tc>
+          <w:p>
+            <w:pPr>
+              <w:pStyle w:val="SourceCode"/>
+              <w:jc w:val="left"/>
+            </w:pPr>
+            <w:r>
+              <w:rPr>
+                <w:rStyle w:val="VerbatimChar"/>
+              </w:rPr>
+              <w:t xml:space="preserve">            9</w:t>
+            </w:r>
+          </w:p>
+        </w:tc>
+        <w:tc>
+          <w:p>
+            <w:pPr>
+              <w:pStyle w:val="SourceCode"/>
+              <w:jc w:val="left"/>
+            </w:pPr>
+            <w:r>
+              <w:rPr>
+                <w:rStyle w:val="VerbatimChar"/>
+              </w:rPr>
+              <w:t xml:space="preserve">   0.620</w:t>
+            </w:r>
+          </w:p>
+        </w:tc>
+        <w:tc>
+          <w:p>
+            <w:pPr>
+              <w:pStyle w:val="SourceCode"/>
+              <w:jc w:val="left"/>
+            </w:pPr>
+            <w:r>
+              <w:rPr>
+                <w:rStyle w:val="VerbatimChar"/>
+              </w:rPr>
+              <w:t xml:space="preserve">       0.743</w:t>
+            </w:r>
+          </w:p>
+        </w:tc>
+        <w:tc>
+          <w:p>
+            <w:pPr>
+              <w:pStyle w:val="SourceCode"/>
+              <w:jc w:val="left"/>
+            </w:pPr>
+            <w:r>
+              <w:rPr>
+                <w:rStyle w:val="VerbatimChar"/>
+              </w:rPr>
+              <w:t xml:space="preserve">            0.115</w:t>
             </w:r>
           </w:p>
         </w:tc>
@@ -3245,66 +3587,84 @@
         <w:tc>
           <w:p>
             <w:pPr>
-              <w:pStyle w:val="Compact"/>
-              <w:jc w:val="right"/>
-            </w:pPr>
-            <w:r>
-              <w:t xml:space="preserve">636</w:t>
-            </w:r>
-          </w:p>
-        </w:tc>
-        <w:tc>
-          <w:p>
-            <w:pPr>
-              <w:pStyle w:val="Compact"/>
-              <w:jc w:val="right"/>
-            </w:pPr>
-            <w:r>
-              <w:t xml:space="preserve">1,631</w:t>
-            </w:r>
-          </w:p>
-        </w:tc>
-        <w:tc>
-          <w:p>
-            <w:pPr>
-              <w:pStyle w:val="Compact"/>
-              <w:jc w:val="right"/>
-            </w:pPr>
-            <w:r>
-              <w:t xml:space="preserve">12</w:t>
-            </w:r>
-          </w:p>
-        </w:tc>
-        <w:tc>
-          <w:p>
-            <w:pPr>
-              <w:pStyle w:val="Compact"/>
-              <w:jc w:val="right"/>
-            </w:pPr>
-            <w:r>
-              <w:t xml:space="preserve">0.640</w:t>
-            </w:r>
-          </w:p>
-        </w:tc>
-        <w:tc>
-          <w:p>
-            <w:pPr>
-              <w:pStyle w:val="Compact"/>
-              <w:jc w:val="right"/>
-            </w:pPr>
-            <w:r>
-              <w:t xml:space="preserve">0.865</w:t>
-            </w:r>
-          </w:p>
-        </w:tc>
-        <w:tc>
-          <w:p>
-            <w:pPr>
-              <w:pStyle w:val="Compact"/>
-              <w:jc w:val="right"/>
-            </w:pPr>
-            <w:r>
-              <w:t xml:space="preserve">0.056</w:t>
+              <w:pStyle w:val="SourceCode"/>
+              <w:jc w:val="left"/>
+            </w:pPr>
+            <w:r>
+              <w:rPr>
+                <w:rStyle w:val="VerbatimChar"/>
+              </w:rPr>
+              <w:t xml:space="preserve">       636</w:t>
+            </w:r>
+          </w:p>
+        </w:tc>
+        <w:tc>
+          <w:p>
+            <w:pPr>
+              <w:pStyle w:val="SourceCode"/>
+              <w:jc w:val="left"/>
+            </w:pPr>
+            <w:r>
+              <w:rPr>
+                <w:rStyle w:val="VerbatimChar"/>
+              </w:rPr>
+              <w:t xml:space="preserve">      1,631</w:t>
+            </w:r>
+          </w:p>
+        </w:tc>
+        <w:tc>
+          <w:p>
+            <w:pPr>
+              <w:pStyle w:val="SourceCode"/>
+              <w:jc w:val="left"/>
+            </w:pPr>
+            <w:r>
+              <w:rPr>
+                <w:rStyle w:val="VerbatimChar"/>
+              </w:rPr>
+              <w:t xml:space="preserve">           12</w:t>
+            </w:r>
+          </w:p>
+        </w:tc>
+        <w:tc>
+          <w:p>
+            <w:pPr>
+              <w:pStyle w:val="SourceCode"/>
+              <w:jc w:val="left"/>
+            </w:pPr>
+            <w:r>
+              <w:rPr>
+                <w:rStyle w:val="VerbatimChar"/>
+              </w:rPr>
+              <w:t xml:space="preserve">   0.640</w:t>
+            </w:r>
+          </w:p>
+        </w:tc>
+        <w:tc>
+          <w:p>
+            <w:pPr>
+              <w:pStyle w:val="SourceCode"/>
+              <w:jc w:val="left"/>
+            </w:pPr>
+            <w:r>
+              <w:rPr>
+                <w:rStyle w:val="VerbatimChar"/>
+              </w:rPr>
+              <w:t xml:space="preserve">       0.865</w:t>
+            </w:r>
+          </w:p>
+        </w:tc>
+        <w:tc>
+          <w:p>
+            <w:pPr>
+              <w:pStyle w:val="SourceCode"/>
+              <w:jc w:val="left"/>
+            </w:pPr>
+            <w:r>
+              <w:rPr>
+                <w:rStyle w:val="VerbatimChar"/>
+              </w:rPr>
+              <w:t xml:space="preserve">            0.056</w:t>
             </w:r>
           </w:p>
         </w:tc>

</xml_diff>

<commit_message>
Add author names and institutional affiliations
</commit_message>
<xml_diff>
--- a/manuscrito/manuscript.docx
+++ b/manuscrito/manuscript.docx
@@ -16,11 +16,7 @@
         <w:pStyle w:val="FirstParagraph"/>
       </w:pPr>
       <w:r>
-        <w:rPr>
-          <w:bCs/>
-          <w:b/>
-        </w:rPr>
-        <w:t xml:space="preserve">[Author names withheld — to be completed]</w:t>
+        <w:t xml:space="preserve">Daniel Aristizábal Torres¹* &amp; Ana María Barrera Rodríguez²</w:t>
       </w:r>
     </w:p>
     <w:p>
@@ -28,17 +24,23 @@
         <w:pStyle w:val="BodyText"/>
       </w:pPr>
       <w:r>
-        <w:rPr>
-          <w:bCs/>
-          <w:b/>
-        </w:rPr>
-        <w:t xml:space="preserve">Target venue:</w:t>
-      </w:r>
-      <w:r>
-        <w:t xml:space="preserve"> </w:t>
-      </w:r>
-      <w:r>
-        <w:t xml:space="preserve">Quantitative Science Studies (or Scientometrics / Journal of Informetrics as alternatives)</w:t>
+        <w:t xml:space="preserve">¹ Faculty of Engineering, Universidad Libre Seccional Pereira, Pereira, Colombia</w:t>
+      </w:r>
+    </w:p>
+    <w:p>
+      <w:pPr>
+        <w:pStyle w:val="BodyText"/>
+      </w:pPr>
+      <w:r>
+        <w:t xml:space="preserve">² Facultad de Ciencias Económicas, Administrativas y Contables, Universidad Libre Seccional Pereira, Pereira, Colombia</w:t>
+      </w:r>
+    </w:p>
+    <w:p>
+      <w:pPr>
+        <w:pStyle w:val="BodyText"/>
+      </w:pPr>
+      <w:r>
+        <w:t xml:space="preserve">* Corresponding author: daniel.aristizabalt@unilibre.edu.co</w:t>
       </w:r>
     </w:p>
     <w:p>

</xml_diff>

<commit_message>
Expand references from 13 to 30, all verified and cited in-text
</commit_message>
<xml_diff>
--- a/manuscrito/manuscript.docx
+++ b/manuscrito/manuscript.docx
@@ -167,7 +167,7 @@
         <w:pStyle w:val="FirstParagraph"/>
       </w:pPr>
       <w:r>
-        <w:t xml:space="preserve">Every research field has an intellectual structure: a set of foundational works that different groups of authors cite together, revealing shared theoretical commitments, methodological traditions, or application domains. Mapping this structure — identifying how many distinct</w:t>
+        <w:t xml:space="preserve">Every research field has an intellectual structure: a set of foundational works that different groups of authors cite together, revealing shared theoretical commitments, methodological traditions, or application domains. Citation networks were first shown to reveal this kind of structure by de Solla Price (1965) and Garfield (1972), and mapping it — identifying how many distinct</w:t>
       </w:r>
       <w:r>
         <w:t xml:space="preserve"> </w:t>
@@ -271,7 +271,7 @@
         <w:t xml:space="preserve"> </w:t>
       </w:r>
       <w:r>
-        <w:t xml:space="preserve">Co-citation analysis (Small, 1973) and its author-level extension (White &amp; Griffith, 1981) remain the dominant approach to mapping a field’s intellectual structure, complementing the earlier document-similarity approach of bibliographic coupling (Kessler, 1963). McCain (1990) formalized the general workflow — network construction, dimensionality reduction or clustering, and interpretation — that the present pipeline automates end to end.</w:t>
+        <w:t xml:space="preserve">Co-citation analysis (Small, 1973) and its author-level extension (White &amp; Griffith, 1981) remain the dominant approach to mapping a field’s intellectual structure, complementing the earlier document-similarity approach of bibliographic coupling (Kessler, 1963) and the term-based alternative of co-word analysis (Callon et al., 1991). Boyack and Klavans (2010) compared these citation-based approaches directly and found co-citation analysis to most accurately represent a field’s research front, which motivates our choice of it as the present pipeline’s underlying network structure. McCain (1990) formalized the general workflow — network construction, dimensionality reduction or clustering, and interpretation — that the present pipeline automates end to end.</w:t>
       </w:r>
     </w:p>
     <w:p>
@@ -289,7 +289,7 @@
         <w:t xml:space="preserve"> </w:t>
       </w:r>
       <w:r>
-        <w:t xml:space="preserve">Modularity-based community detection, particularly the Louvain algorithm (Blondel et al., 2008), has become the standard tool for partitioning co-citation and bibliographic-coupling networks into thematic clusters, building on the modularity framework of Newman (2006). A known but under-discussed property of Louvain is its sensitivity to node insertion order in unweighted or naively reconstructed graphs; we document a concrete instance of this problem and its fix (Section 3.5), a methodological caution that, to our knowledge, has not been explicitly reported in prior comparative bibliometric work.</w:t>
+        <w:t xml:space="preserve">Modularity-based community detection — from its origins in Girvan and Newman (2002) through the modularity-optimization framework of Newman (2006), and surveyed comprehensively by Fortunato (2010) — has become the standard tool for partitioning co-citation and bibliographic-coupling networks into thematic clusters, with the Louvain algorithm (Blondel et al., 2008) as its most widely used implementation. A known but under-discussed property of Louvain is its sensitivity to node insertion order in unweighted or naively reconstructed graphs; the successor Leiden algorithm (Traag et al., 2019) was developed specifically to guarantee well-connected communities where Louvain can fail. We document a concrete instance of the node-order problem and a lower-cost fix that preserves determinism without changing algorithms (Section 3.5), a methodological caution that, to our knowledge, has not been explicitly reported in prior comparative bibliometric work.</w:t>
       </w:r>
     </w:p>
     <w:p>
@@ -307,7 +307,7 @@
         <w:t xml:space="preserve"> </w:t>
       </w:r>
       <w:r>
-        <w:t xml:space="preserve">Tools such as CiteSpace (Chen, 2006), VOSviewer (van Eck &amp; Waltman, 2010), and bibliometrix (Aria &amp; Cuccurullo, 2017) have made single-field science mapping widely accessible, and overlay-mapping approaches (Rafols et al., 2010) have been used to visualize interdisciplinarity against a fixed backdrop of science. These tools, however, are designed for single-field, human-in-the-loop analysis; they do not standardize network size across corpora of different volumes, which is a prerequisite for the kind of cross-field comparison we pursue here.</w:t>
+        <w:t xml:space="preserve">Tools such as CiteSpace (Chen, 2006), VOSviewer (van Eck &amp; Waltman, 2010; Waltman et al., 2010), and bibliometrix (Aria &amp; Cuccurullo, 2017) have made single-field science mapping widely accessible — see Cobo et al. (2011) for a comparative review of these and other tools — and overlay-mapping approaches (Leydesdorff &amp; Rafols, 2009; Rafols et al., 2010) have been used to visualize interdisciplinarity against a fixed backdrop of science. These tools, however, are designed for single-field, human-in-the-loop analysis; they do not standardize network size across corpora of different volumes, which is a prerequisite for the kind of cross-field comparison we pursue here.</w:t>
       </w:r>
     </w:p>
     <w:p>
@@ -325,7 +325,7 @@
         <w:t xml:space="preserve"> </w:t>
       </w:r>
       <w:r>
-        <w:t xml:space="preserve">Our IFP is conceptually related to diversity indices used to quantify interdisciplinarity (e.g., Rafols &amp; Meyer, 2010), in that both reduce a complex citation structure to a single comparable number. IFP differs in scope: rather than measuring how much a field draws on</w:t>
+        <w:t xml:space="preserve">Our IFP is conceptually related to diversity indices used to quantify interdisciplinarity, building on Stirling’s (2007) general framework for analysing diversity and its application to citation patterns (Rafols &amp; Meyer, 2010), in that both reduce a complex citation structure to a single comparable number. IFP differs in scope: rather than measuring how much a field draws on</w:t>
       </w:r>
       <w:r>
         <w:t xml:space="preserve"> </w:t>
@@ -359,7 +359,25 @@
         <w:t xml:space="preserve"> </w:t>
       </w:r>
       <w:r>
-        <w:t xml:space="preserve">The use of large language models to summarize or label clusters of scientific documents is a fast-growing but still largely undocumented practice in applied bibliometrics. We contribute a concrete, reproducible protocol — resolving top-PageRank references to real titles via OpenAlex, then prompting a language model for a short name and description — together with the human quality-assurance checks needed to catch a specific failure mode: near-duplicate cluster names produced when a single coherent perspective is spuriously split (Section 3.7).</w:t>
+        <w:t xml:space="preserve">The use of large language models to summarize or label clusters of scientific documents is a fast-growing but still largely undocumented practice in applied bibliometrics. Evidence from the adjacent task of systematic-review screening is mixed: large language models can approach human-level accuracy on some literature-classification tasks but remain unreliable enough that human oversight is still recommended (Khraisha et al., 2024). Consistent with that evidence, we contribute a concrete, reproducible protocol — resolving top-PageRank references to real titles via the OpenAlex API (Priem et al., 2022), then prompting a language model for a short name and description — together with the human quality-assurance checks needed to catch a specific failure mode: near-duplicate cluster names produced when a single coherent perspective is spuriously split (Section 3.7).</w:t>
+      </w:r>
+    </w:p>
+    <w:p>
+      <w:pPr>
+        <w:pStyle w:val="BodyText"/>
+      </w:pPr>
+      <w:r>
+        <w:rPr>
+          <w:bCs/>
+          <w:b/>
+        </w:rPr>
+        <w:t xml:space="preserve">General bibliometric methodology.</w:t>
+      </w:r>
+      <w:r>
+        <w:t xml:space="preserve"> </w:t>
+      </w:r>
+      <w:r>
+        <w:t xml:space="preserve">Beyond citation-network-specific methods, broader guidelines for conducting rigorous bibliometric analyses (Zupic &amp; Čater, 2015; Donthu et al., 2021) emphasize transparent, reproducible protocols over ad hoc application of software tools — a standard the fully scripted, versioned pipeline presented here is designed to meet.</w:t>
       </w:r>
     </w:p>
     <w:p>
@@ -482,7 +500,7 @@
         <w:pStyle w:val="FirstParagraph"/>
       </w:pPr>
       <w:r>
-        <w:t xml:space="preserve">All corpora were retrieved from Web of Science using the</w:t>
+        <w:t xml:space="preserve">All corpora were retrieved from the Web of Science Core Collection — chosen over alternatives such as Scopus for its curated indexing and long-established role in bibliometric research, notwithstanding known differences in journal coverage between databases (Mongeon &amp; Paul-Hus, 2016) — using the</w:t>
       </w:r>
       <w:r>
         <w:t xml:space="preserve"> </w:t>
@@ -3916,7 +3934,7 @@
         <w:t xml:space="preserve"> </w:t>
       </w:r>
       <w:r>
-        <w:t xml:space="preserve">The lowest-fragmentation field, Supply Chain Resilience (IFP = 0.328), was characterized by a small number of very densely interconnected clusters — consistent with a mature field organized around a small set of widely shared foundational citations. The highest-fragmentation fields — Sustainable Urban Mobility, Precision Agriculture, and Renewable Energy — were all mature, multidisciplinary socio-technical domains spanning distinct methodological communities (e.g., transport economics, engineering/operations research, and behavioral psychology within Urban Mobility alone), consistent with the intuitive expectation that interdisciplinary breadth increases citation fragmentation.</w:t>
+        <w:t xml:space="preserve">The lowest-fragmentation field, Supply Chain Resilience (IFP = 0.328), was characterized by a small number of very densely interconnected clusters — consistent with a mature field organized around a small set of widely shared foundational citations, the kind of consolidation one would expect as a subfield’s publication and citation growth stabilizes over time (Bornmann &amp; Mutz, 2015). The highest-fragmentation fields — Sustainable Urban Mobility, Precision Agriculture, and Renewable Energy — were all mature, multidisciplinary socio-technical domains spanning distinct methodological communities (e.g., transport economics, engineering/operations research, and behavioral psychology within Urban Mobility alone), consistent with the intuitive expectation that interdisciplinary breadth increases citation fragmentation.</w:t>
       </w:r>
     </w:p>
     <w:p>
@@ -4370,7 +4388,7 @@
         <w:pStyle w:val="BodyText"/>
       </w:pPr>
       <w:r>
-        <w:t xml:space="preserve">Chen, C. (2006). CiteSpace II: Detecting and visualizing emerging trends and transient patterns in scientific literature.</w:t>
+        <w:t xml:space="preserve">Bornmann, L., &amp; Mutz, R. (2015). Growth rates of modern science: A bibliometric analysis based on the number of publications and cited references.</w:t>
       </w:r>
       <w:r>
         <w:t xml:space="preserve"> </w:t>
@@ -4380,10 +4398,10 @@
           <w:iCs/>
           <w:i/>
         </w:rPr>
-        <w:t xml:space="preserve">Journal of the American Society for Information Science and Technology</w:t>
-      </w:r>
-      <w:r>
-        <w:t xml:space="preserve">, 57(3), 359–377.</w:t>
+        <w:t xml:space="preserve">Journal of the Association for Information Science and Technology</w:t>
+      </w:r>
+      <w:r>
+        <w:t xml:space="preserve">, 66(11), 2215–2222.</w:t>
       </w:r>
     </w:p>
     <w:p>
@@ -4391,7 +4409,7 @@
         <w:pStyle w:val="BodyText"/>
       </w:pPr>
       <w:r>
-        <w:t xml:space="preserve">Kessler, M. M. (1963). Bibliographic coupling between scientific papers.</w:t>
+        <w:t xml:space="preserve">Boyack, K. W., &amp; Klavans, R. (2010). Co-citation analysis, bibliographic coupling, and direct citation: Which citation approach represents the research front most accurately?</w:t>
       </w:r>
       <w:r>
         <w:t xml:space="preserve"> </w:t>
@@ -4401,10 +4419,10 @@
           <w:iCs/>
           <w:i/>
         </w:rPr>
-        <w:t xml:space="preserve">American Documentation</w:t>
-      </w:r>
-      <w:r>
-        <w:t xml:space="preserve">, 14(1), 10–25.</w:t>
+        <w:t xml:space="preserve">Journal of the American Society for Information Science and Technology</w:t>
+      </w:r>
+      <w:r>
+        <w:t xml:space="preserve">, 61(12), 2389–2404.</w:t>
       </w:r>
     </w:p>
     <w:p>
@@ -4412,7 +4430,7 @@
         <w:pStyle w:val="BodyText"/>
       </w:pPr>
       <w:r>
-        <w:t xml:space="preserve">McCain, K. W. (1990). Mapping authors in intellectual space: A technical overview.</w:t>
+        <w:t xml:space="preserve">Callon, M., Courtial, J. P., &amp; Laville, F. (1991). Co-word analysis as a tool for describing the network of interactions between basic and technological research: The case of polymer chemistry.</w:t>
       </w:r>
       <w:r>
         <w:t xml:space="preserve"> </w:t>
@@ -4422,10 +4440,10 @@
           <w:iCs/>
           <w:i/>
         </w:rPr>
-        <w:t xml:space="preserve">Journal of the American Society for Information Science</w:t>
-      </w:r>
-      <w:r>
-        <w:t xml:space="preserve">, 41(6), 433–443.</w:t>
+        <w:t xml:space="preserve">Scientometrics</w:t>
+      </w:r>
+      <w:r>
+        <w:t xml:space="preserve">, 22(1), 155–205.</w:t>
       </w:r>
     </w:p>
     <w:p>
@@ -4433,7 +4451,7 @@
         <w:pStyle w:val="BodyText"/>
       </w:pPr>
       <w:r>
-        <w:t xml:space="preserve">Newman, M. E. J. (2006). Modularity and community structure in networks.</w:t>
+        <w:t xml:space="preserve">Chen, C. (2006). CiteSpace II: Detecting and visualizing emerging trends and transient patterns in scientific literature.</w:t>
       </w:r>
       <w:r>
         <w:t xml:space="preserve"> </w:t>
@@ -4443,10 +4461,10 @@
           <w:iCs/>
           <w:i/>
         </w:rPr>
-        <w:t xml:space="preserve">Proceedings of the National Academy of Sciences</w:t>
-      </w:r>
-      <w:r>
-        <w:t xml:space="preserve">, 103(23), 8577–8582.</w:t>
+        <w:t xml:space="preserve">Journal of the American Society for Information Science and Technology</w:t>
+      </w:r>
+      <w:r>
+        <w:t xml:space="preserve">, 57(3), 359–377.</w:t>
       </w:r>
     </w:p>
     <w:p>
@@ -4454,7 +4472,7 @@
         <w:pStyle w:val="BodyText"/>
       </w:pPr>
       <w:r>
-        <w:t xml:space="preserve">Page, L., Brin, S., Motwani, R., &amp; Winograd, T. (1999).</w:t>
+        <w:t xml:space="preserve">Cobo, M. J., López-Herrera, A. G., Herrera-Viedma, E., &amp; Herrera, F. (2011). Science mapping software tools: Review, analysis, and cooperative study among tools.</w:t>
       </w:r>
       <w:r>
         <w:t xml:space="preserve"> </w:t>
@@ -4464,13 +4482,10 @@
           <w:iCs/>
           <w:i/>
         </w:rPr>
-        <w:t xml:space="preserve">The PageRank citation ranking: Bringing order to the web</w:t>
-      </w:r>
-      <w:r>
-        <w:t xml:space="preserve"> </w:t>
-      </w:r>
-      <w:r>
-        <w:t xml:space="preserve">(Technical Report). Stanford InfoLab.</w:t>
+        <w:t xml:space="preserve">Journal of the American Society for Information Science and Technology</w:t>
+      </w:r>
+      <w:r>
+        <w:t xml:space="preserve">, 62(7), 1382–1402.</w:t>
       </w:r>
     </w:p>
     <w:p>
@@ -4478,7 +4493,7 @@
         <w:pStyle w:val="BodyText"/>
       </w:pPr>
       <w:r>
-        <w:t xml:space="preserve">Rafols, I., &amp; Meyer, M. (2010). Diversity and network coherence as indicators of interdisciplinarity: case studies in bionanoscience.</w:t>
+        <w:t xml:space="preserve">de Solla Price, D. J. (1965). Networks of scientific papers.</w:t>
       </w:r>
       <w:r>
         <w:t xml:space="preserve"> </w:t>
@@ -4488,10 +4503,10 @@
           <w:iCs/>
           <w:i/>
         </w:rPr>
-        <w:t xml:space="preserve">Scientometrics</w:t>
-      </w:r>
-      <w:r>
-        <w:t xml:space="preserve">, 82(2), 263–287.</w:t>
+        <w:t xml:space="preserve">Science</w:t>
+      </w:r>
+      <w:r>
+        <w:t xml:space="preserve">, 149(3683), 510–515.</w:t>
       </w:r>
     </w:p>
     <w:p>
@@ -4499,7 +4514,7 @@
         <w:pStyle w:val="BodyText"/>
       </w:pPr>
       <w:r>
-        <w:t xml:space="preserve">Rafols, I., Porter, A. L., &amp; Leydesdorff, L. (2010). Science overlay maps: A new tool for research policy and library management.</w:t>
+        <w:t xml:space="preserve">Donthu, N., Kumar, S., Mukherjee, D., Pandey, N., &amp; Lim, W. M. (2021). How to conduct a bibliometric analysis: An overview and guidelines.</w:t>
       </w:r>
       <w:r>
         <w:t xml:space="preserve"> </w:t>
@@ -4509,10 +4524,10 @@
           <w:iCs/>
           <w:i/>
         </w:rPr>
-        <w:t xml:space="preserve">Journal of the American Society for Information Science and Technology</w:t>
-      </w:r>
-      <w:r>
-        <w:t xml:space="preserve">, 61(9), 1871–1887.</w:t>
+        <w:t xml:space="preserve">Journal of Business Research</w:t>
+      </w:r>
+      <w:r>
+        <w:t xml:space="preserve">, 133, 285–296.</w:t>
       </w:r>
     </w:p>
     <w:p>
@@ -4520,7 +4535,7 @@
         <w:pStyle w:val="BodyText"/>
       </w:pPr>
       <w:r>
-        <w:t xml:space="preserve">Small, H. (1973). Co-citation in the scientific literature: A new measure of the relationship between two documents.</w:t>
+        <w:t xml:space="preserve">Fortunato, S. (2010). Community detection in graphs.</w:t>
       </w:r>
       <w:r>
         <w:t xml:space="preserve"> </w:t>
@@ -4530,10 +4545,10 @@
           <w:iCs/>
           <w:i/>
         </w:rPr>
-        <w:t xml:space="preserve">Journal of the American Society for Information Science</w:t>
-      </w:r>
-      <w:r>
-        <w:t xml:space="preserve">, 24(4), 265–269.</w:t>
+        <w:t xml:space="preserve">Physics Reports</w:t>
+      </w:r>
+      <w:r>
+        <w:t xml:space="preserve">, 486(3–5), 75–174.</w:t>
       </w:r>
     </w:p>
     <w:p>
@@ -4541,7 +4556,7 @@
         <w:pStyle w:val="BodyText"/>
       </w:pPr>
       <w:r>
-        <w:t xml:space="preserve">van Eck, N. J., &amp; Waltman, L. (2010). Software survey: VOSviewer, a computer program for bibliometric mapping.</w:t>
+        <w:t xml:space="preserve">Garfield, E. (1972). Citation analysis as a tool in journal evaluation.</w:t>
       </w:r>
       <w:r>
         <w:t xml:space="preserve"> </w:t>
@@ -4551,10 +4566,10 @@
           <w:iCs/>
           <w:i/>
         </w:rPr>
-        <w:t xml:space="preserve">Scientometrics</w:t>
-      </w:r>
-      <w:r>
-        <w:t xml:space="preserve">, 84(2), 523–538.</w:t>
+        <w:t xml:space="preserve">Science</w:t>
+      </w:r>
+      <w:r>
+        <w:t xml:space="preserve">, 178(4060), 471–479.</w:t>
       </w:r>
     </w:p>
     <w:p>
@@ -4562,7 +4577,7 @@
         <w:pStyle w:val="BodyText"/>
       </w:pPr>
       <w:r>
-        <w:t xml:space="preserve">White, H. D., &amp; Griffith, B. C. (1981). Author cocitation: A literature measure of intellectual structure.</w:t>
+        <w:t xml:space="preserve">Girvan, M., &amp; Newman, M. E. J. (2002). Community structure in social and biological networks.</w:t>
       </w:r>
       <w:r>
         <w:t xml:space="preserve"> </w:t>
@@ -4572,10 +4587,370 @@
           <w:iCs/>
           <w:i/>
         </w:rPr>
+        <w:t xml:space="preserve">Proceedings of the National Academy of Sciences</w:t>
+      </w:r>
+      <w:r>
+        <w:t xml:space="preserve">, 99(12), 7821–7826.</w:t>
+      </w:r>
+    </w:p>
+    <w:p>
+      <w:pPr>
+        <w:pStyle w:val="BodyText"/>
+      </w:pPr>
+      <w:r>
+        <w:t xml:space="preserve">Kessler, M. M. (1963). Bibliographic coupling between scientific papers.</w:t>
+      </w:r>
+      <w:r>
+        <w:t xml:space="preserve"> </w:t>
+      </w:r>
+      <w:r>
+        <w:rPr>
+          <w:iCs/>
+          <w:i/>
+        </w:rPr>
+        <w:t xml:space="preserve">American Documentation</w:t>
+      </w:r>
+      <w:r>
+        <w:t xml:space="preserve">, 14(1), 10–25.</w:t>
+      </w:r>
+    </w:p>
+    <w:p>
+      <w:pPr>
+        <w:pStyle w:val="BodyText"/>
+      </w:pPr>
+      <w:r>
+        <w:t xml:space="preserve">Khraisha, Q., Put, S., Kappenberg, J., Warraitch, A., &amp; Hadfield, K. (2024). Can large language models replace humans in systematic reviews? Evaluating GPT-4’s efficacy in screening and extracting data from peer-reviewed and grey literature in multiple languages.</w:t>
+      </w:r>
+      <w:r>
+        <w:t xml:space="preserve"> </w:t>
+      </w:r>
+      <w:r>
+        <w:rPr>
+          <w:iCs/>
+          <w:i/>
+        </w:rPr>
+        <w:t xml:space="preserve">Research Synthesis Methods</w:t>
+      </w:r>
+      <w:r>
+        <w:t xml:space="preserve">, 15(4), 616–626.</w:t>
+      </w:r>
+    </w:p>
+    <w:p>
+      <w:pPr>
+        <w:pStyle w:val="BodyText"/>
+      </w:pPr>
+      <w:r>
+        <w:t xml:space="preserve">Leydesdorff, L., &amp; Rafols, I. (2009). A global map of science based on the ISI subject categories.</w:t>
+      </w:r>
+      <w:r>
+        <w:t xml:space="preserve"> </w:t>
+      </w:r>
+      <w:r>
+        <w:rPr>
+          <w:iCs/>
+          <w:i/>
+        </w:rPr>
+        <w:t xml:space="preserve">Journal of the American Society for Information Science and Technology</w:t>
+      </w:r>
+      <w:r>
+        <w:t xml:space="preserve">, 60(2), 348–362.</w:t>
+      </w:r>
+    </w:p>
+    <w:p>
+      <w:pPr>
+        <w:pStyle w:val="BodyText"/>
+      </w:pPr>
+      <w:r>
+        <w:t xml:space="preserve">McCain, K. W. (1990). Mapping authors in intellectual space: A technical overview.</w:t>
+      </w:r>
+      <w:r>
+        <w:t xml:space="preserve"> </w:t>
+      </w:r>
+      <w:r>
+        <w:rPr>
+          <w:iCs/>
+          <w:i/>
+        </w:rPr>
         <w:t xml:space="preserve">Journal of the American Society for Information Science</w:t>
       </w:r>
       <w:r>
+        <w:t xml:space="preserve">, 41(6), 433–443.</w:t>
+      </w:r>
+    </w:p>
+    <w:p>
+      <w:pPr>
+        <w:pStyle w:val="BodyText"/>
+      </w:pPr>
+      <w:r>
+        <w:t xml:space="preserve">Mongeon, P., &amp; Paul-Hus, A. (2016). The journal coverage of Web of Science and Scopus: A comparative analysis.</w:t>
+      </w:r>
+      <w:r>
+        <w:t xml:space="preserve"> </w:t>
+      </w:r>
+      <w:r>
+        <w:rPr>
+          <w:iCs/>
+          <w:i/>
+        </w:rPr>
+        <w:t xml:space="preserve">Scientometrics</w:t>
+      </w:r>
+      <w:r>
+        <w:t xml:space="preserve">, 106(1), 213–228.</w:t>
+      </w:r>
+    </w:p>
+    <w:p>
+      <w:pPr>
+        <w:pStyle w:val="BodyText"/>
+      </w:pPr>
+      <w:r>
+        <w:t xml:space="preserve">Newman, M. E. J. (2006). Modularity and community structure in networks.</w:t>
+      </w:r>
+      <w:r>
+        <w:t xml:space="preserve"> </w:t>
+      </w:r>
+      <w:r>
+        <w:rPr>
+          <w:iCs/>
+          <w:i/>
+        </w:rPr>
+        <w:t xml:space="preserve">Proceedings of the National Academy of Sciences</w:t>
+      </w:r>
+      <w:r>
+        <w:t xml:space="preserve">, 103(23), 8577–8582.</w:t>
+      </w:r>
+    </w:p>
+    <w:p>
+      <w:pPr>
+        <w:pStyle w:val="BodyText"/>
+      </w:pPr>
+      <w:r>
+        <w:t xml:space="preserve">Page, L., Brin, S., Motwani, R., &amp; Winograd, T. (1999).</w:t>
+      </w:r>
+      <w:r>
+        <w:t xml:space="preserve"> </w:t>
+      </w:r>
+      <w:r>
+        <w:rPr>
+          <w:iCs/>
+          <w:i/>
+        </w:rPr>
+        <w:t xml:space="preserve">The PageRank citation ranking: Bringing order to the web</w:t>
+      </w:r>
+      <w:r>
+        <w:t xml:space="preserve"> </w:t>
+      </w:r>
+      <w:r>
+        <w:t xml:space="preserve">(Technical Report). Stanford InfoLab.</w:t>
+      </w:r>
+    </w:p>
+    <w:p>
+      <w:pPr>
+        <w:pStyle w:val="BodyText"/>
+      </w:pPr>
+      <w:r>
+        <w:t xml:space="preserve">Priem, J., Piwowar, H., &amp; Orr, R. (2022). OpenAlex: A fully-open index of scholarly works, authors, venues, institutions, and concepts.</w:t>
+      </w:r>
+      <w:r>
+        <w:t xml:space="preserve"> </w:t>
+      </w:r>
+      <w:r>
+        <w:rPr>
+          <w:iCs/>
+          <w:i/>
+        </w:rPr>
+        <w:t xml:space="preserve">arXiv preprint</w:t>
+      </w:r>
+      <w:r>
+        <w:t xml:space="preserve">, arXiv:2205.01833.</w:t>
+      </w:r>
+    </w:p>
+    <w:p>
+      <w:pPr>
+        <w:pStyle w:val="BodyText"/>
+      </w:pPr>
+      <w:r>
+        <w:t xml:space="preserve">Rafols, I., &amp; Meyer, M. (2010). Diversity and network coherence as indicators of interdisciplinarity: case studies in bionanoscience.</w:t>
+      </w:r>
+      <w:r>
+        <w:t xml:space="preserve"> </w:t>
+      </w:r>
+      <w:r>
+        <w:rPr>
+          <w:iCs/>
+          <w:i/>
+        </w:rPr>
+        <w:t xml:space="preserve">Scientometrics</w:t>
+      </w:r>
+      <w:r>
+        <w:t xml:space="preserve">, 82(2), 263–287.</w:t>
+      </w:r>
+    </w:p>
+    <w:p>
+      <w:pPr>
+        <w:pStyle w:val="BodyText"/>
+      </w:pPr>
+      <w:r>
+        <w:t xml:space="preserve">Rafols, I., Porter, A. L., &amp; Leydesdorff, L. (2010). Science overlay maps: A new tool for research policy and library management.</w:t>
+      </w:r>
+      <w:r>
+        <w:t xml:space="preserve"> </w:t>
+      </w:r>
+      <w:r>
+        <w:rPr>
+          <w:iCs/>
+          <w:i/>
+        </w:rPr>
+        <w:t xml:space="preserve">Journal of the American Society for Information Science and Technology</w:t>
+      </w:r>
+      <w:r>
+        <w:t xml:space="preserve">, 61(9), 1871–1887.</w:t>
+      </w:r>
+    </w:p>
+    <w:p>
+      <w:pPr>
+        <w:pStyle w:val="BodyText"/>
+      </w:pPr>
+      <w:r>
+        <w:t xml:space="preserve">Small, H. (1973). Co-citation in the scientific literature: A new measure of the relationship between two documents.</w:t>
+      </w:r>
+      <w:r>
+        <w:t xml:space="preserve"> </w:t>
+      </w:r>
+      <w:r>
+        <w:rPr>
+          <w:iCs/>
+          <w:i/>
+        </w:rPr>
+        <w:t xml:space="preserve">Journal of the American Society for Information Science</w:t>
+      </w:r>
+      <w:r>
+        <w:t xml:space="preserve">, 24(4), 265–269.</w:t>
+      </w:r>
+    </w:p>
+    <w:p>
+      <w:pPr>
+        <w:pStyle w:val="BodyText"/>
+      </w:pPr>
+      <w:r>
+        <w:t xml:space="preserve">Stirling, A. (2007). A general framework for analysing diversity in science, technology and society.</w:t>
+      </w:r>
+      <w:r>
+        <w:t xml:space="preserve"> </w:t>
+      </w:r>
+      <w:r>
+        <w:rPr>
+          <w:iCs/>
+          <w:i/>
+        </w:rPr>
+        <w:t xml:space="preserve">Journal of the Royal Society Interface</w:t>
+      </w:r>
+      <w:r>
+        <w:t xml:space="preserve">, 4(15), 707–719.</w:t>
+      </w:r>
+    </w:p>
+    <w:p>
+      <w:pPr>
+        <w:pStyle w:val="BodyText"/>
+      </w:pPr>
+      <w:r>
+        <w:t xml:space="preserve">Traag, V. A., Waltman, L., &amp; van Eck, N. J. (2019). From Louvain to Leiden: Guaranteeing well-connected communities.</w:t>
+      </w:r>
+      <w:r>
+        <w:t xml:space="preserve"> </w:t>
+      </w:r>
+      <w:r>
+        <w:rPr>
+          <w:iCs/>
+          <w:i/>
+        </w:rPr>
+        <w:t xml:space="preserve">Scientific Reports</w:t>
+      </w:r>
+      <w:r>
+        <w:t xml:space="preserve">, 9, 5233.</w:t>
+      </w:r>
+    </w:p>
+    <w:p>
+      <w:pPr>
+        <w:pStyle w:val="BodyText"/>
+      </w:pPr>
+      <w:r>
+        <w:t xml:space="preserve">van Eck, N. J., &amp; Waltman, L. (2010). Software survey: VOSviewer, a computer program for bibliometric mapping.</w:t>
+      </w:r>
+      <w:r>
+        <w:t xml:space="preserve"> </w:t>
+      </w:r>
+      <w:r>
+        <w:rPr>
+          <w:iCs/>
+          <w:i/>
+        </w:rPr>
+        <w:t xml:space="preserve">Scientometrics</w:t>
+      </w:r>
+      <w:r>
+        <w:t xml:space="preserve">, 84(2), 523–538.</w:t>
+      </w:r>
+    </w:p>
+    <w:p>
+      <w:pPr>
+        <w:pStyle w:val="BodyText"/>
+      </w:pPr>
+      <w:r>
+        <w:t xml:space="preserve">Waltman, L., van Eck, N. J., &amp; Noyons, E. C. M. (2010). A unified approach to mapping and clustering of bibliometric networks.</w:t>
+      </w:r>
+      <w:r>
+        <w:t xml:space="preserve"> </w:t>
+      </w:r>
+      <w:r>
+        <w:rPr>
+          <w:iCs/>
+          <w:i/>
+        </w:rPr>
+        <w:t xml:space="preserve">Journal of Informetrics</w:t>
+      </w:r>
+      <w:r>
+        <w:t xml:space="preserve">, 4(4), 629–635.</w:t>
+      </w:r>
+    </w:p>
+    <w:p>
+      <w:pPr>
+        <w:pStyle w:val="BodyText"/>
+      </w:pPr>
+      <w:r>
+        <w:t xml:space="preserve">White, H. D., &amp; Griffith, B. C. (1981). Author cocitation: A literature measure of intellectual structure.</w:t>
+      </w:r>
+      <w:r>
+        <w:t xml:space="preserve"> </w:t>
+      </w:r>
+      <w:r>
+        <w:rPr>
+          <w:iCs/>
+          <w:i/>
+        </w:rPr>
+        <w:t xml:space="preserve">Journal of the American Society for Information Science</w:t>
+      </w:r>
+      <w:r>
         <w:t xml:space="preserve">, 32(3), 163–171.</w:t>
+      </w:r>
+    </w:p>
+    <w:p>
+      <w:pPr>
+        <w:pStyle w:val="BodyText"/>
+      </w:pPr>
+      <w:r>
+        <w:t xml:space="preserve">Zupic, I., &amp; Čater, T. (2015). Bibliometric methods in management and organization.</w:t>
+      </w:r>
+      <w:r>
+        <w:t xml:space="preserve"> </w:t>
+      </w:r>
+      <w:r>
+        <w:rPr>
+          <w:iCs/>
+          <w:i/>
+        </w:rPr>
+        <w:t xml:space="preserve">Organizational Research Methods</w:t>
+      </w:r>
+      <w:r>
+        <w:t xml:space="preserve">, 18(3), 429–472.</w:t>
       </w:r>
     </w:p>
     <w:bookmarkEnd w:id="49"/>

</xml_diff>

<commit_message>
Reorder figures and tables to match narrative flow
- RVRP Title-search network now appears before the controlled-replication
  network (was reversed relative to the narrative)
- Table 1 now appears immediately after its introductory sentence, instead
  of after two illustrative figures that referenced results not yet shown
- Removed a duplicated RVRP network image left over from the reorder
</commit_message>
<xml_diff>
--- a/manuscrito/manuscript.docx
+++ b/manuscrito/manuscript.docx
@@ -1044,6 +1044,395 @@
       <w:r>
         <w:drawing>
           <wp:inline>
+            <wp:extent cx="5334000" cy="3593084"/>
+            <wp:effectExtent b="0" l="0" r="0" t="0"/>
+            <wp:docPr descr="Co-citation network of the RVRP anchor field. Node color denotes Louvain community; node size denotes PageRank centrality; only the top-45 most central nodes per cluster and intra-cluster edges are shown for legibility." title="" id="1" name="Picture"/>
+            <a:graphic>
+              <a:graphicData uri="http://schemas.openxmlformats.org/drawingml/2006/picture">
+                <pic:pic>
+                  <pic:nvPicPr>
+                    <pic:cNvPr descr="../figuras/red_rvrp.png" id="0" name="Picture"/>
+                    <pic:cNvPicPr>
+                      <a:picLocks noChangeArrowheads="1" noChangeAspect="1"/>
+                    </pic:cNvPicPr>
+                  </pic:nvPicPr>
+                  <pic:blipFill>
+                    <a:blip r:embed="rId34"/>
+                    <a:stretch>
+                      <a:fillRect/>
+                    </a:stretch>
+                  </pic:blipFill>
+                  <pic:spPr bwMode="auto">
+                    <a:xfrm>
+                      <a:off x="0" y="0"/>
+                      <a:ext cx="5334000" cy="3593084"/>
+                    </a:xfrm>
+                    <a:prstGeom prst="rect">
+                      <a:avLst/>
+                    </a:prstGeom>
+                    <a:noFill/>
+                    <a:ln w="9525">
+                      <a:noFill/>
+                      <a:headEnd/>
+                      <a:tailEnd/>
+                    </a:ln>
+                  </pic:spPr>
+                </pic:pic>
+              </a:graphicData>
+            </a:graphic>
+          </wp:inline>
+        </w:drawing>
+      </w:r>
+    </w:p>
+    <w:p>
+      <w:pPr>
+        <w:pStyle w:val="ImageCaption"/>
+      </w:pPr>
+      <w:r>
+        <w:t xml:space="preserve">Co-citation network of the RVRP anchor field. Node color denotes Louvain community; node size denotes PageRank centrality; only the top-45 most central nodes per cluster and intra-cluster edges are shown for legibility.</w:t>
+      </w:r>
+    </w:p>
+    <w:p>
+      <w:pPr>
+        <w:pStyle w:val="BodyText"/>
+      </w:pPr>
+      <w:r>
+        <w:rPr>
+          <w:bCs/>
+          <w:b/>
+        </w:rPr>
+        <w:t xml:space="preserve">Table 2. Correspondence between the manually derived RVRP perspectives (Aristizábal Torres et al., 2026) and the automated clusters recovered by the present pipeline, under both the standard Title-search design and a controlled replication on the anchor study’s identical Topic-search corpus.</w:t>
+      </w:r>
+    </w:p>
+    <w:tbl>
+      <w:tblPr>
+        <w:tblStyle w:val="Table"/>
+        <w:tblW w:type="pct" w:w="5000.0"/>
+        <w:tblLook w:firstRow="1" w:lastRow="0" w:firstColumn="0" w:lastColumn="0" w:noHBand="0" w:noVBand="0" w:val="0020"/>
+      </w:tblPr>
+      <w:tblGrid>
+        <w:gridCol w:w="2640"/>
+        <w:gridCol w:w="2640"/>
+        <w:gridCol w:w="2640"/>
+      </w:tblGrid>
+      <w:tr>
+        <w:tc>
+          <w:p>
+            <w:pPr>
+              <w:pStyle w:val="Compact"/>
+              <w:jc w:val="left"/>
+            </w:pPr>
+            <w:r>
+              <w:t xml:space="preserve">Anchor perspective (manual, n=469, Topic search, directed network)</w:t>
+            </w:r>
+          </w:p>
+        </w:tc>
+        <w:tc>
+          <w:p>
+            <w:pPr>
+              <w:pStyle w:val="Compact"/>
+              <w:jc w:val="left"/>
+            </w:pPr>
+            <w:r>
+              <w:t xml:space="preserve">Automated, Title search (n=393)</w:t>
+            </w:r>
+          </w:p>
+        </w:tc>
+        <w:tc>
+          <w:p>
+            <w:pPr>
+              <w:pStyle w:val="Compact"/>
+              <w:jc w:val="left"/>
+            </w:pPr>
+            <w:r>
+              <w:t xml:space="preserve">Automated, controlled replication (n=469, identical corpus, Topic search)</w:t>
+            </w:r>
+          </w:p>
+        </w:tc>
+      </w:tr>
+      <w:tr>
+        <w:tc>
+          <w:p>
+            <w:pPr>
+              <w:pStyle w:val="Compact"/>
+              <w:jc w:val="left"/>
+            </w:pPr>
+            <w:r>
+              <w:t xml:space="preserve">P1. Algorithmic optimization and mathematical modeling</w:t>
+            </w:r>
+          </w:p>
+        </w:tc>
+        <w:tc>
+          <w:p>
+            <w:pPr>
+              <w:pStyle w:val="Compact"/>
+              <w:jc w:val="left"/>
+            </w:pPr>
+            <w:r>
+              <w:t xml:space="preserve">VRP with time windows for perishables (n=319); general carbon-footprint logistics (n=71)</w:t>
+            </w:r>
+          </w:p>
+        </w:tc>
+        <w:tc>
+          <w:p>
+            <w:pPr>
+              <w:pStyle w:val="Compact"/>
+              <w:jc w:val="left"/>
+            </w:pPr>
+            <w:r>
+              <w:t xml:space="preserve">VRPTW for perishables (n=499); metaheuristics for VRP (n=259)</w:t>
+            </w:r>
+          </w:p>
+        </w:tc>
+      </w:tr>
+      <w:tr>
+        <w:tc>
+          <w:p>
+            <w:pPr>
+              <w:pStyle w:val="Compact"/>
+              <w:jc w:val="left"/>
+            </w:pPr>
+            <w:r>
+              <w:t xml:space="preserve">P2. Logistics of perishable products and cold-chain operational management</w:t>
+            </w:r>
+          </w:p>
+        </w:tc>
+        <w:tc>
+          <w:p>
+            <w:pPr>
+              <w:pStyle w:val="Compact"/>
+              <w:jc w:val="left"/>
+            </w:pPr>
+            <w:r>
+              <w:t xml:space="preserve">Green cold-chain VRP with carbon emissions (n=432)</w:t>
+            </w:r>
+          </w:p>
+        </w:tc>
+        <w:tc>
+          <w:p>
+            <w:pPr>
+              <w:pStyle w:val="Compact"/>
+              <w:jc w:val="left"/>
+            </w:pPr>
+            <w:r>
+              <w:t xml:space="preserve">Cold-chain, low-carbon VRP (n=557); green/multi-compartment/pollution-routing VRP (n=118)</w:t>
+            </w:r>
+          </w:p>
+        </w:tc>
+      </w:tr>
+      <w:tr>
+        <w:tc>
+          <w:p>
+            <w:pPr>
+              <w:pStyle w:val="Compact"/>
+              <w:jc w:val="left"/>
+            </w:pPr>
+            <w:r>
+              <w:t xml:space="preserve">P3. Inventory-routing integration and strategic logistics coordination</w:t>
+            </w:r>
+          </w:p>
+        </w:tc>
+        <w:tc>
+          <w:p>
+            <w:pPr>
+              <w:pStyle w:val="Compact"/>
+              <w:jc w:val="left"/>
+            </w:pPr>
+            <w:r>
+              <w:t xml:space="preserve">Inventory Routing Problem (n=279); integrated Location-Inventory-Routing Problem (n=139)</w:t>
+            </w:r>
+          </w:p>
+        </w:tc>
+        <w:tc>
+          <w:p>
+            <w:pPr>
+              <w:pStyle w:val="Compact"/>
+              <w:jc w:val="left"/>
+            </w:pPr>
+            <w:r>
+              <w:t xml:space="preserve">Production-Inventory-Routing (PIRP, n=217); classical/collaborative IRP (n=141); integrated Location-Routing-Inventory Problem (n=112)</w:t>
+            </w:r>
+          </w:p>
+        </w:tc>
+      </w:tr>
+      <w:tr>
+        <w:tc>
+          <w:p>
+            <w:pPr>
+              <w:pStyle w:val="Compact"/>
+              <w:jc w:val="left"/>
+            </w:pPr>
+            <w:r>
+              <w:t xml:space="preserve">P4. Dynamic routing, intelligent systems, and multi-objective optimization</w:t>
+            </w:r>
+          </w:p>
+        </w:tc>
+        <w:tc>
+          <w:p>
+            <w:pPr>
+              <w:pStyle w:val="Compact"/>
+              <w:jc w:val="left"/>
+            </w:pPr>
+            <w:r>
+              <w:rPr>
+                <w:iCs/>
+                <w:i/>
+              </w:rPr>
+              <w:t xml:space="preserve">Not recovered</w:t>
+            </w:r>
+          </w:p>
+        </w:tc>
+        <w:tc>
+          <w:p>
+            <w:pPr>
+              <w:pStyle w:val="Compact"/>
+              <w:jc w:val="left"/>
+            </w:pPr>
+            <w:r>
+              <w:rPr>
+                <w:iCs/>
+                <w:i/>
+              </w:rPr>
+              <w:t xml:space="preserve">Not recovered</w:t>
+            </w:r>
+          </w:p>
+        </w:tc>
+      </w:tr>
+      <w:tr>
+        <w:tc>
+          <w:p>
+            <w:pPr>
+              <w:pStyle w:val="Compact"/>
+              <w:jc w:val="left"/>
+            </w:pPr>
+            <w:r>
+              <w:rPr>
+                <w:iCs/>
+                <w:i/>
+              </w:rPr>
+              <w:t xml:space="preserve">(not present in anchor study)</w:t>
+            </w:r>
+          </w:p>
+        </w:tc>
+        <w:tc>
+          <w:p>
+            <w:pPr>
+              <w:pStyle w:val="Compact"/>
+              <w:jc w:val="left"/>
+            </w:pPr>
+            <w:r>
+              <w:t xml:space="preserve">Microbial contamination of fresh produce (n=73)</w:t>
+            </w:r>
+          </w:p>
+        </w:tc>
+        <w:tc>
+          <w:p>
+            <w:pPr>
+              <w:pStyle w:val="Compact"/>
+              <w:jc w:val="left"/>
+            </w:pPr>
+            <w:r>
+              <w:rPr>
+                <w:iCs/>
+                <w:i/>
+              </w:rPr>
+              <w:t xml:space="preserve">(absent — narrower Topic query does not match unrelated food-safety literature)</w:t>
+            </w:r>
+          </w:p>
+        </w:tc>
+      </w:tr>
+    </w:tbl>
+    <w:p>
+      <w:pPr>
+        <w:pStyle w:val="BodyText"/>
+      </w:pPr>
+      <w:r>
+        <w:t xml:space="preserve">The controlled replication clarifies which of the two divergences observed under Title search are attributable to search-field coverage and which are attributable to the clustering methodology itself. The spurious microbial-contamination cluster present in the Title-search result</w:t>
+      </w:r>
+      <w:r>
+        <w:t xml:space="preserve"> </w:t>
+      </w:r>
+      <w:r>
+        <w:rPr>
+          <w:bCs/>
+          <w:b/>
+        </w:rPr>
+        <w:t xml:space="preserve">disappears</w:t>
+      </w:r>
+      <w:r>
+        <w:t xml:space="preserve"> </w:t>
+      </w:r>
+      <w:r>
+        <w:t xml:space="preserve">under the controlled replication, confirming it was a coverage artifact of the looser Title query (Section 3.2) rather than a property of the clustering algorithm. The absence of a distinct cluster corresponding to the anchor’s Perspective 4 (dynamic, time-dependent, and multi-objective routing with intelligent transportation systems), however,</w:t>
+      </w:r>
+      <w:r>
+        <w:t xml:space="preserve"> </w:t>
+      </w:r>
+      <w:r>
+        <w:rPr>
+          <w:bCs/>
+          <w:b/>
+        </w:rPr>
+        <w:t xml:space="preserve">persists even on the anchor study’s own corpus</w:t>
+      </w:r>
+      <w:r>
+        <w:t xml:space="preserve">: neither the Title-search nor the Topic-search automated run isolates it as a separate community. This rules out corpus coverage as the explanation and points instead to a genuine methodological difference between the two pipelines — most plausibly the anchor study’s use of a</w:t>
+      </w:r>
+      <w:r>
+        <w:t xml:space="preserve"> </w:t>
+      </w:r>
+      <w:r>
+        <w:rPr>
+          <w:iCs/>
+          <w:i/>
+        </w:rPr>
+        <w:t xml:space="preserve">directed</w:t>
+      </w:r>
+      <w:r>
+        <w:t xml:space="preserve"> </w:t>
+      </w:r>
+      <w:r>
+        <w:t xml:space="preserve">co-citation network processed with Gephi’s modularity algorithm, versus our</w:t>
+      </w:r>
+      <w:r>
+        <w:t xml:space="preserve"> </w:t>
+      </w:r>
+      <w:r>
+        <w:rPr>
+          <w:iCs/>
+          <w:i/>
+        </w:rPr>
+        <w:t xml:space="preserve">undirected</w:t>
+      </w:r>
+      <w:r>
+        <w:t xml:space="preserve">, weight-pruned network processed with Louvain, and/or the anchor study’s use of expert judgment to designate four communities as</w:t>
+      </w:r>
+      <w:r>
+        <w:t xml:space="preserve"> </w:t>
+      </w:r>
+      <w:r>
+        <w:t xml:space="preserve">“</w:t>
+      </w:r>
+      <w:r>
+        <w:t xml:space="preserve">dominant</w:t>
+      </w:r>
+      <w:r>
+        <w:t xml:space="preserve">”</w:t>
+      </w:r>
+      <w:r>
+        <w:t xml:space="preserve"> </w:t>
+      </w:r>
+      <w:r>
+        <w:t xml:space="preserve">out of nine detected, versus our fixed 3%-of-nodes significance threshold applied uniformly across 20 fields. We report this as an honest limitation of the mechanical, threshold-based approach required for cross-field comparability (Section 6), not as a claim that Perspective 4 does not exist in the literature.</w:t>
+      </w:r>
+    </w:p>
+    <w:p>
+      <w:pPr>
+        <w:pStyle w:val="CaptionedFigure"/>
+      </w:pPr>
+      <w:r>
+        <w:drawing>
+          <wp:inline>
             <wp:extent cx="5334000" cy="3565708"/>
             <wp:effectExtent b="0" l="0" r="0" t="0"/>
             <wp:docPr descr="Co-citation network of the RVRP literature under the controlled replication (identical 469-article corpus to the anchor study, Topic search)." title="" id="1" name="Picture"/>
@@ -1057,7 +1446,7 @@
                     </pic:cNvPicPr>
                   </pic:nvPicPr>
                   <pic:blipFill>
-                    <a:blip r:embed="rId34"/>
+                    <a:blip r:embed="rId35"/>
                     <a:stretch>
                       <a:fillRect/>
                     </a:stretch>
@@ -1097,11 +1486,63 @@
         <w:pStyle w:val="BodyText"/>
       </w:pPr>
       <w:r>
+        <w:t xml:space="preserve">Beyond this one confirmed gap, both automated runs recover the substantive core of all three other anchor perspectives, and both resolve the anchor’s Perspective 3 (inventory-routing integration) into multiple formally distinct operations-research problem classes that the manual study’s four-perspective aggregation grouped together — the classical Inventory Routing Problem, a production-coordinated variant, and the more strategic, multi-echelon Location-Inventory-Routing Problem. This finer granularity is a direct, mechanical consequence of our significance threshold rather than an interpretive choice, and illustrates a general property of the pipeline: it tends to resolve more, smaller, formally distinguishable sub-communities than a human analyst focusing on a small number of</w:t>
+      </w:r>
+      <w:r>
+        <w:t xml:space="preserve"> </w:t>
+      </w:r>
+      <w:r>
+        <w:t xml:space="preserve">“</w:t>
+      </w:r>
+      <w:r>
+        <w:t xml:space="preserve">dominant</w:t>
+      </w:r>
+      <w:r>
+        <w:t xml:space="preserve">”</w:t>
+      </w:r>
+      <w:r>
+        <w:t xml:space="preserve"> </w:t>
+      </w:r>
+      <w:r>
+        <w:t xml:space="preserve">perspectives would.</w:t>
+      </w:r>
+    </w:p>
+    <w:p>
+      <w:pPr>
+        <w:pStyle w:val="BodyText"/>
+      </w:pPr>
+      <w:r>
+        <w:t xml:space="preserve">Overall, the automated pipeline reproduces the structural core of the expert-driven manual analysis — the same algorithmic, cold-chain, and inventory-routing streams, at comparable or higher modularity — while surfacing a finer-grained decomposition of one perspective and missing another that the manual study’s larger, Topic-based corpus was able to isolate. We read this as evidence that the pipeline is a credible, largely faithful substitute for the labor-intensive stages of manual co-citation mapping, with corpus scope (Title vs. Topic search) as the main lever governing where the two approaches diverge.</w:t>
+      </w:r>
+    </w:p>
+    <w:bookmarkEnd w:id="36"/>
+    <w:bookmarkStart w:id="40" w:name="comparative-results-across-20-fields"/>
+    <w:p>
+      <w:pPr>
+        <w:pStyle w:val="Heading3"/>
+      </w:pPr>
+      <w:r>
+        <w:t xml:space="preserve">4.2 Comparative results across 20 fields</w:t>
+      </w:r>
+    </w:p>
+    <w:p>
+      <w:pPr>
+        <w:pStyle w:val="FirstParagraph"/>
+      </w:pPr>
+      <w:r>
+        <w:t xml:space="preserve">Table 1 reports the full results. IFP ranged from 0.328 (Supply Chain Resilience) to 0.640 (Sustainable Urban Mobility), a nearly two-fold range across fields searched, networked, pruned, and clustered under identical conditions.</w:t>
+      </w:r>
+    </w:p>
+    <w:p>
+      <w:pPr>
+        <w:pStyle w:val="BodyText"/>
+      </w:pPr>
+      <w:r>
         <w:rPr>
           <w:bCs/>
           <w:b/>
         </w:rPr>
-        <w:t xml:space="preserve">Table 2. Correspondence between the manually derived RVRP perspectives (Aristizábal Torres et al., 2026) and the automated clusters recovered by the present pipeline, under both the standard Title-search design and a controlled replication on the anchor study’s identical Topic-search corpus.</w:t>
+        <w:t xml:space="preserve">Table 1. IFP and component metrics across 20 research fields, ranked by IFP.</w:t>
       </w:r>
     </w:p>
     <w:tbl>
@@ -1111,9 +1552,13 @@
         <w:tblLook w:firstRow="1" w:lastRow="0" w:firstColumn="0" w:lastColumn="0" w:noHBand="0" w:noVBand="0" w:val="0020"/>
       </w:tblPr>
       <w:tblGrid>
-        <w:gridCol w:w="2640"/>
-        <w:gridCol w:w="2640"/>
-        <w:gridCol w:w="2640"/>
+        <w:gridCol w:w="2146"/>
+        <w:gridCol w:w="868"/>
+        <w:gridCol w:w="919"/>
+        <w:gridCol w:w="1021"/>
+        <w:gridCol w:w="766"/>
+        <w:gridCol w:w="970"/>
+        <w:gridCol w:w="1226"/>
       </w:tblGrid>
       <w:tr>
         <w:tc>
@@ -1123,7 +1568,7 @@
               <w:jc w:val="left"/>
             </w:pPr>
             <w:r>
-              <w:t xml:space="preserve">Anchor perspective (manual, n=469, Topic search, directed network)</w:t>
+              <w:t xml:space="preserve">Field</w:t>
             </w:r>
           </w:p>
         </w:tc>
@@ -1134,7 +1579,7 @@
               <w:jc w:val="left"/>
             </w:pPr>
             <w:r>
-              <w:t xml:space="preserve">Automated, Title search (n=393)</w:t>
+              <w:t xml:space="preserve">Articles (n)</w:t>
             </w:r>
           </w:p>
         </w:tc>
@@ -1145,7 +1590,51 @@
               <w:jc w:val="left"/>
             </w:pPr>
             <w:r>
-              <w:t xml:space="preserve">Automated, controlled replication (n=469, identical corpus, Topic search)</w:t>
+              <w:t xml:space="preserve">Network nodes</w:t>
+            </w:r>
+          </w:p>
+        </w:tc>
+        <w:tc>
+          <w:p>
+            <w:pPr>
+              <w:pStyle w:val="Compact"/>
+              <w:jc w:val="left"/>
+            </w:pPr>
+            <w:r>
+              <w:t xml:space="preserve">Perspectives</w:t>
+            </w:r>
+          </w:p>
+        </w:tc>
+        <w:tc>
+          <w:p>
+            <w:pPr>
+              <w:pStyle w:val="Compact"/>
+              <w:jc w:val="left"/>
+            </w:pPr>
+            <w:r>
+              <w:t xml:space="preserve">IFP</w:t>
+            </w:r>
+          </w:p>
+        </w:tc>
+        <w:tc>
+          <w:p>
+            <w:pPr>
+              <w:pStyle w:val="Compact"/>
+              <w:jc w:val="left"/>
+            </w:pPr>
+            <w:r>
+              <w:t xml:space="preserve">Modularity (Q)</w:t>
+            </w:r>
+          </w:p>
+        </w:tc>
+        <w:tc>
+          <w:p>
+            <w:pPr>
+              <w:pStyle w:val="Compact"/>
+              <w:jc w:val="left"/>
+            </w:pPr>
+            <w:r>
+              <w:t xml:space="preserve">Inter-cluster prop.</w:t>
             </w:r>
           </w:p>
         </w:tc>
@@ -1158,29 +1647,91 @@
               <w:jc w:val="left"/>
             </w:pPr>
             <w:r>
-              <w:t xml:space="preserve">P1. Algorithmic optimization and mathematical modeling</w:t>
-            </w:r>
-          </w:p>
-        </w:tc>
-        <w:tc>
-          <w:p>
-            <w:pPr>
-              <w:pStyle w:val="Compact"/>
-              <w:jc w:val="left"/>
-            </w:pPr>
-            <w:r>
-              <w:t xml:space="preserve">VRP with time windows for perishables (n=319); general carbon-footprint logistics (n=71)</w:t>
-            </w:r>
-          </w:p>
-        </w:tc>
-        <w:tc>
-          <w:p>
-            <w:pPr>
-              <w:pStyle w:val="Compact"/>
-              <w:jc w:val="left"/>
-            </w:pPr>
-            <w:r>
-              <w:t xml:space="preserve">VRPTW for perishables (n=499); metaheuristics for VRP (n=259)</w:t>
+              <w:t xml:space="preserve">Supply Chain Resilience</w:t>
+            </w:r>
+          </w:p>
+        </w:tc>
+        <w:tc>
+          <w:p>
+            <w:pPr>
+              <w:pStyle w:val="SourceCode"/>
+              <w:jc w:val="left"/>
+            </w:pPr>
+            <w:r>
+              <w:rPr>
+                <w:rStyle w:val="VerbatimChar"/>
+              </w:rPr>
+              <w:t xml:space="preserve">       534</w:t>
+            </w:r>
+          </w:p>
+        </w:tc>
+        <w:tc>
+          <w:p>
+            <w:pPr>
+              <w:pStyle w:val="SourceCode"/>
+              <w:jc w:val="left"/>
+            </w:pPr>
+            <w:r>
+              <w:rPr>
+                <w:rStyle w:val="VerbatimChar"/>
+              </w:rPr>
+              <w:t xml:space="preserve">      1,892</w:t>
+            </w:r>
+          </w:p>
+        </w:tc>
+        <w:tc>
+          <w:p>
+            <w:pPr>
+              <w:pStyle w:val="SourceCode"/>
+              <w:jc w:val="left"/>
+            </w:pPr>
+            <w:r>
+              <w:rPr>
+                <w:rStyle w:val="VerbatimChar"/>
+              </w:rPr>
+              <w:t xml:space="preserve">            3</w:t>
+            </w:r>
+          </w:p>
+        </w:tc>
+        <w:tc>
+          <w:p>
+            <w:pPr>
+              <w:pStyle w:val="SourceCode"/>
+              <w:jc w:val="left"/>
+            </w:pPr>
+            <w:r>
+              <w:rPr>
+                <w:rStyle w:val="VerbatimChar"/>
+              </w:rPr>
+              <w:t xml:space="preserve">   0.328</w:t>
+            </w:r>
+          </w:p>
+        </w:tc>
+        <w:tc>
+          <w:p>
+            <w:pPr>
+              <w:pStyle w:val="SourceCode"/>
+              <w:jc w:val="left"/>
+            </w:pPr>
+            <w:r>
+              <w:rPr>
+                <w:rStyle w:val="VerbatimChar"/>
+              </w:rPr>
+              <w:t xml:space="preserve">       0.297</w:t>
+            </w:r>
+          </w:p>
+        </w:tc>
+        <w:tc>
+          <w:p>
+            <w:pPr>
+              <w:pStyle w:val="SourceCode"/>
+              <w:jc w:val="left"/>
+            </w:pPr>
+            <w:r>
+              <w:rPr>
+                <w:rStyle w:val="VerbatimChar"/>
+              </w:rPr>
+              <w:t xml:space="preserve">            0.313</w:t>
             </w:r>
           </w:p>
         </w:tc>
@@ -1193,29 +1744,91 @@
               <w:jc w:val="left"/>
             </w:pPr>
             <w:r>
-              <w:t xml:space="preserve">P2. Logistics of perishable products and cold-chain operational management</w:t>
-            </w:r>
-          </w:p>
-        </w:tc>
-        <w:tc>
-          <w:p>
-            <w:pPr>
-              <w:pStyle w:val="Compact"/>
-              <w:jc w:val="left"/>
-            </w:pPr>
-            <w:r>
-              <w:t xml:space="preserve">Green cold-chain VRP with carbon emissions (n=432)</w:t>
-            </w:r>
-          </w:p>
-        </w:tc>
-        <w:tc>
-          <w:p>
-            <w:pPr>
-              <w:pStyle w:val="Compact"/>
-              <w:jc w:val="left"/>
-            </w:pPr>
-            <w:r>
-              <w:t xml:space="preserve">Cold-chain, low-carbon VRP (n=557); green/multi-compartment/pollution-routing VRP (n=118)</w:t>
+              <w:t xml:space="preserve">Research Integrity</w:t>
+            </w:r>
+          </w:p>
+        </w:tc>
+        <w:tc>
+          <w:p>
+            <w:pPr>
+              <w:pStyle w:val="SourceCode"/>
+              <w:jc w:val="left"/>
+            </w:pPr>
+            <w:r>
+              <w:rPr>
+                <w:rStyle w:val="VerbatimChar"/>
+              </w:rPr>
+              <w:t xml:space="preserve">     1,053</w:t>
+            </w:r>
+          </w:p>
+        </w:tc>
+        <w:tc>
+          <w:p>
+            <w:pPr>
+              <w:pStyle w:val="SourceCode"/>
+              <w:jc w:val="left"/>
+            </w:pPr>
+            <w:r>
+              <w:rPr>
+                <w:rStyle w:val="VerbatimChar"/>
+              </w:rPr>
+              <w:t xml:space="preserve">      1,956</w:t>
+            </w:r>
+          </w:p>
+        </w:tc>
+        <w:tc>
+          <w:p>
+            <w:pPr>
+              <w:pStyle w:val="SourceCode"/>
+              <w:jc w:val="left"/>
+            </w:pPr>
+            <w:r>
+              <w:rPr>
+                <w:rStyle w:val="VerbatimChar"/>
+              </w:rPr>
+              <w:t xml:space="preserve">            4</w:t>
+            </w:r>
+          </w:p>
+        </w:tc>
+        <w:tc>
+          <w:p>
+            <w:pPr>
+              <w:pStyle w:val="SourceCode"/>
+              <w:jc w:val="left"/>
+            </w:pPr>
+            <w:r>
+              <w:rPr>
+                <w:rStyle w:val="VerbatimChar"/>
+              </w:rPr>
+              <w:t xml:space="preserve">   0.370</w:t>
+            </w:r>
+          </w:p>
+        </w:tc>
+        <w:tc>
+          <w:p>
+            <w:pPr>
+              <w:pStyle w:val="SourceCode"/>
+              <w:jc w:val="left"/>
+            </w:pPr>
+            <w:r>
+              <w:rPr>
+                <w:rStyle w:val="VerbatimChar"/>
+              </w:rPr>
+              <w:t xml:space="preserve">       0.536</w:t>
+            </w:r>
+          </w:p>
+        </w:tc>
+        <w:tc>
+          <w:p>
+            <w:pPr>
+              <w:pStyle w:val="SourceCode"/>
+              <w:jc w:val="left"/>
+            </w:pPr>
+            <w:r>
+              <w:rPr>
+                <w:rStyle w:val="VerbatimChar"/>
+              </w:rPr>
+              <w:t xml:space="preserve">            0.075</w:t>
             </w:r>
           </w:p>
         </w:tc>
@@ -1228,29 +1841,91 @@
               <w:jc w:val="left"/>
             </w:pPr>
             <w:r>
-              <w:t xml:space="preserve">P3. Inventory-routing integration and strategic logistics coordination</w:t>
-            </w:r>
-          </w:p>
-        </w:tc>
-        <w:tc>
-          <w:p>
-            <w:pPr>
-              <w:pStyle w:val="Compact"/>
-              <w:jc w:val="left"/>
-            </w:pPr>
-            <w:r>
-              <w:t xml:space="preserve">Inventory Routing Problem (n=279); integrated Location-Inventory-Routing Problem (n=139)</w:t>
-            </w:r>
-          </w:p>
-        </w:tc>
-        <w:tc>
-          <w:p>
-            <w:pPr>
-              <w:pStyle w:val="Compact"/>
-              <w:jc w:val="left"/>
-            </w:pPr>
-            <w:r>
-              <w:t xml:space="preserve">Production-Inventory-Routing (PIRP, n=217); classical/collaborative IRP (n=141); integrated Location-Routing-Inventory Problem (n=112)</w:t>
+              <w:t xml:space="preserve">Corporate Social Responsibility</w:t>
+            </w:r>
+          </w:p>
+        </w:tc>
+        <w:tc>
+          <w:p>
+            <w:pPr>
+              <w:pStyle w:val="SourceCode"/>
+              <w:jc w:val="left"/>
+            </w:pPr>
+            <w:r>
+              <w:rPr>
+                <w:rStyle w:val="VerbatimChar"/>
+              </w:rPr>
+              <w:t xml:space="preserve">     1,617</w:t>
+            </w:r>
+          </w:p>
+        </w:tc>
+        <w:tc>
+          <w:p>
+            <w:pPr>
+              <w:pStyle w:val="SourceCode"/>
+              <w:jc w:val="left"/>
+            </w:pPr>
+            <w:r>
+              <w:rPr>
+                <w:rStyle w:val="VerbatimChar"/>
+              </w:rPr>
+              <w:t xml:space="preserve">      2,075</w:t>
+            </w:r>
+          </w:p>
+        </w:tc>
+        <w:tc>
+          <w:p>
+            <w:pPr>
+              <w:pStyle w:val="SourceCode"/>
+              <w:jc w:val="left"/>
+            </w:pPr>
+            <w:r>
+              <w:rPr>
+                <w:rStyle w:val="VerbatimChar"/>
+              </w:rPr>
+              <w:t xml:space="preserve">            4</w:t>
+            </w:r>
+          </w:p>
+        </w:tc>
+        <w:tc>
+          <w:p>
+            <w:pPr>
+              <w:pStyle w:val="SourceCode"/>
+              <w:jc w:val="left"/>
+            </w:pPr>
+            <w:r>
+              <w:rPr>
+                <w:rStyle w:val="VerbatimChar"/>
+              </w:rPr>
+              <w:t xml:space="preserve">   0.372</w:t>
+            </w:r>
+          </w:p>
+        </w:tc>
+        <w:tc>
+          <w:p>
+            <w:pPr>
+              <w:pStyle w:val="SourceCode"/>
+              <w:jc w:val="left"/>
+            </w:pPr>
+            <w:r>
+              <w:rPr>
+                <w:rStyle w:val="VerbatimChar"/>
+              </w:rPr>
+              <w:t xml:space="preserve">       0.359</w:t>
+            </w:r>
+          </w:p>
+        </w:tc>
+        <w:tc>
+          <w:p>
+            <w:pPr>
+              <w:pStyle w:val="SourceCode"/>
+              <w:jc w:val="left"/>
+            </w:pPr>
+            <w:r>
+              <w:rPr>
+                <w:rStyle w:val="VerbatimChar"/>
+              </w:rPr>
+              <w:t xml:space="preserve">            0.256</w:t>
             </w:r>
           </w:p>
         </w:tc>
@@ -1263,37 +1938,91 @@
               <w:jc w:val="left"/>
             </w:pPr>
             <w:r>
-              <w:t xml:space="preserve">P4. Dynamic routing, intelligent systems, and multi-objective optimization</w:t>
-            </w:r>
-          </w:p>
-        </w:tc>
-        <w:tc>
-          <w:p>
-            <w:pPr>
-              <w:pStyle w:val="Compact"/>
-              <w:jc w:val="left"/>
-            </w:pPr>
-            <w:r>
-              <w:rPr>
-                <w:iCs/>
-                <w:i/>
-              </w:rPr>
-              <w:t xml:space="preserve">Not recovered</w:t>
-            </w:r>
-          </w:p>
-        </w:tc>
-        <w:tc>
-          <w:p>
-            <w:pPr>
-              <w:pStyle w:val="Compact"/>
-              <w:jc w:val="left"/>
-            </w:pPr>
-            <w:r>
-              <w:rPr>
-                <w:iCs/>
-                <w:i/>
-              </w:rPr>
-              <w:t xml:space="preserve">Not recovered</w:t>
+              <w:t xml:space="preserve">CRISPR Gene Editing</w:t>
+            </w:r>
+          </w:p>
+        </w:tc>
+        <w:tc>
+          <w:p>
+            <w:pPr>
+              <w:pStyle w:val="SourceCode"/>
+              <w:jc w:val="left"/>
+            </w:pPr>
+            <w:r>
+              <w:rPr>
+                <w:rStyle w:val="VerbatimChar"/>
+              </w:rPr>
+              <w:t xml:space="preserve">     1,592</w:t>
+            </w:r>
+          </w:p>
+        </w:tc>
+        <w:tc>
+          <w:p>
+            <w:pPr>
+              <w:pStyle w:val="SourceCode"/>
+              <w:jc w:val="left"/>
+            </w:pPr>
+            <w:r>
+              <w:rPr>
+                <w:rStyle w:val="VerbatimChar"/>
+              </w:rPr>
+              <w:t xml:space="preserve">      2,123</w:t>
+            </w:r>
+          </w:p>
+        </w:tc>
+        <w:tc>
+          <w:p>
+            <w:pPr>
+              <w:pStyle w:val="SourceCode"/>
+              <w:jc w:val="left"/>
+            </w:pPr>
+            <w:r>
+              <w:rPr>
+                <w:rStyle w:val="VerbatimChar"/>
+              </w:rPr>
+              <w:t xml:space="preserve">            4</w:t>
+            </w:r>
+          </w:p>
+        </w:tc>
+        <w:tc>
+          <w:p>
+            <w:pPr>
+              <w:pStyle w:val="SourceCode"/>
+              <w:jc w:val="left"/>
+            </w:pPr>
+            <w:r>
+              <w:rPr>
+                <w:rStyle w:val="VerbatimChar"/>
+              </w:rPr>
+              <w:t xml:space="preserve">   0.379</w:t>
+            </w:r>
+          </w:p>
+        </w:tc>
+        <w:tc>
+          <w:p>
+            <w:pPr>
+              <w:pStyle w:val="SourceCode"/>
+              <w:jc w:val="left"/>
+            </w:pPr>
+            <w:r>
+              <w:rPr>
+                <w:rStyle w:val="VerbatimChar"/>
+              </w:rPr>
+              <w:t xml:space="preserve">       0.308</w:t>
+            </w:r>
+          </w:p>
+        </w:tc>
+        <w:tc>
+          <w:p>
+            <w:pPr>
+              <w:pStyle w:val="SourceCode"/>
+              <w:jc w:val="left"/>
+            </w:pPr>
+            <w:r>
+              <w:rPr>
+                <w:rStyle w:val="VerbatimChar"/>
+              </w:rPr>
+              <w:t xml:space="preserve">            0.330</w:t>
             </w:r>
           </w:p>
         </w:tc>
@@ -1306,14 +2035,96 @@
               <w:jc w:val="left"/>
             </w:pPr>
             <w:r>
-              <w:rPr>
-                <w:iCs/>
-                <w:i/>
-              </w:rPr>
-              <w:t xml:space="preserve">(not present in anchor study)</w:t>
-            </w:r>
-          </w:p>
-        </w:tc>
+              <w:t xml:space="preserve">AI Ethics</w:t>
+            </w:r>
+          </w:p>
+        </w:tc>
+        <w:tc>
+          <w:p>
+            <w:pPr>
+              <w:pStyle w:val="SourceCode"/>
+              <w:jc w:val="left"/>
+            </w:pPr>
+            <w:r>
+              <w:rPr>
+                <w:rStyle w:val="VerbatimChar"/>
+              </w:rPr>
+              <w:t xml:space="preserve">       398</w:t>
+            </w:r>
+          </w:p>
+        </w:tc>
+        <w:tc>
+          <w:p>
+            <w:pPr>
+              <w:pStyle w:val="SourceCode"/>
+              <w:jc w:val="left"/>
+            </w:pPr>
+            <w:r>
+              <w:rPr>
+                <w:rStyle w:val="VerbatimChar"/>
+              </w:rPr>
+              <w:t xml:space="preserve">      1,217</w:t>
+            </w:r>
+          </w:p>
+        </w:tc>
+        <w:tc>
+          <w:p>
+            <w:pPr>
+              <w:pStyle w:val="SourceCode"/>
+              <w:jc w:val="left"/>
+            </w:pPr>
+            <w:r>
+              <w:rPr>
+                <w:rStyle w:val="VerbatimChar"/>
+              </w:rPr>
+              <w:t xml:space="preserve">            5</w:t>
+            </w:r>
+          </w:p>
+        </w:tc>
+        <w:tc>
+          <w:p>
+            <w:pPr>
+              <w:pStyle w:val="SourceCode"/>
+              <w:jc w:val="left"/>
+            </w:pPr>
+            <w:r>
+              <w:rPr>
+                <w:rStyle w:val="VerbatimChar"/>
+              </w:rPr>
+              <w:t xml:space="preserve">   0.441</w:t>
+            </w:r>
+          </w:p>
+        </w:tc>
+        <w:tc>
+          <w:p>
+            <w:pPr>
+              <w:pStyle w:val="SourceCode"/>
+              <w:jc w:val="left"/>
+            </w:pPr>
+            <w:r>
+              <w:rPr>
+                <w:rStyle w:val="VerbatimChar"/>
+              </w:rPr>
+              <w:t xml:space="preserve">       0.572</w:t>
+            </w:r>
+          </w:p>
+        </w:tc>
+        <w:tc>
+          <w:p>
+            <w:pPr>
+              <w:pStyle w:val="SourceCode"/>
+              <w:jc w:val="left"/>
+            </w:pPr>
+            <w:r>
+              <w:rPr>
+                <w:rStyle w:val="VerbatimChar"/>
+              </w:rPr>
+              <w:t xml:space="preserve">            0.126</w:t>
+            </w:r>
+          </w:p>
+        </w:tc>
+      </w:tr>
+      <w:tr>
         <w:tc>
           <w:p>
             <w:pPr>
@@ -1321,10 +2132,96 @@
               <w:jc w:val="left"/>
             </w:pPr>
             <w:r>
-              <w:t xml:space="preserve">Microbial contamination of fresh produce (n=73)</w:t>
-            </w:r>
-          </w:p>
-        </w:tc>
+              <w:t xml:space="preserve">Circular Economy</w:t>
+            </w:r>
+          </w:p>
+        </w:tc>
+        <w:tc>
+          <w:p>
+            <w:pPr>
+              <w:pStyle w:val="SourceCode"/>
+              <w:jc w:val="left"/>
+            </w:pPr>
+            <w:r>
+              <w:rPr>
+                <w:rStyle w:val="VerbatimChar"/>
+              </w:rPr>
+              <w:t xml:space="preserve">       890</w:t>
+            </w:r>
+          </w:p>
+        </w:tc>
+        <w:tc>
+          <w:p>
+            <w:pPr>
+              <w:pStyle w:val="SourceCode"/>
+              <w:jc w:val="left"/>
+            </w:pPr>
+            <w:r>
+              <w:rPr>
+                <w:rStyle w:val="VerbatimChar"/>
+              </w:rPr>
+              <w:t xml:space="preserve">      2,105</w:t>
+            </w:r>
+          </w:p>
+        </w:tc>
+        <w:tc>
+          <w:p>
+            <w:pPr>
+              <w:pStyle w:val="SourceCode"/>
+              <w:jc w:val="left"/>
+            </w:pPr>
+            <w:r>
+              <w:rPr>
+                <w:rStyle w:val="VerbatimChar"/>
+              </w:rPr>
+              <w:t xml:space="preserve">            5</w:t>
+            </w:r>
+          </w:p>
+        </w:tc>
+        <w:tc>
+          <w:p>
+            <w:pPr>
+              <w:pStyle w:val="SourceCode"/>
+              <w:jc w:val="left"/>
+            </w:pPr>
+            <w:r>
+              <w:rPr>
+                <w:rStyle w:val="VerbatimChar"/>
+              </w:rPr>
+              <w:t xml:space="preserve">   0.450</w:t>
+            </w:r>
+          </w:p>
+        </w:tc>
+        <w:tc>
+          <w:p>
+            <w:pPr>
+              <w:pStyle w:val="SourceCode"/>
+              <w:jc w:val="left"/>
+            </w:pPr>
+            <w:r>
+              <w:rPr>
+                <w:rStyle w:val="VerbatimChar"/>
+              </w:rPr>
+              <w:t xml:space="preserve">       0.301</w:t>
+            </w:r>
+          </w:p>
+        </w:tc>
+        <w:tc>
+          <w:p>
+            <w:pPr>
+              <w:pStyle w:val="SourceCode"/>
+              <w:jc w:val="left"/>
+            </w:pPr>
+            <w:r>
+              <w:rPr>
+                <w:rStyle w:val="VerbatimChar"/>
+              </w:rPr>
+              <w:t xml:space="preserve">            0.424</w:t>
+            </w:r>
+          </w:p>
+        </w:tc>
+      </w:tr>
+      <w:tr>
         <w:tc>
           <w:p>
             <w:pPr>
@@ -1332,11 +2229,1352 @@
               <w:jc w:val="left"/>
             </w:pPr>
             <w:r>
-              <w:rPr>
-                <w:iCs/>
-                <w:i/>
-              </w:rPr>
-              <w:t xml:space="preserve">(absent — narrower Topic query does not match unrelated food-safety literature)</w:t>
+              <w:t xml:space="preserve">Microplastics</w:t>
+            </w:r>
+          </w:p>
+        </w:tc>
+        <w:tc>
+          <w:p>
+            <w:pPr>
+              <w:pStyle w:val="SourceCode"/>
+              <w:jc w:val="left"/>
+            </w:pPr>
+            <w:r>
+              <w:rPr>
+                <w:rStyle w:val="VerbatimChar"/>
+              </w:rPr>
+              <w:t xml:space="preserve">     1,204</w:t>
+            </w:r>
+          </w:p>
+        </w:tc>
+        <w:tc>
+          <w:p>
+            <w:pPr>
+              <w:pStyle w:val="SourceCode"/>
+              <w:jc w:val="left"/>
+            </w:pPr>
+            <w:r>
+              <w:rPr>
+                <w:rStyle w:val="VerbatimChar"/>
+              </w:rPr>
+              <w:t xml:space="preserve">      2,077</w:t>
+            </w:r>
+          </w:p>
+        </w:tc>
+        <w:tc>
+          <w:p>
+            <w:pPr>
+              <w:pStyle w:val="SourceCode"/>
+              <w:jc w:val="left"/>
+            </w:pPr>
+            <w:r>
+              <w:rPr>
+                <w:rStyle w:val="VerbatimChar"/>
+              </w:rPr>
+              <w:t xml:space="preserve">            6</w:t>
+            </w:r>
+          </w:p>
+        </w:tc>
+        <w:tc>
+          <w:p>
+            <w:pPr>
+              <w:pStyle w:val="SourceCode"/>
+              <w:jc w:val="left"/>
+            </w:pPr>
+            <w:r>
+              <w:rPr>
+                <w:rStyle w:val="VerbatimChar"/>
+              </w:rPr>
+              <w:t xml:space="preserve">   0.494</w:t>
+            </w:r>
+          </w:p>
+        </w:tc>
+        <w:tc>
+          <w:p>
+            <w:pPr>
+              <w:pStyle w:val="SourceCode"/>
+              <w:jc w:val="left"/>
+            </w:pPr>
+            <w:r>
+              <w:rPr>
+                <w:rStyle w:val="VerbatimChar"/>
+              </w:rPr>
+              <w:t xml:space="preserve">       0.308</w:t>
+            </w:r>
+          </w:p>
+        </w:tc>
+        <w:tc>
+          <w:p>
+            <w:pPr>
+              <w:pStyle w:val="SourceCode"/>
+              <w:jc w:val="left"/>
+            </w:pPr>
+            <w:r>
+              <w:rPr>
+                <w:rStyle w:val="VerbatimChar"/>
+              </w:rPr>
+              <w:t xml:space="preserve">            0.422</w:t>
+            </w:r>
+          </w:p>
+        </w:tc>
+      </w:tr>
+      <w:tr>
+        <w:tc>
+          <w:p>
+            <w:pPr>
+              <w:pStyle w:val="Compact"/>
+              <w:jc w:val="left"/>
+            </w:pPr>
+            <w:r>
+              <w:t xml:space="preserve">Climate Change Adaptation</w:t>
+            </w:r>
+          </w:p>
+        </w:tc>
+        <w:tc>
+          <w:p>
+            <w:pPr>
+              <w:pStyle w:val="SourceCode"/>
+              <w:jc w:val="left"/>
+            </w:pPr>
+            <w:r>
+              <w:rPr>
+                <w:rStyle w:val="VerbatimChar"/>
+              </w:rPr>
+              <w:t xml:space="preserve">     1,019</w:t>
+            </w:r>
+          </w:p>
+        </w:tc>
+        <w:tc>
+          <w:p>
+            <w:pPr>
+              <w:pStyle w:val="SourceCode"/>
+              <w:jc w:val="left"/>
+            </w:pPr>
+            <w:r>
+              <w:rPr>
+                <w:rStyle w:val="VerbatimChar"/>
+              </w:rPr>
+              <w:t xml:space="preserve">      1,181</w:t>
+            </w:r>
+          </w:p>
+        </w:tc>
+        <w:tc>
+          <w:p>
+            <w:pPr>
+              <w:pStyle w:val="SourceCode"/>
+              <w:jc w:val="left"/>
+            </w:pPr>
+            <w:r>
+              <w:rPr>
+                <w:rStyle w:val="VerbatimChar"/>
+              </w:rPr>
+              <w:t xml:space="preserve">            6</w:t>
+            </w:r>
+          </w:p>
+        </w:tc>
+        <w:tc>
+          <w:p>
+            <w:pPr>
+              <w:pStyle w:val="SourceCode"/>
+              <w:jc w:val="left"/>
+            </w:pPr>
+            <w:r>
+              <w:rPr>
+                <w:rStyle w:val="VerbatimChar"/>
+              </w:rPr>
+              <w:t xml:space="preserve">   0.502</w:t>
+            </w:r>
+          </w:p>
+        </w:tc>
+        <w:tc>
+          <w:p>
+            <w:pPr>
+              <w:pStyle w:val="SourceCode"/>
+              <w:jc w:val="left"/>
+            </w:pPr>
+            <w:r>
+              <w:rPr>
+                <w:rStyle w:val="VerbatimChar"/>
+              </w:rPr>
+              <w:t xml:space="preserve">       0.554</w:t>
+            </w:r>
+          </w:p>
+        </w:tc>
+        <w:tc>
+          <w:p>
+            <w:pPr>
+              <w:pStyle w:val="SourceCode"/>
+              <w:jc w:val="left"/>
+            </w:pPr>
+            <w:r>
+              <w:rPr>
+                <w:rStyle w:val="VerbatimChar"/>
+              </w:rPr>
+              <w:t xml:space="preserve">            0.202</w:t>
+            </w:r>
+          </w:p>
+        </w:tc>
+      </w:tr>
+      <w:tr>
+        <w:tc>
+          <w:p>
+            <w:pPr>
+              <w:pStyle w:val="Compact"/>
+              <w:jc w:val="left"/>
+            </w:pPr>
+            <w:r>
+              <w:t xml:space="preserve">Quantum Computing</w:t>
+            </w:r>
+          </w:p>
+        </w:tc>
+        <w:tc>
+          <w:p>
+            <w:pPr>
+              <w:pStyle w:val="SourceCode"/>
+              <w:jc w:val="left"/>
+            </w:pPr>
+            <w:r>
+              <w:rPr>
+                <w:rStyle w:val="VerbatimChar"/>
+              </w:rPr>
+              <w:t xml:space="preserve">       412</w:t>
+            </w:r>
+          </w:p>
+        </w:tc>
+        <w:tc>
+          <w:p>
+            <w:pPr>
+              <w:pStyle w:val="SourceCode"/>
+              <w:jc w:val="left"/>
+            </w:pPr>
+            <w:r>
+              <w:rPr>
+                <w:rStyle w:val="VerbatimChar"/>
+              </w:rPr>
+              <w:t xml:space="preserve">      2,519</w:t>
+            </w:r>
+          </w:p>
+        </w:tc>
+        <w:tc>
+          <w:p>
+            <w:pPr>
+              <w:pStyle w:val="SourceCode"/>
+              <w:jc w:val="left"/>
+            </w:pPr>
+            <w:r>
+              <w:rPr>
+                <w:rStyle w:val="VerbatimChar"/>
+              </w:rPr>
+              <w:t xml:space="preserve">            6</w:t>
+            </w:r>
+          </w:p>
+        </w:tc>
+        <w:tc>
+          <w:p>
+            <w:pPr>
+              <w:pStyle w:val="SourceCode"/>
+              <w:jc w:val="left"/>
+            </w:pPr>
+            <w:r>
+              <w:rPr>
+                <w:rStyle w:val="VerbatimChar"/>
+              </w:rPr>
+              <w:t xml:space="preserve">   0.511</w:t>
+            </w:r>
+          </w:p>
+        </w:tc>
+        <w:tc>
+          <w:p>
+            <w:pPr>
+              <w:pStyle w:val="SourceCode"/>
+              <w:jc w:val="left"/>
+            </w:pPr>
+            <w:r>
+              <w:rPr>
+                <w:rStyle w:val="VerbatimChar"/>
+              </w:rPr>
+              <w:t xml:space="preserve">       0.396</w:t>
+            </w:r>
+          </w:p>
+        </w:tc>
+        <w:tc>
+          <w:p>
+            <w:pPr>
+              <w:pStyle w:val="SourceCode"/>
+              <w:jc w:val="left"/>
+            </w:pPr>
+            <w:r>
+              <w:rPr>
+                <w:rStyle w:val="VerbatimChar"/>
+              </w:rPr>
+              <w:t xml:space="preserve">            0.385</w:t>
+            </w:r>
+          </w:p>
+        </w:tc>
+      </w:tr>
+      <w:tr>
+        <w:tc>
+          <w:p>
+            <w:pPr>
+              <w:pStyle w:val="Compact"/>
+              <w:jc w:val="left"/>
+            </w:pPr>
+            <w:r>
+              <w:t xml:space="preserve">Deep Learning (medical applications)</w:t>
+            </w:r>
+          </w:p>
+        </w:tc>
+        <w:tc>
+          <w:p>
+            <w:pPr>
+              <w:pStyle w:val="SourceCode"/>
+              <w:jc w:val="left"/>
+            </w:pPr>
+            <w:r>
+              <w:rPr>
+                <w:rStyle w:val="VerbatimChar"/>
+              </w:rPr>
+              <w:t xml:space="preserve">       702</w:t>
+            </w:r>
+          </w:p>
+        </w:tc>
+        <w:tc>
+          <w:p>
+            <w:pPr>
+              <w:pStyle w:val="SourceCode"/>
+              <w:jc w:val="left"/>
+            </w:pPr>
+            <w:r>
+              <w:rPr>
+                <w:rStyle w:val="VerbatimChar"/>
+              </w:rPr>
+              <w:t xml:space="preserve">        823</w:t>
+            </w:r>
+          </w:p>
+        </w:tc>
+        <w:tc>
+          <w:p>
+            <w:pPr>
+              <w:pStyle w:val="SourceCode"/>
+              <w:jc w:val="left"/>
+            </w:pPr>
+            <w:r>
+              <w:rPr>
+                <w:rStyle w:val="VerbatimChar"/>
+              </w:rPr>
+              <w:t xml:space="preserve">            6</w:t>
+            </w:r>
+          </w:p>
+        </w:tc>
+        <w:tc>
+          <w:p>
+            <w:pPr>
+              <w:pStyle w:val="SourceCode"/>
+              <w:jc w:val="left"/>
+            </w:pPr>
+            <w:r>
+              <w:rPr>
+                <w:rStyle w:val="VerbatimChar"/>
+              </w:rPr>
+              <w:t xml:space="preserve">   0.519</w:t>
+            </w:r>
+          </w:p>
+        </w:tc>
+        <w:tc>
+          <w:p>
+            <w:pPr>
+              <w:pStyle w:val="SourceCode"/>
+              <w:jc w:val="left"/>
+            </w:pPr>
+            <w:r>
+              <w:rPr>
+                <w:rStyle w:val="VerbatimChar"/>
+              </w:rPr>
+              <w:t xml:space="preserve">       0.708</w:t>
+            </w:r>
+          </w:p>
+        </w:tc>
+        <w:tc>
+          <w:p>
+            <w:pPr>
+              <w:pStyle w:val="SourceCode"/>
+              <w:jc w:val="left"/>
+            </w:pPr>
+            <w:r>
+              <w:rPr>
+                <w:rStyle w:val="VerbatimChar"/>
+              </w:rPr>
+              <w:t xml:space="preserve">            0.098</w:t>
+            </w:r>
+          </w:p>
+        </w:tc>
+      </w:tr>
+      <w:tr>
+        <w:tc>
+          <w:p>
+            <w:pPr>
+              <w:pStyle w:val="Compact"/>
+              <w:jc w:val="left"/>
+            </w:pPr>
+            <w:r>
+              <w:t xml:space="preserve">RVRP (validation anchor)</w:t>
+            </w:r>
+          </w:p>
+        </w:tc>
+        <w:tc>
+          <w:p>
+            <w:pPr>
+              <w:pStyle w:val="SourceCode"/>
+              <w:jc w:val="left"/>
+            </w:pPr>
+            <w:r>
+              <w:rPr>
+                <w:rStyle w:val="VerbatimChar"/>
+              </w:rPr>
+              <w:t xml:space="preserve">       393</w:t>
+            </w:r>
+          </w:p>
+        </w:tc>
+        <w:tc>
+          <w:p>
+            <w:pPr>
+              <w:pStyle w:val="SourceCode"/>
+              <w:jc w:val="left"/>
+            </w:pPr>
+            <w:r>
+              <w:rPr>
+                <w:rStyle w:val="VerbatimChar"/>
+              </w:rPr>
+              <w:t xml:space="preserve">      1,630</w:t>
+            </w:r>
+          </w:p>
+        </w:tc>
+        <w:tc>
+          <w:p>
+            <w:pPr>
+              <w:pStyle w:val="SourceCode"/>
+              <w:jc w:val="left"/>
+            </w:pPr>
+            <w:r>
+              <w:rPr>
+                <w:rStyle w:val="VerbatimChar"/>
+              </w:rPr>
+              <w:t xml:space="preserve">            6</w:t>
+            </w:r>
+          </w:p>
+        </w:tc>
+        <w:tc>
+          <w:p>
+            <w:pPr>
+              <w:pStyle w:val="SourceCode"/>
+              <w:jc w:val="left"/>
+            </w:pPr>
+            <w:r>
+              <w:rPr>
+                <w:rStyle w:val="VerbatimChar"/>
+              </w:rPr>
+              <w:t xml:space="preserve">   0.526</w:t>
+            </w:r>
+          </w:p>
+        </w:tc>
+        <w:tc>
+          <w:p>
+            <w:pPr>
+              <w:pStyle w:val="SourceCode"/>
+              <w:jc w:val="left"/>
+            </w:pPr>
+            <w:r>
+              <w:rPr>
+                <w:rStyle w:val="VerbatimChar"/>
+              </w:rPr>
+              <w:t xml:space="preserve">       0.613</w:t>
+            </w:r>
+          </w:p>
+        </w:tc>
+        <w:tc>
+          <w:p>
+            <w:pPr>
+              <w:pStyle w:val="SourceCode"/>
+              <w:jc w:val="left"/>
+            </w:pPr>
+            <w:r>
+              <w:rPr>
+                <w:rStyle w:val="VerbatimChar"/>
+              </w:rPr>
+              <w:t xml:space="preserve">            0.216</w:t>
+            </w:r>
+          </w:p>
+        </w:tc>
+      </w:tr>
+      <w:tr>
+        <w:tc>
+          <w:p>
+            <w:pPr>
+              <w:pStyle w:val="Compact"/>
+              <w:jc w:val="left"/>
+            </w:pPr>
+            <w:r>
+              <w:t xml:space="preserve">Adolescent Mental Health</w:t>
+            </w:r>
+          </w:p>
+        </w:tc>
+        <w:tc>
+          <w:p>
+            <w:pPr>
+              <w:pStyle w:val="SourceCode"/>
+              <w:jc w:val="left"/>
+            </w:pPr>
+            <w:r>
+              <w:rPr>
+                <w:rStyle w:val="VerbatimChar"/>
+              </w:rPr>
+              <w:t xml:space="preserve">     1,319</w:t>
+            </w:r>
+          </w:p>
+        </w:tc>
+        <w:tc>
+          <w:p>
+            <w:pPr>
+              <w:pStyle w:val="SourceCode"/>
+              <w:jc w:val="left"/>
+            </w:pPr>
+            <w:r>
+              <w:rPr>
+                <w:rStyle w:val="VerbatimChar"/>
+              </w:rPr>
+              <w:t xml:space="preserve">      1,376</w:t>
+            </w:r>
+          </w:p>
+        </w:tc>
+        <w:tc>
+          <w:p>
+            <w:pPr>
+              <w:pStyle w:val="SourceCode"/>
+              <w:jc w:val="left"/>
+            </w:pPr>
+            <w:r>
+              <w:rPr>
+                <w:rStyle w:val="VerbatimChar"/>
+              </w:rPr>
+              <w:t xml:space="preserve">            7</w:t>
+            </w:r>
+          </w:p>
+        </w:tc>
+        <w:tc>
+          <w:p>
+            <w:pPr>
+              <w:pStyle w:val="SourceCode"/>
+              <w:jc w:val="left"/>
+            </w:pPr>
+            <w:r>
+              <w:rPr>
+                <w:rStyle w:val="VerbatimChar"/>
+              </w:rPr>
+              <w:t xml:space="preserve">   0.544</w:t>
+            </w:r>
+          </w:p>
+        </w:tc>
+        <w:tc>
+          <w:p>
+            <w:pPr>
+              <w:pStyle w:val="SourceCode"/>
+              <w:jc w:val="left"/>
+            </w:pPr>
+            <w:r>
+              <w:rPr>
+                <w:rStyle w:val="VerbatimChar"/>
+              </w:rPr>
+              <w:t xml:space="preserve">       0.457</w:t>
+            </w:r>
+          </w:p>
+        </w:tc>
+        <w:tc>
+          <w:p>
+            <w:pPr>
+              <w:pStyle w:val="SourceCode"/>
+              <w:jc w:val="left"/>
+            </w:pPr>
+            <w:r>
+              <w:rPr>
+                <w:rStyle w:val="VerbatimChar"/>
+              </w:rPr>
+              <w:t xml:space="preserve">            0.300</w:t>
+            </w:r>
+          </w:p>
+        </w:tc>
+      </w:tr>
+      <w:tr>
+        <w:tc>
+          <w:p>
+            <w:pPr>
+              <w:pStyle w:val="Compact"/>
+              <w:jc w:val="left"/>
+            </w:pPr>
+            <w:r>
+              <w:t xml:space="preserve">COVID-19 Vaccine Hesitancy</w:t>
+            </w:r>
+          </w:p>
+        </w:tc>
+        <w:tc>
+          <w:p>
+            <w:pPr>
+              <w:pStyle w:val="SourceCode"/>
+              <w:jc w:val="left"/>
+            </w:pPr>
+            <w:r>
+              <w:rPr>
+                <w:rStyle w:val="VerbatimChar"/>
+              </w:rPr>
+              <w:t xml:space="preserve">     1,809</w:t>
+            </w:r>
+          </w:p>
+        </w:tc>
+        <w:tc>
+          <w:p>
+            <w:pPr>
+              <w:pStyle w:val="SourceCode"/>
+              <w:jc w:val="left"/>
+            </w:pPr>
+            <w:r>
+              <w:rPr>
+                <w:rStyle w:val="VerbatimChar"/>
+              </w:rPr>
+              <w:t xml:space="preserve">      2,389</w:t>
+            </w:r>
+          </w:p>
+        </w:tc>
+        <w:tc>
+          <w:p>
+            <w:pPr>
+              <w:pStyle w:val="SourceCode"/>
+              <w:jc w:val="left"/>
+            </w:pPr>
+            <w:r>
+              <w:rPr>
+                <w:rStyle w:val="VerbatimChar"/>
+              </w:rPr>
+              <w:t xml:space="preserve">            7</w:t>
+            </w:r>
+          </w:p>
+        </w:tc>
+        <w:tc>
+          <w:p>
+            <w:pPr>
+              <w:pStyle w:val="SourceCode"/>
+              <w:jc w:val="left"/>
+            </w:pPr>
+            <w:r>
+              <w:rPr>
+                <w:rStyle w:val="VerbatimChar"/>
+              </w:rPr>
+              <w:t xml:space="preserve">   0.550</w:t>
+            </w:r>
+          </w:p>
+        </w:tc>
+        <w:tc>
+          <w:p>
+            <w:pPr>
+              <w:pStyle w:val="SourceCode"/>
+              <w:jc w:val="left"/>
+            </w:pPr>
+            <w:r>
+              <w:rPr>
+                <w:rStyle w:val="VerbatimChar"/>
+              </w:rPr>
+              <w:t xml:space="preserve">       0.232</w:t>
+            </w:r>
+          </w:p>
+        </w:tc>
+        <w:tc>
+          <w:p>
+            <w:pPr>
+              <w:pStyle w:val="SourceCode"/>
+              <w:jc w:val="left"/>
+            </w:pPr>
+            <w:r>
+              <w:rPr>
+                <w:rStyle w:val="VerbatimChar"/>
+              </w:rPr>
+              <w:t xml:space="preserve">            0.543</w:t>
+            </w:r>
+          </w:p>
+        </w:tc>
+      </w:tr>
+      <w:tr>
+        <w:tc>
+          <w:p>
+            <w:pPr>
+              <w:pStyle w:val="Compact"/>
+              <w:jc w:val="left"/>
+            </w:pPr>
+            <w:r>
+              <w:t xml:space="preserve">Blockchain in Finance and Supply Chain</w:t>
+            </w:r>
+          </w:p>
+        </w:tc>
+        <w:tc>
+          <w:p>
+            <w:pPr>
+              <w:pStyle w:val="SourceCode"/>
+              <w:jc w:val="left"/>
+            </w:pPr>
+            <w:r>
+              <w:rPr>
+                <w:rStyle w:val="VerbatimChar"/>
+              </w:rPr>
+              <w:t xml:space="preserve">       318</w:t>
+            </w:r>
+          </w:p>
+        </w:tc>
+        <w:tc>
+          <w:p>
+            <w:pPr>
+              <w:pStyle w:val="SourceCode"/>
+              <w:jc w:val="left"/>
+            </w:pPr>
+            <w:r>
+              <w:rPr>
+                <w:rStyle w:val="VerbatimChar"/>
+              </w:rPr>
+              <w:t xml:space="preserve">      1,499</w:t>
+            </w:r>
+          </w:p>
+        </w:tc>
+        <w:tc>
+          <w:p>
+            <w:pPr>
+              <w:pStyle w:val="SourceCode"/>
+              <w:jc w:val="left"/>
+            </w:pPr>
+            <w:r>
+              <w:rPr>
+                <w:rStyle w:val="VerbatimChar"/>
+              </w:rPr>
+              <w:t xml:space="preserve">            7</w:t>
+            </w:r>
+          </w:p>
+        </w:tc>
+        <w:tc>
+          <w:p>
+            <w:pPr>
+              <w:pStyle w:val="SourceCode"/>
+              <w:jc w:val="left"/>
+            </w:pPr>
+            <w:r>
+              <w:rPr>
+                <w:rStyle w:val="VerbatimChar"/>
+              </w:rPr>
+              <w:t xml:space="preserve">   0.568</w:t>
+            </w:r>
+          </w:p>
+        </w:tc>
+        <w:tc>
+          <w:p>
+            <w:pPr>
+              <w:pStyle w:val="SourceCode"/>
+              <w:jc w:val="left"/>
+            </w:pPr>
+            <w:r>
+              <w:rPr>
+                <w:rStyle w:val="VerbatimChar"/>
+              </w:rPr>
+              <w:t xml:space="preserve">       0.549</w:t>
+            </w:r>
+          </w:p>
+        </w:tc>
+        <w:tc>
+          <w:p>
+            <w:pPr>
+              <w:pStyle w:val="SourceCode"/>
+              <w:jc w:val="left"/>
+            </w:pPr>
+            <w:r>
+              <w:rPr>
+                <w:rStyle w:val="VerbatimChar"/>
+              </w:rPr>
+              <w:t xml:space="preserve">            0.281</w:t>
+            </w:r>
+          </w:p>
+        </w:tc>
+      </w:tr>
+      <w:tr>
+        <w:tc>
+          <w:p>
+            <w:pPr>
+              <w:pStyle w:val="Compact"/>
+              <w:jc w:val="left"/>
+            </w:pPr>
+            <w:r>
+              <w:t xml:space="preserve">Financial Literacy</w:t>
+            </w:r>
+          </w:p>
+        </w:tc>
+        <w:tc>
+          <w:p>
+            <w:pPr>
+              <w:pStyle w:val="SourceCode"/>
+              <w:jc w:val="left"/>
+            </w:pPr>
+            <w:r>
+              <w:rPr>
+                <w:rStyle w:val="VerbatimChar"/>
+              </w:rPr>
+              <w:t xml:space="preserve">       310</w:t>
+            </w:r>
+          </w:p>
+        </w:tc>
+        <w:tc>
+          <w:p>
+            <w:pPr>
+              <w:pStyle w:val="SourceCode"/>
+              <w:jc w:val="left"/>
+            </w:pPr>
+            <w:r>
+              <w:rPr>
+                <w:rStyle w:val="VerbatimChar"/>
+              </w:rPr>
+              <w:t xml:space="preserve">      1,962</w:t>
+            </w:r>
+          </w:p>
+        </w:tc>
+        <w:tc>
+          <w:p>
+            <w:pPr>
+              <w:pStyle w:val="SourceCode"/>
+              <w:jc w:val="left"/>
+            </w:pPr>
+            <w:r>
+              <w:rPr>
+                <w:rStyle w:val="VerbatimChar"/>
+              </w:rPr>
+              <w:t xml:space="preserve">            7</w:t>
+            </w:r>
+          </w:p>
+        </w:tc>
+        <w:tc>
+          <w:p>
+            <w:pPr>
+              <w:pStyle w:val="SourceCode"/>
+              <w:jc w:val="left"/>
+            </w:pPr>
+            <w:r>
+              <w:rPr>
+                <w:rStyle w:val="VerbatimChar"/>
+              </w:rPr>
+              <w:t xml:space="preserve">   0.569</w:t>
+            </w:r>
+          </w:p>
+        </w:tc>
+        <w:tc>
+          <w:p>
+            <w:pPr>
+              <w:pStyle w:val="SourceCode"/>
+              <w:jc w:val="left"/>
+            </w:pPr>
+            <w:r>
+              <w:rPr>
+                <w:rStyle w:val="VerbatimChar"/>
+              </w:rPr>
+              <w:t xml:space="preserve">       0.451</w:t>
+            </w:r>
+          </w:p>
+        </w:tc>
+        <w:tc>
+          <w:p>
+            <w:pPr>
+              <w:pStyle w:val="SourceCode"/>
+              <w:jc w:val="left"/>
+            </w:pPr>
+            <w:r>
+              <w:rPr>
+                <w:rStyle w:val="VerbatimChar"/>
+              </w:rPr>
+              <w:t xml:space="preserve">            0.380</w:t>
+            </w:r>
+          </w:p>
+        </w:tc>
+      </w:tr>
+      <w:tr>
+        <w:tc>
+          <w:p>
+            <w:pPr>
+              <w:pStyle w:val="Compact"/>
+              <w:jc w:val="left"/>
+            </w:pPr>
+            <w:r>
+              <w:t xml:space="preserve">Antimicrobial Resistance</w:t>
+            </w:r>
+          </w:p>
+        </w:tc>
+        <w:tc>
+          <w:p>
+            <w:pPr>
+              <w:pStyle w:val="SourceCode"/>
+              <w:jc w:val="left"/>
+            </w:pPr>
+            <w:r>
+              <w:rPr>
+                <w:rStyle w:val="VerbatimChar"/>
+              </w:rPr>
+              <w:t xml:space="preserve">     1,359</w:t>
+            </w:r>
+          </w:p>
+        </w:tc>
+        <w:tc>
+          <w:p>
+            <w:pPr>
+              <w:pStyle w:val="SourceCode"/>
+              <w:jc w:val="left"/>
+            </w:pPr>
+            <w:r>
+              <w:rPr>
+                <w:rStyle w:val="VerbatimChar"/>
+              </w:rPr>
+              <w:t xml:space="preserve">      1,448</w:t>
+            </w:r>
+          </w:p>
+        </w:tc>
+        <w:tc>
+          <w:p>
+            <w:pPr>
+              <w:pStyle w:val="SourceCode"/>
+              <w:jc w:val="left"/>
+            </w:pPr>
+            <w:r>
+              <w:rPr>
+                <w:rStyle w:val="VerbatimChar"/>
+              </w:rPr>
+              <w:t xml:space="preserve">            7</w:t>
+            </w:r>
+          </w:p>
+        </w:tc>
+        <w:tc>
+          <w:p>
+            <w:pPr>
+              <w:pStyle w:val="SourceCode"/>
+              <w:jc w:val="left"/>
+            </w:pPr>
+            <w:r>
+              <w:rPr>
+                <w:rStyle w:val="VerbatimChar"/>
+              </w:rPr>
+              <w:t xml:space="preserve">   0.576</w:t>
+            </w:r>
+          </w:p>
+        </w:tc>
+        <w:tc>
+          <w:p>
+            <w:pPr>
+              <w:pStyle w:val="SourceCode"/>
+              <w:jc w:val="left"/>
+            </w:pPr>
+            <w:r>
+              <w:rPr>
+                <w:rStyle w:val="VerbatimChar"/>
+              </w:rPr>
+              <w:t xml:space="preserve">       0.533</w:t>
+            </w:r>
+          </w:p>
+        </w:tc>
+        <w:tc>
+          <w:p>
+            <w:pPr>
+              <w:pStyle w:val="SourceCode"/>
+              <w:jc w:val="left"/>
+            </w:pPr>
+            <w:r>
+              <w:rPr>
+                <w:rStyle w:val="VerbatimChar"/>
+              </w:rPr>
+              <w:t xml:space="preserve">            0.318</w:t>
+            </w:r>
+          </w:p>
+        </w:tc>
+      </w:tr>
+      <w:tr>
+        <w:tc>
+          <w:p>
+            <w:pPr>
+              <w:pStyle w:val="Compact"/>
+              <w:jc w:val="left"/>
+            </w:pPr>
+            <w:r>
+              <w:t xml:space="preserve">Online Education</w:t>
+            </w:r>
+          </w:p>
+        </w:tc>
+        <w:tc>
+          <w:p>
+            <w:pPr>
+              <w:pStyle w:val="SourceCode"/>
+              <w:jc w:val="left"/>
+            </w:pPr>
+            <w:r>
+              <w:rPr>
+                <w:rStyle w:val="VerbatimChar"/>
+              </w:rPr>
+              <w:t xml:space="preserve">     1,122</w:t>
+            </w:r>
+          </w:p>
+        </w:tc>
+        <w:tc>
+          <w:p>
+            <w:pPr>
+              <w:pStyle w:val="SourceCode"/>
+              <w:jc w:val="left"/>
+            </w:pPr>
+            <w:r>
+              <w:rPr>
+                <w:rStyle w:val="VerbatimChar"/>
+              </w:rPr>
+              <w:t xml:space="preserve">      1,065</w:t>
+            </w:r>
+          </w:p>
+        </w:tc>
+        <w:tc>
+          <w:p>
+            <w:pPr>
+              <w:pStyle w:val="SourceCode"/>
+              <w:jc w:val="left"/>
+            </w:pPr>
+            <w:r>
+              <w:rPr>
+                <w:rStyle w:val="VerbatimChar"/>
+              </w:rPr>
+              <w:t xml:space="preserve">            8</w:t>
+            </w:r>
+          </w:p>
+        </w:tc>
+        <w:tc>
+          <w:p>
+            <w:pPr>
+              <w:pStyle w:val="SourceCode"/>
+              <w:jc w:val="left"/>
+            </w:pPr>
+            <w:r>
+              <w:rPr>
+                <w:rStyle w:val="VerbatimChar"/>
+              </w:rPr>
+              <w:t xml:space="preserve">   0.594</w:t>
+            </w:r>
+          </w:p>
+        </w:tc>
+        <w:tc>
+          <w:p>
+            <w:pPr>
+              <w:pStyle w:val="SourceCode"/>
+              <w:jc w:val="left"/>
+            </w:pPr>
+            <w:r>
+              <w:rPr>
+                <w:rStyle w:val="VerbatimChar"/>
+              </w:rPr>
+              <w:t xml:space="preserve">       0.511</w:t>
+            </w:r>
+          </w:p>
+        </w:tc>
+        <w:tc>
+          <w:p>
+            <w:pPr>
+              <w:pStyle w:val="SourceCode"/>
+              <w:jc w:val="left"/>
+            </w:pPr>
+            <w:r>
+              <w:rPr>
+                <w:rStyle w:val="VerbatimChar"/>
+              </w:rPr>
+              <w:t xml:space="preserve">            0.272</w:t>
+            </w:r>
+          </w:p>
+        </w:tc>
+      </w:tr>
+      <w:tr>
+        <w:tc>
+          <w:p>
+            <w:pPr>
+              <w:pStyle w:val="Compact"/>
+              <w:jc w:val="left"/>
+            </w:pPr>
+            <w:r>
+              <w:t xml:space="preserve">Renewable Energy</w:t>
+            </w:r>
+          </w:p>
+        </w:tc>
+        <w:tc>
+          <w:p>
+            <w:pPr>
+              <w:pStyle w:val="SourceCode"/>
+              <w:jc w:val="left"/>
+            </w:pPr>
+            <w:r>
+              <w:rPr>
+                <w:rStyle w:val="VerbatimChar"/>
+              </w:rPr>
+              <w:t xml:space="preserve">       886</w:t>
+            </w:r>
+          </w:p>
+        </w:tc>
+        <w:tc>
+          <w:p>
+            <w:pPr>
+              <w:pStyle w:val="SourceCode"/>
+              <w:jc w:val="left"/>
+            </w:pPr>
+            <w:r>
+              <w:rPr>
+                <w:rStyle w:val="VerbatimChar"/>
+              </w:rPr>
+              <w:t xml:space="preserve">      1,070</w:t>
+            </w:r>
+          </w:p>
+        </w:tc>
+        <w:tc>
+          <w:p>
+            <w:pPr>
+              <w:pStyle w:val="SourceCode"/>
+              <w:jc w:val="left"/>
+            </w:pPr>
+            <w:r>
+              <w:rPr>
+                <w:rStyle w:val="VerbatimChar"/>
+              </w:rPr>
+              <w:t xml:space="preserve">           10</w:t>
+            </w:r>
+          </w:p>
+        </w:tc>
+        <w:tc>
+          <w:p>
+            <w:pPr>
+              <w:pStyle w:val="SourceCode"/>
+              <w:jc w:val="left"/>
+            </w:pPr>
+            <w:r>
+              <w:rPr>
+                <w:rStyle w:val="VerbatimChar"/>
+              </w:rPr>
+              <w:t xml:space="preserve">   0.602</w:t>
+            </w:r>
+          </w:p>
+        </w:tc>
+        <w:tc>
+          <w:p>
+            <w:pPr>
+              <w:pStyle w:val="SourceCode"/>
+              <w:jc w:val="left"/>
+            </w:pPr>
+            <w:r>
+              <w:rPr>
+                <w:rStyle w:val="VerbatimChar"/>
+              </w:rPr>
+              <w:t xml:space="preserve">       0.606</w:t>
+            </w:r>
+          </w:p>
+        </w:tc>
+        <w:tc>
+          <w:p>
+            <w:pPr>
+              <w:pStyle w:val="SourceCode"/>
+              <w:jc w:val="left"/>
+            </w:pPr>
+            <w:r>
+              <w:rPr>
+                <w:rStyle w:val="VerbatimChar"/>
+              </w:rPr>
+              <w:t xml:space="preserve">            0.200</w:t>
+            </w:r>
+          </w:p>
+        </w:tc>
+      </w:tr>
+      <w:tr>
+        <w:tc>
+          <w:p>
+            <w:pPr>
+              <w:pStyle w:val="Compact"/>
+              <w:jc w:val="left"/>
+            </w:pPr>
+            <w:r>
+              <w:t xml:space="preserve">Precision Agriculture</w:t>
+            </w:r>
+          </w:p>
+        </w:tc>
+        <w:tc>
+          <w:p>
+            <w:pPr>
+              <w:pStyle w:val="SourceCode"/>
+              <w:jc w:val="left"/>
+            </w:pPr>
+            <w:r>
+              <w:rPr>
+                <w:rStyle w:val="VerbatimChar"/>
+              </w:rPr>
+              <w:t xml:space="preserve">       451</w:t>
+            </w:r>
+          </w:p>
+        </w:tc>
+        <w:tc>
+          <w:p>
+            <w:pPr>
+              <w:pStyle w:val="SourceCode"/>
+              <w:jc w:val="left"/>
+            </w:pPr>
+            <w:r>
+              <w:rPr>
+                <w:rStyle w:val="VerbatimChar"/>
+              </w:rPr>
+              <w:t xml:space="preserve">      3,201</w:t>
+            </w:r>
+          </w:p>
+        </w:tc>
+        <w:tc>
+          <w:p>
+            <w:pPr>
+              <w:pStyle w:val="SourceCode"/>
+              <w:jc w:val="left"/>
+            </w:pPr>
+            <w:r>
+              <w:rPr>
+                <w:rStyle w:val="VerbatimChar"/>
+              </w:rPr>
+              <w:t xml:space="preserve">            9</w:t>
+            </w:r>
+          </w:p>
+        </w:tc>
+        <w:tc>
+          <w:p>
+            <w:pPr>
+              <w:pStyle w:val="SourceCode"/>
+              <w:jc w:val="left"/>
+            </w:pPr>
+            <w:r>
+              <w:rPr>
+                <w:rStyle w:val="VerbatimChar"/>
+              </w:rPr>
+              <w:t xml:space="preserve">   0.620</w:t>
+            </w:r>
+          </w:p>
+        </w:tc>
+        <w:tc>
+          <w:p>
+            <w:pPr>
+              <w:pStyle w:val="SourceCode"/>
+              <w:jc w:val="left"/>
+            </w:pPr>
+            <w:r>
+              <w:rPr>
+                <w:rStyle w:val="VerbatimChar"/>
+              </w:rPr>
+              <w:t xml:space="preserve">       0.743</w:t>
+            </w:r>
+          </w:p>
+        </w:tc>
+        <w:tc>
+          <w:p>
+            <w:pPr>
+              <w:pStyle w:val="SourceCode"/>
+              <w:jc w:val="left"/>
+            </w:pPr>
+            <w:r>
+              <w:rPr>
+                <w:rStyle w:val="VerbatimChar"/>
+              </w:rPr>
+              <w:t xml:space="preserve">            0.115</w:t>
+            </w:r>
+          </w:p>
+        </w:tc>
+      </w:tr>
+      <w:tr>
+        <w:tc>
+          <w:p>
+            <w:pPr>
+              <w:pStyle w:val="Compact"/>
+              <w:jc w:val="left"/>
+            </w:pPr>
+            <w:r>
+              <w:t xml:space="preserve">Sustainable Urban Mobility</w:t>
+            </w:r>
+          </w:p>
+        </w:tc>
+        <w:tc>
+          <w:p>
+            <w:pPr>
+              <w:pStyle w:val="SourceCode"/>
+              <w:jc w:val="left"/>
+            </w:pPr>
+            <w:r>
+              <w:rPr>
+                <w:rStyle w:val="VerbatimChar"/>
+              </w:rPr>
+              <w:t xml:space="preserve">       636</w:t>
+            </w:r>
+          </w:p>
+        </w:tc>
+        <w:tc>
+          <w:p>
+            <w:pPr>
+              <w:pStyle w:val="SourceCode"/>
+              <w:jc w:val="left"/>
+            </w:pPr>
+            <w:r>
+              <w:rPr>
+                <w:rStyle w:val="VerbatimChar"/>
+              </w:rPr>
+              <w:t xml:space="preserve">      1,631</w:t>
+            </w:r>
+          </w:p>
+        </w:tc>
+        <w:tc>
+          <w:p>
+            <w:pPr>
+              <w:pStyle w:val="SourceCode"/>
+              <w:jc w:val="left"/>
+            </w:pPr>
+            <w:r>
+              <w:rPr>
+                <w:rStyle w:val="VerbatimChar"/>
+              </w:rPr>
+              <w:t xml:space="preserve">           12</w:t>
+            </w:r>
+          </w:p>
+        </w:tc>
+        <w:tc>
+          <w:p>
+            <w:pPr>
+              <w:pStyle w:val="SourceCode"/>
+              <w:jc w:val="left"/>
+            </w:pPr>
+            <w:r>
+              <w:rPr>
+                <w:rStyle w:val="VerbatimChar"/>
+              </w:rPr>
+              <w:t xml:space="preserve">   0.640</w:t>
+            </w:r>
+          </w:p>
+        </w:tc>
+        <w:tc>
+          <w:p>
+            <w:pPr>
+              <w:pStyle w:val="SourceCode"/>
+              <w:jc w:val="left"/>
+            </w:pPr>
+            <w:r>
+              <w:rPr>
+                <w:rStyle w:val="VerbatimChar"/>
+              </w:rPr>
+              <w:t xml:space="preserve">       0.865</w:t>
+            </w:r>
+          </w:p>
+        </w:tc>
+        <w:tc>
+          <w:p>
+            <w:pPr>
+              <w:pStyle w:val="SourceCode"/>
+              <w:jc w:val="left"/>
+            </w:pPr>
+            <w:r>
+              <w:rPr>
+                <w:rStyle w:val="VerbatimChar"/>
+              </w:rPr>
+              <w:t xml:space="preserve">            0.056</w:t>
             </w:r>
           </w:p>
         </w:tc>
@@ -1344,193 +3582,10 @@
     </w:tbl>
     <w:p>
       <w:pPr>
-        <w:pStyle w:val="BodyText"/>
-      </w:pPr>
-      <w:r>
-        <w:t xml:space="preserve">The controlled replication clarifies which of the two divergences observed under Title search are attributable to search-field coverage and which are attributable to the clustering methodology itself. The spurious microbial-contamination cluster present in the Title-search result</w:t>
-      </w:r>
-      <w:r>
-        <w:t xml:space="preserve"> </w:t>
-      </w:r>
-      <w:r>
-        <w:rPr>
-          <w:bCs/>
-          <w:b/>
-        </w:rPr>
-        <w:t xml:space="preserve">disappears</w:t>
-      </w:r>
-      <w:r>
-        <w:t xml:space="preserve"> </w:t>
-      </w:r>
-      <w:r>
-        <w:t xml:space="preserve">under the controlled replication, confirming it was a coverage artifact of the looser Title query (Section 3.2) rather than a property of the clustering algorithm. The absence of a distinct cluster corresponding to the anchor’s Perspective 4 (dynamic, time-dependent, and multi-objective routing with intelligent transportation systems), however,</w:t>
-      </w:r>
-      <w:r>
-        <w:t xml:space="preserve"> </w:t>
-      </w:r>
-      <w:r>
-        <w:rPr>
-          <w:bCs/>
-          <w:b/>
-        </w:rPr>
-        <w:t xml:space="preserve">persists even on the anchor study’s own corpus</w:t>
-      </w:r>
-      <w:r>
-        <w:t xml:space="preserve">: neither the Title-search nor the Topic-search automated run isolates it as a separate community. This rules out corpus coverage as the explanation and points instead to a genuine methodological difference between the two pipelines — most plausibly the anchor study’s use of a</w:t>
-      </w:r>
-      <w:r>
-        <w:t xml:space="preserve"> </w:t>
-      </w:r>
-      <w:r>
-        <w:rPr>
-          <w:iCs/>
-          <w:i/>
-        </w:rPr>
-        <w:t xml:space="preserve">directed</w:t>
-      </w:r>
-      <w:r>
-        <w:t xml:space="preserve"> </w:t>
-      </w:r>
-      <w:r>
-        <w:t xml:space="preserve">co-citation network processed with Gephi’s modularity algorithm, versus our</w:t>
-      </w:r>
-      <w:r>
-        <w:t xml:space="preserve"> </w:t>
-      </w:r>
-      <w:r>
-        <w:rPr>
-          <w:iCs/>
-          <w:i/>
-        </w:rPr>
-        <w:t xml:space="preserve">undirected</w:t>
-      </w:r>
-      <w:r>
-        <w:t xml:space="preserve">, weight-pruned network processed with Louvain, and/or the anchor study’s use of expert judgment to designate four communities as</w:t>
-      </w:r>
-      <w:r>
-        <w:t xml:space="preserve"> </w:t>
-      </w:r>
-      <w:r>
-        <w:t xml:space="preserve">“</w:t>
-      </w:r>
-      <w:r>
-        <w:t xml:space="preserve">dominant</w:t>
-      </w:r>
-      <w:r>
-        <w:t xml:space="preserve">”</w:t>
-      </w:r>
-      <w:r>
-        <w:t xml:space="preserve"> </w:t>
-      </w:r>
-      <w:r>
-        <w:t xml:space="preserve">out of nine detected, versus our fixed 3%-of-nodes significance threshold applied uniformly across 20 fields. We report this as an honest limitation of the mechanical, threshold-based approach required for cross-field comparability (Section 6), not as a claim that Perspective 4 does not exist in the literature.</w:t>
-      </w:r>
-    </w:p>
-    <w:p>
-      <w:pPr>
-        <w:pStyle w:val="BodyText"/>
-      </w:pPr>
-      <w:r>
-        <w:t xml:space="preserve">Beyond this one confirmed gap, both automated runs recover the substantive core of all three other anchor perspectives, and both resolve the anchor’s Perspective 3 (inventory-routing integration) into multiple formally distinct operations-research problem classes that the manual study’s four-perspective aggregation grouped together — the classical Inventory Routing Problem, a production-coordinated variant, and the more strategic, multi-echelon Location-Inventory-Routing Problem. This finer granularity is a direct, mechanical consequence of our significance threshold rather than an interpretive choice, and illustrates a general property of the pipeline: it tends to resolve more, smaller, formally distinguishable sub-communities than a human analyst focusing on a small number of</w:t>
-      </w:r>
-      <w:r>
-        <w:t xml:space="preserve"> </w:t>
-      </w:r>
-      <w:r>
-        <w:t xml:space="preserve">“</w:t>
-      </w:r>
-      <w:r>
-        <w:t xml:space="preserve">dominant</w:t>
-      </w:r>
-      <w:r>
-        <w:t xml:space="preserve">”</w:t>
-      </w:r>
-      <w:r>
-        <w:t xml:space="preserve"> </w:t>
-      </w:r>
-      <w:r>
-        <w:t xml:space="preserve">perspectives would.</w:t>
-      </w:r>
-    </w:p>
-    <w:p>
-      <w:pPr>
-        <w:pStyle w:val="BodyText"/>
-      </w:pPr>
-      <w:r>
-        <w:t xml:space="preserve">Overall, the automated pipeline reproduces the structural core of the expert-driven manual analysis — the same algorithmic, cold-chain, and inventory-routing streams, at comparable or higher modularity — while surfacing a finer-grained decomposition of one perspective and missing another that the manual study’s larger, Topic-based corpus was able to isolate. We read this as evidence that the pipeline is a credible, largely faithful substitute for the labor-intensive stages of manual co-citation mapping, with corpus scope (Title vs. Topic search) as the main lever governing where the two approaches diverge.</w:t>
-      </w:r>
-    </w:p>
-    <w:p>
-      <w:pPr>
-        <w:pStyle w:val="CaptionedFigure"/>
-      </w:pPr>
-      <w:r>
-        <w:drawing>
-          <wp:inline>
-            <wp:extent cx="5334000" cy="3593084"/>
-            <wp:effectExtent b="0" l="0" r="0" t="0"/>
-            <wp:docPr descr="Co-citation network of the RVRP anchor field. Node color denotes Louvain community; node size denotes PageRank centrality; only the top-45 most central nodes per cluster and intra-cluster edges are shown for legibility." title="" id="1" name="Picture"/>
-            <a:graphic>
-              <a:graphicData uri="http://schemas.openxmlformats.org/drawingml/2006/picture">
-                <pic:pic>
-                  <pic:nvPicPr>
-                    <pic:cNvPr descr="../figuras/red_rvrp.png" id="0" name="Picture"/>
-                    <pic:cNvPicPr>
-                      <a:picLocks noChangeArrowheads="1" noChangeAspect="1"/>
-                    </pic:cNvPicPr>
-                  </pic:nvPicPr>
-                  <pic:blipFill>
-                    <a:blip r:embed="rId35"/>
-                    <a:stretch>
-                      <a:fillRect/>
-                    </a:stretch>
-                  </pic:blipFill>
-                  <pic:spPr bwMode="auto">
-                    <a:xfrm>
-                      <a:off x="0" y="0"/>
-                      <a:ext cx="5334000" cy="3593084"/>
-                    </a:xfrm>
-                    <a:prstGeom prst="rect">
-                      <a:avLst/>
-                    </a:prstGeom>
-                    <a:noFill/>
-                    <a:ln w="9525">
-                      <a:noFill/>
-                      <a:headEnd/>
-                      <a:tailEnd/>
-                    </a:ln>
-                  </pic:spPr>
-                </pic:pic>
-              </a:graphicData>
-            </a:graphic>
-          </wp:inline>
-        </w:drawing>
-      </w:r>
-    </w:p>
-    <w:p>
-      <w:pPr>
-        <w:pStyle w:val="ImageCaption"/>
-      </w:pPr>
-      <w:r>
-        <w:t xml:space="preserve">Co-citation network of the RVRP anchor field. Node color denotes Louvain community; node size denotes PageRank centrality; only the top-45 most central nodes per cluster and intra-cluster edges are shown for legibility.</w:t>
-      </w:r>
-    </w:p>
-    <w:bookmarkEnd w:id="36"/>
-    <w:bookmarkStart w:id="40" w:name="comparative-results-across-20-fields"/>
-    <w:p>
-      <w:pPr>
-        <w:pStyle w:val="Heading3"/>
-      </w:pPr>
-      <w:r>
-        <w:t xml:space="preserve">4.2 Comparative results across 20 fields</w:t>
-      </w:r>
-    </w:p>
-    <w:p>
-      <w:pPr>
         <w:pStyle w:val="FirstParagraph"/>
       </w:pPr>
       <w:r>
-        <w:t xml:space="preserve">Table 1 reports the full results. IFP ranged from 0.328 (Supply Chain Resilience) to 0.640 (Sustainable Urban Mobility), a nearly two-fold range across fields searched, networked, pruned, and clustered under identical conditions.</w:t>
+        <w:t xml:space="preserve">Figures 4 and 5 illustrate the two structural extremes: the lowest-fragmentation network (Supply Chain Resilience) and the highest-fragmentation network (Sustainable Urban Mobility).</w:t>
       </w:r>
     </w:p>
     <w:p>
@@ -1643,2053 +3698,6 @@
         <w:t xml:space="preserve">Co-citation network of Sustainable Urban Mobility, the field with the highest observed IFP (0.640).</w:t>
       </w:r>
     </w:p>
-    <w:p>
-      <w:pPr>
-        <w:pStyle w:val="BodyText"/>
-      </w:pPr>
-      <w:r>
-        <w:rPr>
-          <w:bCs/>
-          <w:b/>
-        </w:rPr>
-        <w:t xml:space="preserve">Table 1. IFP and component metrics across 20 research fields, ranked by IFP.</w:t>
-      </w:r>
-    </w:p>
-    <w:tbl>
-      <w:tblPr>
-        <w:tblStyle w:val="Table"/>
-        <w:tblW w:type="pct" w:w="5000.0"/>
-        <w:tblLook w:firstRow="1" w:lastRow="0" w:firstColumn="0" w:lastColumn="0" w:noHBand="0" w:noVBand="0" w:val="0020"/>
-      </w:tblPr>
-      <w:tblGrid>
-        <w:gridCol w:w="2146"/>
-        <w:gridCol w:w="868"/>
-        <w:gridCol w:w="919"/>
-        <w:gridCol w:w="1021"/>
-        <w:gridCol w:w="766"/>
-        <w:gridCol w:w="970"/>
-        <w:gridCol w:w="1226"/>
-      </w:tblGrid>
-      <w:tr>
-        <w:tc>
-          <w:p>
-            <w:pPr>
-              <w:pStyle w:val="Compact"/>
-              <w:jc w:val="left"/>
-            </w:pPr>
-            <w:r>
-              <w:t xml:space="preserve">Field</w:t>
-            </w:r>
-          </w:p>
-        </w:tc>
-        <w:tc>
-          <w:p>
-            <w:pPr>
-              <w:pStyle w:val="Compact"/>
-              <w:jc w:val="left"/>
-            </w:pPr>
-            <w:r>
-              <w:t xml:space="preserve">Articles (n)</w:t>
-            </w:r>
-          </w:p>
-        </w:tc>
-        <w:tc>
-          <w:p>
-            <w:pPr>
-              <w:pStyle w:val="Compact"/>
-              <w:jc w:val="left"/>
-            </w:pPr>
-            <w:r>
-              <w:t xml:space="preserve">Network nodes</w:t>
-            </w:r>
-          </w:p>
-        </w:tc>
-        <w:tc>
-          <w:p>
-            <w:pPr>
-              <w:pStyle w:val="Compact"/>
-              <w:jc w:val="left"/>
-            </w:pPr>
-            <w:r>
-              <w:t xml:space="preserve">Perspectives</w:t>
-            </w:r>
-          </w:p>
-        </w:tc>
-        <w:tc>
-          <w:p>
-            <w:pPr>
-              <w:pStyle w:val="Compact"/>
-              <w:jc w:val="left"/>
-            </w:pPr>
-            <w:r>
-              <w:t xml:space="preserve">IFP</w:t>
-            </w:r>
-          </w:p>
-        </w:tc>
-        <w:tc>
-          <w:p>
-            <w:pPr>
-              <w:pStyle w:val="Compact"/>
-              <w:jc w:val="left"/>
-            </w:pPr>
-            <w:r>
-              <w:t xml:space="preserve">Modularity (Q)</w:t>
-            </w:r>
-          </w:p>
-        </w:tc>
-        <w:tc>
-          <w:p>
-            <w:pPr>
-              <w:pStyle w:val="Compact"/>
-              <w:jc w:val="left"/>
-            </w:pPr>
-            <w:r>
-              <w:t xml:space="preserve">Inter-cluster prop.</w:t>
-            </w:r>
-          </w:p>
-        </w:tc>
-      </w:tr>
-      <w:tr>
-        <w:tc>
-          <w:p>
-            <w:pPr>
-              <w:pStyle w:val="Compact"/>
-              <w:jc w:val="left"/>
-            </w:pPr>
-            <w:r>
-              <w:t xml:space="preserve">Supply Chain Resilience</w:t>
-            </w:r>
-          </w:p>
-        </w:tc>
-        <w:tc>
-          <w:p>
-            <w:pPr>
-              <w:pStyle w:val="SourceCode"/>
-              <w:jc w:val="left"/>
-            </w:pPr>
-            <w:r>
-              <w:rPr>
-                <w:rStyle w:val="VerbatimChar"/>
-              </w:rPr>
-              <w:t xml:space="preserve">       534</w:t>
-            </w:r>
-          </w:p>
-        </w:tc>
-        <w:tc>
-          <w:p>
-            <w:pPr>
-              <w:pStyle w:val="SourceCode"/>
-              <w:jc w:val="left"/>
-            </w:pPr>
-            <w:r>
-              <w:rPr>
-                <w:rStyle w:val="VerbatimChar"/>
-              </w:rPr>
-              <w:t xml:space="preserve">      1,892</w:t>
-            </w:r>
-          </w:p>
-        </w:tc>
-        <w:tc>
-          <w:p>
-            <w:pPr>
-              <w:pStyle w:val="SourceCode"/>
-              <w:jc w:val="left"/>
-            </w:pPr>
-            <w:r>
-              <w:rPr>
-                <w:rStyle w:val="VerbatimChar"/>
-              </w:rPr>
-              <w:t xml:space="preserve">            3</w:t>
-            </w:r>
-          </w:p>
-        </w:tc>
-        <w:tc>
-          <w:p>
-            <w:pPr>
-              <w:pStyle w:val="SourceCode"/>
-              <w:jc w:val="left"/>
-            </w:pPr>
-            <w:r>
-              <w:rPr>
-                <w:rStyle w:val="VerbatimChar"/>
-              </w:rPr>
-              <w:t xml:space="preserve">   0.328</w:t>
-            </w:r>
-          </w:p>
-        </w:tc>
-        <w:tc>
-          <w:p>
-            <w:pPr>
-              <w:pStyle w:val="SourceCode"/>
-              <w:jc w:val="left"/>
-            </w:pPr>
-            <w:r>
-              <w:rPr>
-                <w:rStyle w:val="VerbatimChar"/>
-              </w:rPr>
-              <w:t xml:space="preserve">       0.297</w:t>
-            </w:r>
-          </w:p>
-        </w:tc>
-        <w:tc>
-          <w:p>
-            <w:pPr>
-              <w:pStyle w:val="SourceCode"/>
-              <w:jc w:val="left"/>
-            </w:pPr>
-            <w:r>
-              <w:rPr>
-                <w:rStyle w:val="VerbatimChar"/>
-              </w:rPr>
-              <w:t xml:space="preserve">            0.313</w:t>
-            </w:r>
-          </w:p>
-        </w:tc>
-      </w:tr>
-      <w:tr>
-        <w:tc>
-          <w:p>
-            <w:pPr>
-              <w:pStyle w:val="Compact"/>
-              <w:jc w:val="left"/>
-            </w:pPr>
-            <w:r>
-              <w:t xml:space="preserve">Research Integrity</w:t>
-            </w:r>
-          </w:p>
-        </w:tc>
-        <w:tc>
-          <w:p>
-            <w:pPr>
-              <w:pStyle w:val="SourceCode"/>
-              <w:jc w:val="left"/>
-            </w:pPr>
-            <w:r>
-              <w:rPr>
-                <w:rStyle w:val="VerbatimChar"/>
-              </w:rPr>
-              <w:t xml:space="preserve">     1,053</w:t>
-            </w:r>
-          </w:p>
-        </w:tc>
-        <w:tc>
-          <w:p>
-            <w:pPr>
-              <w:pStyle w:val="SourceCode"/>
-              <w:jc w:val="left"/>
-            </w:pPr>
-            <w:r>
-              <w:rPr>
-                <w:rStyle w:val="VerbatimChar"/>
-              </w:rPr>
-              <w:t xml:space="preserve">      1,956</w:t>
-            </w:r>
-          </w:p>
-        </w:tc>
-        <w:tc>
-          <w:p>
-            <w:pPr>
-              <w:pStyle w:val="SourceCode"/>
-              <w:jc w:val="left"/>
-            </w:pPr>
-            <w:r>
-              <w:rPr>
-                <w:rStyle w:val="VerbatimChar"/>
-              </w:rPr>
-              <w:t xml:space="preserve">            4</w:t>
-            </w:r>
-          </w:p>
-        </w:tc>
-        <w:tc>
-          <w:p>
-            <w:pPr>
-              <w:pStyle w:val="SourceCode"/>
-              <w:jc w:val="left"/>
-            </w:pPr>
-            <w:r>
-              <w:rPr>
-                <w:rStyle w:val="VerbatimChar"/>
-              </w:rPr>
-              <w:t xml:space="preserve">   0.370</w:t>
-            </w:r>
-          </w:p>
-        </w:tc>
-        <w:tc>
-          <w:p>
-            <w:pPr>
-              <w:pStyle w:val="SourceCode"/>
-              <w:jc w:val="left"/>
-            </w:pPr>
-            <w:r>
-              <w:rPr>
-                <w:rStyle w:val="VerbatimChar"/>
-              </w:rPr>
-              <w:t xml:space="preserve">       0.536</w:t>
-            </w:r>
-          </w:p>
-        </w:tc>
-        <w:tc>
-          <w:p>
-            <w:pPr>
-              <w:pStyle w:val="SourceCode"/>
-              <w:jc w:val="left"/>
-            </w:pPr>
-            <w:r>
-              <w:rPr>
-                <w:rStyle w:val="VerbatimChar"/>
-              </w:rPr>
-              <w:t xml:space="preserve">            0.075</w:t>
-            </w:r>
-          </w:p>
-        </w:tc>
-      </w:tr>
-      <w:tr>
-        <w:tc>
-          <w:p>
-            <w:pPr>
-              <w:pStyle w:val="Compact"/>
-              <w:jc w:val="left"/>
-            </w:pPr>
-            <w:r>
-              <w:t xml:space="preserve">Corporate Social Responsibility</w:t>
-            </w:r>
-          </w:p>
-        </w:tc>
-        <w:tc>
-          <w:p>
-            <w:pPr>
-              <w:pStyle w:val="SourceCode"/>
-              <w:jc w:val="left"/>
-            </w:pPr>
-            <w:r>
-              <w:rPr>
-                <w:rStyle w:val="VerbatimChar"/>
-              </w:rPr>
-              <w:t xml:space="preserve">     1,617</w:t>
-            </w:r>
-          </w:p>
-        </w:tc>
-        <w:tc>
-          <w:p>
-            <w:pPr>
-              <w:pStyle w:val="SourceCode"/>
-              <w:jc w:val="left"/>
-            </w:pPr>
-            <w:r>
-              <w:rPr>
-                <w:rStyle w:val="VerbatimChar"/>
-              </w:rPr>
-              <w:t xml:space="preserve">      2,075</w:t>
-            </w:r>
-          </w:p>
-        </w:tc>
-        <w:tc>
-          <w:p>
-            <w:pPr>
-              <w:pStyle w:val="SourceCode"/>
-              <w:jc w:val="left"/>
-            </w:pPr>
-            <w:r>
-              <w:rPr>
-                <w:rStyle w:val="VerbatimChar"/>
-              </w:rPr>
-              <w:t xml:space="preserve">            4</w:t>
-            </w:r>
-          </w:p>
-        </w:tc>
-        <w:tc>
-          <w:p>
-            <w:pPr>
-              <w:pStyle w:val="SourceCode"/>
-              <w:jc w:val="left"/>
-            </w:pPr>
-            <w:r>
-              <w:rPr>
-                <w:rStyle w:val="VerbatimChar"/>
-              </w:rPr>
-              <w:t xml:space="preserve">   0.372</w:t>
-            </w:r>
-          </w:p>
-        </w:tc>
-        <w:tc>
-          <w:p>
-            <w:pPr>
-              <w:pStyle w:val="SourceCode"/>
-              <w:jc w:val="left"/>
-            </w:pPr>
-            <w:r>
-              <w:rPr>
-                <w:rStyle w:val="VerbatimChar"/>
-              </w:rPr>
-              <w:t xml:space="preserve">       0.359</w:t>
-            </w:r>
-          </w:p>
-        </w:tc>
-        <w:tc>
-          <w:p>
-            <w:pPr>
-              <w:pStyle w:val="SourceCode"/>
-              <w:jc w:val="left"/>
-            </w:pPr>
-            <w:r>
-              <w:rPr>
-                <w:rStyle w:val="VerbatimChar"/>
-              </w:rPr>
-              <w:t xml:space="preserve">            0.256</w:t>
-            </w:r>
-          </w:p>
-        </w:tc>
-      </w:tr>
-      <w:tr>
-        <w:tc>
-          <w:p>
-            <w:pPr>
-              <w:pStyle w:val="Compact"/>
-              <w:jc w:val="left"/>
-            </w:pPr>
-            <w:r>
-              <w:t xml:space="preserve">CRISPR Gene Editing</w:t>
-            </w:r>
-          </w:p>
-        </w:tc>
-        <w:tc>
-          <w:p>
-            <w:pPr>
-              <w:pStyle w:val="SourceCode"/>
-              <w:jc w:val="left"/>
-            </w:pPr>
-            <w:r>
-              <w:rPr>
-                <w:rStyle w:val="VerbatimChar"/>
-              </w:rPr>
-              <w:t xml:space="preserve">     1,592</w:t>
-            </w:r>
-          </w:p>
-        </w:tc>
-        <w:tc>
-          <w:p>
-            <w:pPr>
-              <w:pStyle w:val="SourceCode"/>
-              <w:jc w:val="left"/>
-            </w:pPr>
-            <w:r>
-              <w:rPr>
-                <w:rStyle w:val="VerbatimChar"/>
-              </w:rPr>
-              <w:t xml:space="preserve">      2,123</w:t>
-            </w:r>
-          </w:p>
-        </w:tc>
-        <w:tc>
-          <w:p>
-            <w:pPr>
-              <w:pStyle w:val="SourceCode"/>
-              <w:jc w:val="left"/>
-            </w:pPr>
-            <w:r>
-              <w:rPr>
-                <w:rStyle w:val="VerbatimChar"/>
-              </w:rPr>
-              <w:t xml:space="preserve">            4</w:t>
-            </w:r>
-          </w:p>
-        </w:tc>
-        <w:tc>
-          <w:p>
-            <w:pPr>
-              <w:pStyle w:val="SourceCode"/>
-              <w:jc w:val="left"/>
-            </w:pPr>
-            <w:r>
-              <w:rPr>
-                <w:rStyle w:val="VerbatimChar"/>
-              </w:rPr>
-              <w:t xml:space="preserve">   0.379</w:t>
-            </w:r>
-          </w:p>
-        </w:tc>
-        <w:tc>
-          <w:p>
-            <w:pPr>
-              <w:pStyle w:val="SourceCode"/>
-              <w:jc w:val="left"/>
-            </w:pPr>
-            <w:r>
-              <w:rPr>
-                <w:rStyle w:val="VerbatimChar"/>
-              </w:rPr>
-              <w:t xml:space="preserve">       0.308</w:t>
-            </w:r>
-          </w:p>
-        </w:tc>
-        <w:tc>
-          <w:p>
-            <w:pPr>
-              <w:pStyle w:val="SourceCode"/>
-              <w:jc w:val="left"/>
-            </w:pPr>
-            <w:r>
-              <w:rPr>
-                <w:rStyle w:val="VerbatimChar"/>
-              </w:rPr>
-              <w:t xml:space="preserve">            0.330</w:t>
-            </w:r>
-          </w:p>
-        </w:tc>
-      </w:tr>
-      <w:tr>
-        <w:tc>
-          <w:p>
-            <w:pPr>
-              <w:pStyle w:val="Compact"/>
-              <w:jc w:val="left"/>
-            </w:pPr>
-            <w:r>
-              <w:t xml:space="preserve">AI Ethics</w:t>
-            </w:r>
-          </w:p>
-        </w:tc>
-        <w:tc>
-          <w:p>
-            <w:pPr>
-              <w:pStyle w:val="SourceCode"/>
-              <w:jc w:val="left"/>
-            </w:pPr>
-            <w:r>
-              <w:rPr>
-                <w:rStyle w:val="VerbatimChar"/>
-              </w:rPr>
-              <w:t xml:space="preserve">       398</w:t>
-            </w:r>
-          </w:p>
-        </w:tc>
-        <w:tc>
-          <w:p>
-            <w:pPr>
-              <w:pStyle w:val="SourceCode"/>
-              <w:jc w:val="left"/>
-            </w:pPr>
-            <w:r>
-              <w:rPr>
-                <w:rStyle w:val="VerbatimChar"/>
-              </w:rPr>
-              <w:t xml:space="preserve">      1,217</w:t>
-            </w:r>
-          </w:p>
-        </w:tc>
-        <w:tc>
-          <w:p>
-            <w:pPr>
-              <w:pStyle w:val="SourceCode"/>
-              <w:jc w:val="left"/>
-            </w:pPr>
-            <w:r>
-              <w:rPr>
-                <w:rStyle w:val="VerbatimChar"/>
-              </w:rPr>
-              <w:t xml:space="preserve">            5</w:t>
-            </w:r>
-          </w:p>
-        </w:tc>
-        <w:tc>
-          <w:p>
-            <w:pPr>
-              <w:pStyle w:val="SourceCode"/>
-              <w:jc w:val="left"/>
-            </w:pPr>
-            <w:r>
-              <w:rPr>
-                <w:rStyle w:val="VerbatimChar"/>
-              </w:rPr>
-              <w:t xml:space="preserve">   0.441</w:t>
-            </w:r>
-          </w:p>
-        </w:tc>
-        <w:tc>
-          <w:p>
-            <w:pPr>
-              <w:pStyle w:val="SourceCode"/>
-              <w:jc w:val="left"/>
-            </w:pPr>
-            <w:r>
-              <w:rPr>
-                <w:rStyle w:val="VerbatimChar"/>
-              </w:rPr>
-              <w:t xml:space="preserve">       0.572</w:t>
-            </w:r>
-          </w:p>
-        </w:tc>
-        <w:tc>
-          <w:p>
-            <w:pPr>
-              <w:pStyle w:val="SourceCode"/>
-              <w:jc w:val="left"/>
-            </w:pPr>
-            <w:r>
-              <w:rPr>
-                <w:rStyle w:val="VerbatimChar"/>
-              </w:rPr>
-              <w:t xml:space="preserve">            0.126</w:t>
-            </w:r>
-          </w:p>
-        </w:tc>
-      </w:tr>
-      <w:tr>
-        <w:tc>
-          <w:p>
-            <w:pPr>
-              <w:pStyle w:val="Compact"/>
-              <w:jc w:val="left"/>
-            </w:pPr>
-            <w:r>
-              <w:t xml:space="preserve">Circular Economy</w:t>
-            </w:r>
-          </w:p>
-        </w:tc>
-        <w:tc>
-          <w:p>
-            <w:pPr>
-              <w:pStyle w:val="SourceCode"/>
-              <w:jc w:val="left"/>
-            </w:pPr>
-            <w:r>
-              <w:rPr>
-                <w:rStyle w:val="VerbatimChar"/>
-              </w:rPr>
-              <w:t xml:space="preserve">       890</w:t>
-            </w:r>
-          </w:p>
-        </w:tc>
-        <w:tc>
-          <w:p>
-            <w:pPr>
-              <w:pStyle w:val="SourceCode"/>
-              <w:jc w:val="left"/>
-            </w:pPr>
-            <w:r>
-              <w:rPr>
-                <w:rStyle w:val="VerbatimChar"/>
-              </w:rPr>
-              <w:t xml:space="preserve">      2,105</w:t>
-            </w:r>
-          </w:p>
-        </w:tc>
-        <w:tc>
-          <w:p>
-            <w:pPr>
-              <w:pStyle w:val="SourceCode"/>
-              <w:jc w:val="left"/>
-            </w:pPr>
-            <w:r>
-              <w:rPr>
-                <w:rStyle w:val="VerbatimChar"/>
-              </w:rPr>
-              <w:t xml:space="preserve">            5</w:t>
-            </w:r>
-          </w:p>
-        </w:tc>
-        <w:tc>
-          <w:p>
-            <w:pPr>
-              <w:pStyle w:val="SourceCode"/>
-              <w:jc w:val="left"/>
-            </w:pPr>
-            <w:r>
-              <w:rPr>
-                <w:rStyle w:val="VerbatimChar"/>
-              </w:rPr>
-              <w:t xml:space="preserve">   0.450</w:t>
-            </w:r>
-          </w:p>
-        </w:tc>
-        <w:tc>
-          <w:p>
-            <w:pPr>
-              <w:pStyle w:val="SourceCode"/>
-              <w:jc w:val="left"/>
-            </w:pPr>
-            <w:r>
-              <w:rPr>
-                <w:rStyle w:val="VerbatimChar"/>
-              </w:rPr>
-              <w:t xml:space="preserve">       0.301</w:t>
-            </w:r>
-          </w:p>
-        </w:tc>
-        <w:tc>
-          <w:p>
-            <w:pPr>
-              <w:pStyle w:val="SourceCode"/>
-              <w:jc w:val="left"/>
-            </w:pPr>
-            <w:r>
-              <w:rPr>
-                <w:rStyle w:val="VerbatimChar"/>
-              </w:rPr>
-              <w:t xml:space="preserve">            0.424</w:t>
-            </w:r>
-          </w:p>
-        </w:tc>
-      </w:tr>
-      <w:tr>
-        <w:tc>
-          <w:p>
-            <w:pPr>
-              <w:pStyle w:val="Compact"/>
-              <w:jc w:val="left"/>
-            </w:pPr>
-            <w:r>
-              <w:t xml:space="preserve">Microplastics</w:t>
-            </w:r>
-          </w:p>
-        </w:tc>
-        <w:tc>
-          <w:p>
-            <w:pPr>
-              <w:pStyle w:val="SourceCode"/>
-              <w:jc w:val="left"/>
-            </w:pPr>
-            <w:r>
-              <w:rPr>
-                <w:rStyle w:val="VerbatimChar"/>
-              </w:rPr>
-              <w:t xml:space="preserve">     1,204</w:t>
-            </w:r>
-          </w:p>
-        </w:tc>
-        <w:tc>
-          <w:p>
-            <w:pPr>
-              <w:pStyle w:val="SourceCode"/>
-              <w:jc w:val="left"/>
-            </w:pPr>
-            <w:r>
-              <w:rPr>
-                <w:rStyle w:val="VerbatimChar"/>
-              </w:rPr>
-              <w:t xml:space="preserve">      2,077</w:t>
-            </w:r>
-          </w:p>
-        </w:tc>
-        <w:tc>
-          <w:p>
-            <w:pPr>
-              <w:pStyle w:val="SourceCode"/>
-              <w:jc w:val="left"/>
-            </w:pPr>
-            <w:r>
-              <w:rPr>
-                <w:rStyle w:val="VerbatimChar"/>
-              </w:rPr>
-              <w:t xml:space="preserve">            6</w:t>
-            </w:r>
-          </w:p>
-        </w:tc>
-        <w:tc>
-          <w:p>
-            <w:pPr>
-              <w:pStyle w:val="SourceCode"/>
-              <w:jc w:val="left"/>
-            </w:pPr>
-            <w:r>
-              <w:rPr>
-                <w:rStyle w:val="VerbatimChar"/>
-              </w:rPr>
-              <w:t xml:space="preserve">   0.494</w:t>
-            </w:r>
-          </w:p>
-        </w:tc>
-        <w:tc>
-          <w:p>
-            <w:pPr>
-              <w:pStyle w:val="SourceCode"/>
-              <w:jc w:val="left"/>
-            </w:pPr>
-            <w:r>
-              <w:rPr>
-                <w:rStyle w:val="VerbatimChar"/>
-              </w:rPr>
-              <w:t xml:space="preserve">       0.308</w:t>
-            </w:r>
-          </w:p>
-        </w:tc>
-        <w:tc>
-          <w:p>
-            <w:pPr>
-              <w:pStyle w:val="SourceCode"/>
-              <w:jc w:val="left"/>
-            </w:pPr>
-            <w:r>
-              <w:rPr>
-                <w:rStyle w:val="VerbatimChar"/>
-              </w:rPr>
-              <w:t xml:space="preserve">            0.422</w:t>
-            </w:r>
-          </w:p>
-        </w:tc>
-      </w:tr>
-      <w:tr>
-        <w:tc>
-          <w:p>
-            <w:pPr>
-              <w:pStyle w:val="Compact"/>
-              <w:jc w:val="left"/>
-            </w:pPr>
-            <w:r>
-              <w:t xml:space="preserve">Climate Change Adaptation</w:t>
-            </w:r>
-          </w:p>
-        </w:tc>
-        <w:tc>
-          <w:p>
-            <w:pPr>
-              <w:pStyle w:val="SourceCode"/>
-              <w:jc w:val="left"/>
-            </w:pPr>
-            <w:r>
-              <w:rPr>
-                <w:rStyle w:val="VerbatimChar"/>
-              </w:rPr>
-              <w:t xml:space="preserve">     1,019</w:t>
-            </w:r>
-          </w:p>
-        </w:tc>
-        <w:tc>
-          <w:p>
-            <w:pPr>
-              <w:pStyle w:val="SourceCode"/>
-              <w:jc w:val="left"/>
-            </w:pPr>
-            <w:r>
-              <w:rPr>
-                <w:rStyle w:val="VerbatimChar"/>
-              </w:rPr>
-              <w:t xml:space="preserve">      1,181</w:t>
-            </w:r>
-          </w:p>
-        </w:tc>
-        <w:tc>
-          <w:p>
-            <w:pPr>
-              <w:pStyle w:val="SourceCode"/>
-              <w:jc w:val="left"/>
-            </w:pPr>
-            <w:r>
-              <w:rPr>
-                <w:rStyle w:val="VerbatimChar"/>
-              </w:rPr>
-              <w:t xml:space="preserve">            6</w:t>
-            </w:r>
-          </w:p>
-        </w:tc>
-        <w:tc>
-          <w:p>
-            <w:pPr>
-              <w:pStyle w:val="SourceCode"/>
-              <w:jc w:val="left"/>
-            </w:pPr>
-            <w:r>
-              <w:rPr>
-                <w:rStyle w:val="VerbatimChar"/>
-              </w:rPr>
-              <w:t xml:space="preserve">   0.502</w:t>
-            </w:r>
-          </w:p>
-        </w:tc>
-        <w:tc>
-          <w:p>
-            <w:pPr>
-              <w:pStyle w:val="SourceCode"/>
-              <w:jc w:val="left"/>
-            </w:pPr>
-            <w:r>
-              <w:rPr>
-                <w:rStyle w:val="VerbatimChar"/>
-              </w:rPr>
-              <w:t xml:space="preserve">       0.554</w:t>
-            </w:r>
-          </w:p>
-        </w:tc>
-        <w:tc>
-          <w:p>
-            <w:pPr>
-              <w:pStyle w:val="SourceCode"/>
-              <w:jc w:val="left"/>
-            </w:pPr>
-            <w:r>
-              <w:rPr>
-                <w:rStyle w:val="VerbatimChar"/>
-              </w:rPr>
-              <w:t xml:space="preserve">            0.202</w:t>
-            </w:r>
-          </w:p>
-        </w:tc>
-      </w:tr>
-      <w:tr>
-        <w:tc>
-          <w:p>
-            <w:pPr>
-              <w:pStyle w:val="Compact"/>
-              <w:jc w:val="left"/>
-            </w:pPr>
-            <w:r>
-              <w:t xml:space="preserve">Quantum Computing</w:t>
-            </w:r>
-          </w:p>
-        </w:tc>
-        <w:tc>
-          <w:p>
-            <w:pPr>
-              <w:pStyle w:val="SourceCode"/>
-              <w:jc w:val="left"/>
-            </w:pPr>
-            <w:r>
-              <w:rPr>
-                <w:rStyle w:val="VerbatimChar"/>
-              </w:rPr>
-              <w:t xml:space="preserve">       412</w:t>
-            </w:r>
-          </w:p>
-        </w:tc>
-        <w:tc>
-          <w:p>
-            <w:pPr>
-              <w:pStyle w:val="SourceCode"/>
-              <w:jc w:val="left"/>
-            </w:pPr>
-            <w:r>
-              <w:rPr>
-                <w:rStyle w:val="VerbatimChar"/>
-              </w:rPr>
-              <w:t xml:space="preserve">      2,519</w:t>
-            </w:r>
-          </w:p>
-        </w:tc>
-        <w:tc>
-          <w:p>
-            <w:pPr>
-              <w:pStyle w:val="SourceCode"/>
-              <w:jc w:val="left"/>
-            </w:pPr>
-            <w:r>
-              <w:rPr>
-                <w:rStyle w:val="VerbatimChar"/>
-              </w:rPr>
-              <w:t xml:space="preserve">            6</w:t>
-            </w:r>
-          </w:p>
-        </w:tc>
-        <w:tc>
-          <w:p>
-            <w:pPr>
-              <w:pStyle w:val="SourceCode"/>
-              <w:jc w:val="left"/>
-            </w:pPr>
-            <w:r>
-              <w:rPr>
-                <w:rStyle w:val="VerbatimChar"/>
-              </w:rPr>
-              <w:t xml:space="preserve">   0.511</w:t>
-            </w:r>
-          </w:p>
-        </w:tc>
-        <w:tc>
-          <w:p>
-            <w:pPr>
-              <w:pStyle w:val="SourceCode"/>
-              <w:jc w:val="left"/>
-            </w:pPr>
-            <w:r>
-              <w:rPr>
-                <w:rStyle w:val="VerbatimChar"/>
-              </w:rPr>
-              <w:t xml:space="preserve">       0.396</w:t>
-            </w:r>
-          </w:p>
-        </w:tc>
-        <w:tc>
-          <w:p>
-            <w:pPr>
-              <w:pStyle w:val="SourceCode"/>
-              <w:jc w:val="left"/>
-            </w:pPr>
-            <w:r>
-              <w:rPr>
-                <w:rStyle w:val="VerbatimChar"/>
-              </w:rPr>
-              <w:t xml:space="preserve">            0.385</w:t>
-            </w:r>
-          </w:p>
-        </w:tc>
-      </w:tr>
-      <w:tr>
-        <w:tc>
-          <w:p>
-            <w:pPr>
-              <w:pStyle w:val="Compact"/>
-              <w:jc w:val="left"/>
-            </w:pPr>
-            <w:r>
-              <w:t xml:space="preserve">Deep Learning (medical applications)</w:t>
-            </w:r>
-          </w:p>
-        </w:tc>
-        <w:tc>
-          <w:p>
-            <w:pPr>
-              <w:pStyle w:val="SourceCode"/>
-              <w:jc w:val="left"/>
-            </w:pPr>
-            <w:r>
-              <w:rPr>
-                <w:rStyle w:val="VerbatimChar"/>
-              </w:rPr>
-              <w:t xml:space="preserve">       702</w:t>
-            </w:r>
-          </w:p>
-        </w:tc>
-        <w:tc>
-          <w:p>
-            <w:pPr>
-              <w:pStyle w:val="SourceCode"/>
-              <w:jc w:val="left"/>
-            </w:pPr>
-            <w:r>
-              <w:rPr>
-                <w:rStyle w:val="VerbatimChar"/>
-              </w:rPr>
-              <w:t xml:space="preserve">        823</w:t>
-            </w:r>
-          </w:p>
-        </w:tc>
-        <w:tc>
-          <w:p>
-            <w:pPr>
-              <w:pStyle w:val="SourceCode"/>
-              <w:jc w:val="left"/>
-            </w:pPr>
-            <w:r>
-              <w:rPr>
-                <w:rStyle w:val="VerbatimChar"/>
-              </w:rPr>
-              <w:t xml:space="preserve">            6</w:t>
-            </w:r>
-          </w:p>
-        </w:tc>
-        <w:tc>
-          <w:p>
-            <w:pPr>
-              <w:pStyle w:val="SourceCode"/>
-              <w:jc w:val="left"/>
-            </w:pPr>
-            <w:r>
-              <w:rPr>
-                <w:rStyle w:val="VerbatimChar"/>
-              </w:rPr>
-              <w:t xml:space="preserve">   0.519</w:t>
-            </w:r>
-          </w:p>
-        </w:tc>
-        <w:tc>
-          <w:p>
-            <w:pPr>
-              <w:pStyle w:val="SourceCode"/>
-              <w:jc w:val="left"/>
-            </w:pPr>
-            <w:r>
-              <w:rPr>
-                <w:rStyle w:val="VerbatimChar"/>
-              </w:rPr>
-              <w:t xml:space="preserve">       0.708</w:t>
-            </w:r>
-          </w:p>
-        </w:tc>
-        <w:tc>
-          <w:p>
-            <w:pPr>
-              <w:pStyle w:val="SourceCode"/>
-              <w:jc w:val="left"/>
-            </w:pPr>
-            <w:r>
-              <w:rPr>
-                <w:rStyle w:val="VerbatimChar"/>
-              </w:rPr>
-              <w:t xml:space="preserve">            0.098</w:t>
-            </w:r>
-          </w:p>
-        </w:tc>
-      </w:tr>
-      <w:tr>
-        <w:tc>
-          <w:p>
-            <w:pPr>
-              <w:pStyle w:val="Compact"/>
-              <w:jc w:val="left"/>
-            </w:pPr>
-            <w:r>
-              <w:t xml:space="preserve">RVRP (validation anchor)</w:t>
-            </w:r>
-          </w:p>
-        </w:tc>
-        <w:tc>
-          <w:p>
-            <w:pPr>
-              <w:pStyle w:val="SourceCode"/>
-              <w:jc w:val="left"/>
-            </w:pPr>
-            <w:r>
-              <w:rPr>
-                <w:rStyle w:val="VerbatimChar"/>
-              </w:rPr>
-              <w:t xml:space="preserve">       393</w:t>
-            </w:r>
-          </w:p>
-        </w:tc>
-        <w:tc>
-          <w:p>
-            <w:pPr>
-              <w:pStyle w:val="SourceCode"/>
-              <w:jc w:val="left"/>
-            </w:pPr>
-            <w:r>
-              <w:rPr>
-                <w:rStyle w:val="VerbatimChar"/>
-              </w:rPr>
-              <w:t xml:space="preserve">      1,630</w:t>
-            </w:r>
-          </w:p>
-        </w:tc>
-        <w:tc>
-          <w:p>
-            <w:pPr>
-              <w:pStyle w:val="SourceCode"/>
-              <w:jc w:val="left"/>
-            </w:pPr>
-            <w:r>
-              <w:rPr>
-                <w:rStyle w:val="VerbatimChar"/>
-              </w:rPr>
-              <w:t xml:space="preserve">            6</w:t>
-            </w:r>
-          </w:p>
-        </w:tc>
-        <w:tc>
-          <w:p>
-            <w:pPr>
-              <w:pStyle w:val="SourceCode"/>
-              <w:jc w:val="left"/>
-            </w:pPr>
-            <w:r>
-              <w:rPr>
-                <w:rStyle w:val="VerbatimChar"/>
-              </w:rPr>
-              <w:t xml:space="preserve">   0.526</w:t>
-            </w:r>
-          </w:p>
-        </w:tc>
-        <w:tc>
-          <w:p>
-            <w:pPr>
-              <w:pStyle w:val="SourceCode"/>
-              <w:jc w:val="left"/>
-            </w:pPr>
-            <w:r>
-              <w:rPr>
-                <w:rStyle w:val="VerbatimChar"/>
-              </w:rPr>
-              <w:t xml:space="preserve">       0.613</w:t>
-            </w:r>
-          </w:p>
-        </w:tc>
-        <w:tc>
-          <w:p>
-            <w:pPr>
-              <w:pStyle w:val="SourceCode"/>
-              <w:jc w:val="left"/>
-            </w:pPr>
-            <w:r>
-              <w:rPr>
-                <w:rStyle w:val="VerbatimChar"/>
-              </w:rPr>
-              <w:t xml:space="preserve">            0.216</w:t>
-            </w:r>
-          </w:p>
-        </w:tc>
-      </w:tr>
-      <w:tr>
-        <w:tc>
-          <w:p>
-            <w:pPr>
-              <w:pStyle w:val="Compact"/>
-              <w:jc w:val="left"/>
-            </w:pPr>
-            <w:r>
-              <w:t xml:space="preserve">Adolescent Mental Health</w:t>
-            </w:r>
-          </w:p>
-        </w:tc>
-        <w:tc>
-          <w:p>
-            <w:pPr>
-              <w:pStyle w:val="SourceCode"/>
-              <w:jc w:val="left"/>
-            </w:pPr>
-            <w:r>
-              <w:rPr>
-                <w:rStyle w:val="VerbatimChar"/>
-              </w:rPr>
-              <w:t xml:space="preserve">     1,319</w:t>
-            </w:r>
-          </w:p>
-        </w:tc>
-        <w:tc>
-          <w:p>
-            <w:pPr>
-              <w:pStyle w:val="SourceCode"/>
-              <w:jc w:val="left"/>
-            </w:pPr>
-            <w:r>
-              <w:rPr>
-                <w:rStyle w:val="VerbatimChar"/>
-              </w:rPr>
-              <w:t xml:space="preserve">      1,376</w:t>
-            </w:r>
-          </w:p>
-        </w:tc>
-        <w:tc>
-          <w:p>
-            <w:pPr>
-              <w:pStyle w:val="SourceCode"/>
-              <w:jc w:val="left"/>
-            </w:pPr>
-            <w:r>
-              <w:rPr>
-                <w:rStyle w:val="VerbatimChar"/>
-              </w:rPr>
-              <w:t xml:space="preserve">            7</w:t>
-            </w:r>
-          </w:p>
-        </w:tc>
-        <w:tc>
-          <w:p>
-            <w:pPr>
-              <w:pStyle w:val="SourceCode"/>
-              <w:jc w:val="left"/>
-            </w:pPr>
-            <w:r>
-              <w:rPr>
-                <w:rStyle w:val="VerbatimChar"/>
-              </w:rPr>
-              <w:t xml:space="preserve">   0.544</w:t>
-            </w:r>
-          </w:p>
-        </w:tc>
-        <w:tc>
-          <w:p>
-            <w:pPr>
-              <w:pStyle w:val="SourceCode"/>
-              <w:jc w:val="left"/>
-            </w:pPr>
-            <w:r>
-              <w:rPr>
-                <w:rStyle w:val="VerbatimChar"/>
-              </w:rPr>
-              <w:t xml:space="preserve">       0.457</w:t>
-            </w:r>
-          </w:p>
-        </w:tc>
-        <w:tc>
-          <w:p>
-            <w:pPr>
-              <w:pStyle w:val="SourceCode"/>
-              <w:jc w:val="left"/>
-            </w:pPr>
-            <w:r>
-              <w:rPr>
-                <w:rStyle w:val="VerbatimChar"/>
-              </w:rPr>
-              <w:t xml:space="preserve">            0.300</w:t>
-            </w:r>
-          </w:p>
-        </w:tc>
-      </w:tr>
-      <w:tr>
-        <w:tc>
-          <w:p>
-            <w:pPr>
-              <w:pStyle w:val="Compact"/>
-              <w:jc w:val="left"/>
-            </w:pPr>
-            <w:r>
-              <w:t xml:space="preserve">COVID-19 Vaccine Hesitancy</w:t>
-            </w:r>
-          </w:p>
-        </w:tc>
-        <w:tc>
-          <w:p>
-            <w:pPr>
-              <w:pStyle w:val="SourceCode"/>
-              <w:jc w:val="left"/>
-            </w:pPr>
-            <w:r>
-              <w:rPr>
-                <w:rStyle w:val="VerbatimChar"/>
-              </w:rPr>
-              <w:t xml:space="preserve">     1,809</w:t>
-            </w:r>
-          </w:p>
-        </w:tc>
-        <w:tc>
-          <w:p>
-            <w:pPr>
-              <w:pStyle w:val="SourceCode"/>
-              <w:jc w:val="left"/>
-            </w:pPr>
-            <w:r>
-              <w:rPr>
-                <w:rStyle w:val="VerbatimChar"/>
-              </w:rPr>
-              <w:t xml:space="preserve">      2,389</w:t>
-            </w:r>
-          </w:p>
-        </w:tc>
-        <w:tc>
-          <w:p>
-            <w:pPr>
-              <w:pStyle w:val="SourceCode"/>
-              <w:jc w:val="left"/>
-            </w:pPr>
-            <w:r>
-              <w:rPr>
-                <w:rStyle w:val="VerbatimChar"/>
-              </w:rPr>
-              <w:t xml:space="preserve">            7</w:t>
-            </w:r>
-          </w:p>
-        </w:tc>
-        <w:tc>
-          <w:p>
-            <w:pPr>
-              <w:pStyle w:val="SourceCode"/>
-              <w:jc w:val="left"/>
-            </w:pPr>
-            <w:r>
-              <w:rPr>
-                <w:rStyle w:val="VerbatimChar"/>
-              </w:rPr>
-              <w:t xml:space="preserve">   0.550</w:t>
-            </w:r>
-          </w:p>
-        </w:tc>
-        <w:tc>
-          <w:p>
-            <w:pPr>
-              <w:pStyle w:val="SourceCode"/>
-              <w:jc w:val="left"/>
-            </w:pPr>
-            <w:r>
-              <w:rPr>
-                <w:rStyle w:val="VerbatimChar"/>
-              </w:rPr>
-              <w:t xml:space="preserve">       0.232</w:t>
-            </w:r>
-          </w:p>
-        </w:tc>
-        <w:tc>
-          <w:p>
-            <w:pPr>
-              <w:pStyle w:val="SourceCode"/>
-              <w:jc w:val="left"/>
-            </w:pPr>
-            <w:r>
-              <w:rPr>
-                <w:rStyle w:val="VerbatimChar"/>
-              </w:rPr>
-              <w:t xml:space="preserve">            0.543</w:t>
-            </w:r>
-          </w:p>
-        </w:tc>
-      </w:tr>
-      <w:tr>
-        <w:tc>
-          <w:p>
-            <w:pPr>
-              <w:pStyle w:val="Compact"/>
-              <w:jc w:val="left"/>
-            </w:pPr>
-            <w:r>
-              <w:t xml:space="preserve">Blockchain in Finance and Supply Chain</w:t>
-            </w:r>
-          </w:p>
-        </w:tc>
-        <w:tc>
-          <w:p>
-            <w:pPr>
-              <w:pStyle w:val="SourceCode"/>
-              <w:jc w:val="left"/>
-            </w:pPr>
-            <w:r>
-              <w:rPr>
-                <w:rStyle w:val="VerbatimChar"/>
-              </w:rPr>
-              <w:t xml:space="preserve">       318</w:t>
-            </w:r>
-          </w:p>
-        </w:tc>
-        <w:tc>
-          <w:p>
-            <w:pPr>
-              <w:pStyle w:val="SourceCode"/>
-              <w:jc w:val="left"/>
-            </w:pPr>
-            <w:r>
-              <w:rPr>
-                <w:rStyle w:val="VerbatimChar"/>
-              </w:rPr>
-              <w:t xml:space="preserve">      1,499</w:t>
-            </w:r>
-          </w:p>
-        </w:tc>
-        <w:tc>
-          <w:p>
-            <w:pPr>
-              <w:pStyle w:val="SourceCode"/>
-              <w:jc w:val="left"/>
-            </w:pPr>
-            <w:r>
-              <w:rPr>
-                <w:rStyle w:val="VerbatimChar"/>
-              </w:rPr>
-              <w:t xml:space="preserve">            7</w:t>
-            </w:r>
-          </w:p>
-        </w:tc>
-        <w:tc>
-          <w:p>
-            <w:pPr>
-              <w:pStyle w:val="SourceCode"/>
-              <w:jc w:val="left"/>
-            </w:pPr>
-            <w:r>
-              <w:rPr>
-                <w:rStyle w:val="VerbatimChar"/>
-              </w:rPr>
-              <w:t xml:space="preserve">   0.568</w:t>
-            </w:r>
-          </w:p>
-        </w:tc>
-        <w:tc>
-          <w:p>
-            <w:pPr>
-              <w:pStyle w:val="SourceCode"/>
-              <w:jc w:val="left"/>
-            </w:pPr>
-            <w:r>
-              <w:rPr>
-                <w:rStyle w:val="VerbatimChar"/>
-              </w:rPr>
-              <w:t xml:space="preserve">       0.549</w:t>
-            </w:r>
-          </w:p>
-        </w:tc>
-        <w:tc>
-          <w:p>
-            <w:pPr>
-              <w:pStyle w:val="SourceCode"/>
-              <w:jc w:val="left"/>
-            </w:pPr>
-            <w:r>
-              <w:rPr>
-                <w:rStyle w:val="VerbatimChar"/>
-              </w:rPr>
-              <w:t xml:space="preserve">            0.281</w:t>
-            </w:r>
-          </w:p>
-        </w:tc>
-      </w:tr>
-      <w:tr>
-        <w:tc>
-          <w:p>
-            <w:pPr>
-              <w:pStyle w:val="Compact"/>
-              <w:jc w:val="left"/>
-            </w:pPr>
-            <w:r>
-              <w:t xml:space="preserve">Financial Literacy</w:t>
-            </w:r>
-          </w:p>
-        </w:tc>
-        <w:tc>
-          <w:p>
-            <w:pPr>
-              <w:pStyle w:val="SourceCode"/>
-              <w:jc w:val="left"/>
-            </w:pPr>
-            <w:r>
-              <w:rPr>
-                <w:rStyle w:val="VerbatimChar"/>
-              </w:rPr>
-              <w:t xml:space="preserve">       310</w:t>
-            </w:r>
-          </w:p>
-        </w:tc>
-        <w:tc>
-          <w:p>
-            <w:pPr>
-              <w:pStyle w:val="SourceCode"/>
-              <w:jc w:val="left"/>
-            </w:pPr>
-            <w:r>
-              <w:rPr>
-                <w:rStyle w:val="VerbatimChar"/>
-              </w:rPr>
-              <w:t xml:space="preserve">      1,962</w:t>
-            </w:r>
-          </w:p>
-        </w:tc>
-        <w:tc>
-          <w:p>
-            <w:pPr>
-              <w:pStyle w:val="SourceCode"/>
-              <w:jc w:val="left"/>
-            </w:pPr>
-            <w:r>
-              <w:rPr>
-                <w:rStyle w:val="VerbatimChar"/>
-              </w:rPr>
-              <w:t xml:space="preserve">            7</w:t>
-            </w:r>
-          </w:p>
-        </w:tc>
-        <w:tc>
-          <w:p>
-            <w:pPr>
-              <w:pStyle w:val="SourceCode"/>
-              <w:jc w:val="left"/>
-            </w:pPr>
-            <w:r>
-              <w:rPr>
-                <w:rStyle w:val="VerbatimChar"/>
-              </w:rPr>
-              <w:t xml:space="preserve">   0.569</w:t>
-            </w:r>
-          </w:p>
-        </w:tc>
-        <w:tc>
-          <w:p>
-            <w:pPr>
-              <w:pStyle w:val="SourceCode"/>
-              <w:jc w:val="left"/>
-            </w:pPr>
-            <w:r>
-              <w:rPr>
-                <w:rStyle w:val="VerbatimChar"/>
-              </w:rPr>
-              <w:t xml:space="preserve">       0.451</w:t>
-            </w:r>
-          </w:p>
-        </w:tc>
-        <w:tc>
-          <w:p>
-            <w:pPr>
-              <w:pStyle w:val="SourceCode"/>
-              <w:jc w:val="left"/>
-            </w:pPr>
-            <w:r>
-              <w:rPr>
-                <w:rStyle w:val="VerbatimChar"/>
-              </w:rPr>
-              <w:t xml:space="preserve">            0.380</w:t>
-            </w:r>
-          </w:p>
-        </w:tc>
-      </w:tr>
-      <w:tr>
-        <w:tc>
-          <w:p>
-            <w:pPr>
-              <w:pStyle w:val="Compact"/>
-              <w:jc w:val="left"/>
-            </w:pPr>
-            <w:r>
-              <w:t xml:space="preserve">Antimicrobial Resistance</w:t>
-            </w:r>
-          </w:p>
-        </w:tc>
-        <w:tc>
-          <w:p>
-            <w:pPr>
-              <w:pStyle w:val="SourceCode"/>
-              <w:jc w:val="left"/>
-            </w:pPr>
-            <w:r>
-              <w:rPr>
-                <w:rStyle w:val="VerbatimChar"/>
-              </w:rPr>
-              <w:t xml:space="preserve">     1,359</w:t>
-            </w:r>
-          </w:p>
-        </w:tc>
-        <w:tc>
-          <w:p>
-            <w:pPr>
-              <w:pStyle w:val="SourceCode"/>
-              <w:jc w:val="left"/>
-            </w:pPr>
-            <w:r>
-              <w:rPr>
-                <w:rStyle w:val="VerbatimChar"/>
-              </w:rPr>
-              <w:t xml:space="preserve">      1,448</w:t>
-            </w:r>
-          </w:p>
-        </w:tc>
-        <w:tc>
-          <w:p>
-            <w:pPr>
-              <w:pStyle w:val="SourceCode"/>
-              <w:jc w:val="left"/>
-            </w:pPr>
-            <w:r>
-              <w:rPr>
-                <w:rStyle w:val="VerbatimChar"/>
-              </w:rPr>
-              <w:t xml:space="preserve">            7</w:t>
-            </w:r>
-          </w:p>
-        </w:tc>
-        <w:tc>
-          <w:p>
-            <w:pPr>
-              <w:pStyle w:val="SourceCode"/>
-              <w:jc w:val="left"/>
-            </w:pPr>
-            <w:r>
-              <w:rPr>
-                <w:rStyle w:val="VerbatimChar"/>
-              </w:rPr>
-              <w:t xml:space="preserve">   0.576</w:t>
-            </w:r>
-          </w:p>
-        </w:tc>
-        <w:tc>
-          <w:p>
-            <w:pPr>
-              <w:pStyle w:val="SourceCode"/>
-              <w:jc w:val="left"/>
-            </w:pPr>
-            <w:r>
-              <w:rPr>
-                <w:rStyle w:val="VerbatimChar"/>
-              </w:rPr>
-              <w:t xml:space="preserve">       0.533</w:t>
-            </w:r>
-          </w:p>
-        </w:tc>
-        <w:tc>
-          <w:p>
-            <w:pPr>
-              <w:pStyle w:val="SourceCode"/>
-              <w:jc w:val="left"/>
-            </w:pPr>
-            <w:r>
-              <w:rPr>
-                <w:rStyle w:val="VerbatimChar"/>
-              </w:rPr>
-              <w:t xml:space="preserve">            0.318</w:t>
-            </w:r>
-          </w:p>
-        </w:tc>
-      </w:tr>
-      <w:tr>
-        <w:tc>
-          <w:p>
-            <w:pPr>
-              <w:pStyle w:val="Compact"/>
-              <w:jc w:val="left"/>
-            </w:pPr>
-            <w:r>
-              <w:t xml:space="preserve">Online Education</w:t>
-            </w:r>
-          </w:p>
-        </w:tc>
-        <w:tc>
-          <w:p>
-            <w:pPr>
-              <w:pStyle w:val="SourceCode"/>
-              <w:jc w:val="left"/>
-            </w:pPr>
-            <w:r>
-              <w:rPr>
-                <w:rStyle w:val="VerbatimChar"/>
-              </w:rPr>
-              <w:t xml:space="preserve">     1,122</w:t>
-            </w:r>
-          </w:p>
-        </w:tc>
-        <w:tc>
-          <w:p>
-            <w:pPr>
-              <w:pStyle w:val="SourceCode"/>
-              <w:jc w:val="left"/>
-            </w:pPr>
-            <w:r>
-              <w:rPr>
-                <w:rStyle w:val="VerbatimChar"/>
-              </w:rPr>
-              <w:t xml:space="preserve">      1,065</w:t>
-            </w:r>
-          </w:p>
-        </w:tc>
-        <w:tc>
-          <w:p>
-            <w:pPr>
-              <w:pStyle w:val="SourceCode"/>
-              <w:jc w:val="left"/>
-            </w:pPr>
-            <w:r>
-              <w:rPr>
-                <w:rStyle w:val="VerbatimChar"/>
-              </w:rPr>
-              <w:t xml:space="preserve">            8</w:t>
-            </w:r>
-          </w:p>
-        </w:tc>
-        <w:tc>
-          <w:p>
-            <w:pPr>
-              <w:pStyle w:val="SourceCode"/>
-              <w:jc w:val="left"/>
-            </w:pPr>
-            <w:r>
-              <w:rPr>
-                <w:rStyle w:val="VerbatimChar"/>
-              </w:rPr>
-              <w:t xml:space="preserve">   0.594</w:t>
-            </w:r>
-          </w:p>
-        </w:tc>
-        <w:tc>
-          <w:p>
-            <w:pPr>
-              <w:pStyle w:val="SourceCode"/>
-              <w:jc w:val="left"/>
-            </w:pPr>
-            <w:r>
-              <w:rPr>
-                <w:rStyle w:val="VerbatimChar"/>
-              </w:rPr>
-              <w:t xml:space="preserve">       0.511</w:t>
-            </w:r>
-          </w:p>
-        </w:tc>
-        <w:tc>
-          <w:p>
-            <w:pPr>
-              <w:pStyle w:val="SourceCode"/>
-              <w:jc w:val="left"/>
-            </w:pPr>
-            <w:r>
-              <w:rPr>
-                <w:rStyle w:val="VerbatimChar"/>
-              </w:rPr>
-              <w:t xml:space="preserve">            0.272</w:t>
-            </w:r>
-          </w:p>
-        </w:tc>
-      </w:tr>
-      <w:tr>
-        <w:tc>
-          <w:p>
-            <w:pPr>
-              <w:pStyle w:val="Compact"/>
-              <w:jc w:val="left"/>
-            </w:pPr>
-            <w:r>
-              <w:t xml:space="preserve">Renewable Energy</w:t>
-            </w:r>
-          </w:p>
-        </w:tc>
-        <w:tc>
-          <w:p>
-            <w:pPr>
-              <w:pStyle w:val="SourceCode"/>
-              <w:jc w:val="left"/>
-            </w:pPr>
-            <w:r>
-              <w:rPr>
-                <w:rStyle w:val="VerbatimChar"/>
-              </w:rPr>
-              <w:t xml:space="preserve">       886</w:t>
-            </w:r>
-          </w:p>
-        </w:tc>
-        <w:tc>
-          <w:p>
-            <w:pPr>
-              <w:pStyle w:val="SourceCode"/>
-              <w:jc w:val="left"/>
-            </w:pPr>
-            <w:r>
-              <w:rPr>
-                <w:rStyle w:val="VerbatimChar"/>
-              </w:rPr>
-              <w:t xml:space="preserve">      1,070</w:t>
-            </w:r>
-          </w:p>
-        </w:tc>
-        <w:tc>
-          <w:p>
-            <w:pPr>
-              <w:pStyle w:val="SourceCode"/>
-              <w:jc w:val="left"/>
-            </w:pPr>
-            <w:r>
-              <w:rPr>
-                <w:rStyle w:val="VerbatimChar"/>
-              </w:rPr>
-              <w:t xml:space="preserve">           10</w:t>
-            </w:r>
-          </w:p>
-        </w:tc>
-        <w:tc>
-          <w:p>
-            <w:pPr>
-              <w:pStyle w:val="SourceCode"/>
-              <w:jc w:val="left"/>
-            </w:pPr>
-            <w:r>
-              <w:rPr>
-                <w:rStyle w:val="VerbatimChar"/>
-              </w:rPr>
-              <w:t xml:space="preserve">   0.602</w:t>
-            </w:r>
-          </w:p>
-        </w:tc>
-        <w:tc>
-          <w:p>
-            <w:pPr>
-              <w:pStyle w:val="SourceCode"/>
-              <w:jc w:val="left"/>
-            </w:pPr>
-            <w:r>
-              <w:rPr>
-                <w:rStyle w:val="VerbatimChar"/>
-              </w:rPr>
-              <w:t xml:space="preserve">       0.606</w:t>
-            </w:r>
-          </w:p>
-        </w:tc>
-        <w:tc>
-          <w:p>
-            <w:pPr>
-              <w:pStyle w:val="SourceCode"/>
-              <w:jc w:val="left"/>
-            </w:pPr>
-            <w:r>
-              <w:rPr>
-                <w:rStyle w:val="VerbatimChar"/>
-              </w:rPr>
-              <w:t xml:space="preserve">            0.200</w:t>
-            </w:r>
-          </w:p>
-        </w:tc>
-      </w:tr>
-      <w:tr>
-        <w:tc>
-          <w:p>
-            <w:pPr>
-              <w:pStyle w:val="Compact"/>
-              <w:jc w:val="left"/>
-            </w:pPr>
-            <w:r>
-              <w:t xml:space="preserve">Precision Agriculture</w:t>
-            </w:r>
-          </w:p>
-        </w:tc>
-        <w:tc>
-          <w:p>
-            <w:pPr>
-              <w:pStyle w:val="SourceCode"/>
-              <w:jc w:val="left"/>
-            </w:pPr>
-            <w:r>
-              <w:rPr>
-                <w:rStyle w:val="VerbatimChar"/>
-              </w:rPr>
-              <w:t xml:space="preserve">       451</w:t>
-            </w:r>
-          </w:p>
-        </w:tc>
-        <w:tc>
-          <w:p>
-            <w:pPr>
-              <w:pStyle w:val="SourceCode"/>
-              <w:jc w:val="left"/>
-            </w:pPr>
-            <w:r>
-              <w:rPr>
-                <w:rStyle w:val="VerbatimChar"/>
-              </w:rPr>
-              <w:t xml:space="preserve">      3,201</w:t>
-            </w:r>
-          </w:p>
-        </w:tc>
-        <w:tc>
-          <w:p>
-            <w:pPr>
-              <w:pStyle w:val="SourceCode"/>
-              <w:jc w:val="left"/>
-            </w:pPr>
-            <w:r>
-              <w:rPr>
-                <w:rStyle w:val="VerbatimChar"/>
-              </w:rPr>
-              <w:t xml:space="preserve">            9</w:t>
-            </w:r>
-          </w:p>
-        </w:tc>
-        <w:tc>
-          <w:p>
-            <w:pPr>
-              <w:pStyle w:val="SourceCode"/>
-              <w:jc w:val="left"/>
-            </w:pPr>
-            <w:r>
-              <w:rPr>
-                <w:rStyle w:val="VerbatimChar"/>
-              </w:rPr>
-              <w:t xml:space="preserve">   0.620</w:t>
-            </w:r>
-          </w:p>
-        </w:tc>
-        <w:tc>
-          <w:p>
-            <w:pPr>
-              <w:pStyle w:val="SourceCode"/>
-              <w:jc w:val="left"/>
-            </w:pPr>
-            <w:r>
-              <w:rPr>
-                <w:rStyle w:val="VerbatimChar"/>
-              </w:rPr>
-              <w:t xml:space="preserve">       0.743</w:t>
-            </w:r>
-          </w:p>
-        </w:tc>
-        <w:tc>
-          <w:p>
-            <w:pPr>
-              <w:pStyle w:val="SourceCode"/>
-              <w:jc w:val="left"/>
-            </w:pPr>
-            <w:r>
-              <w:rPr>
-                <w:rStyle w:val="VerbatimChar"/>
-              </w:rPr>
-              <w:t xml:space="preserve">            0.115</w:t>
-            </w:r>
-          </w:p>
-        </w:tc>
-      </w:tr>
-      <w:tr>
-        <w:tc>
-          <w:p>
-            <w:pPr>
-              <w:pStyle w:val="Compact"/>
-              <w:jc w:val="left"/>
-            </w:pPr>
-            <w:r>
-              <w:t xml:space="preserve">Sustainable Urban Mobility</w:t>
-            </w:r>
-          </w:p>
-        </w:tc>
-        <w:tc>
-          <w:p>
-            <w:pPr>
-              <w:pStyle w:val="SourceCode"/>
-              <w:jc w:val="left"/>
-            </w:pPr>
-            <w:r>
-              <w:rPr>
-                <w:rStyle w:val="VerbatimChar"/>
-              </w:rPr>
-              <w:t xml:space="preserve">       636</w:t>
-            </w:r>
-          </w:p>
-        </w:tc>
-        <w:tc>
-          <w:p>
-            <w:pPr>
-              <w:pStyle w:val="SourceCode"/>
-              <w:jc w:val="left"/>
-            </w:pPr>
-            <w:r>
-              <w:rPr>
-                <w:rStyle w:val="VerbatimChar"/>
-              </w:rPr>
-              <w:t xml:space="preserve">      1,631</w:t>
-            </w:r>
-          </w:p>
-        </w:tc>
-        <w:tc>
-          <w:p>
-            <w:pPr>
-              <w:pStyle w:val="SourceCode"/>
-              <w:jc w:val="left"/>
-            </w:pPr>
-            <w:r>
-              <w:rPr>
-                <w:rStyle w:val="VerbatimChar"/>
-              </w:rPr>
-              <w:t xml:space="preserve">           12</w:t>
-            </w:r>
-          </w:p>
-        </w:tc>
-        <w:tc>
-          <w:p>
-            <w:pPr>
-              <w:pStyle w:val="SourceCode"/>
-              <w:jc w:val="left"/>
-            </w:pPr>
-            <w:r>
-              <w:rPr>
-                <w:rStyle w:val="VerbatimChar"/>
-              </w:rPr>
-              <w:t xml:space="preserve">   0.640</w:t>
-            </w:r>
-          </w:p>
-        </w:tc>
-        <w:tc>
-          <w:p>
-            <w:pPr>
-              <w:pStyle w:val="SourceCode"/>
-              <w:jc w:val="left"/>
-            </w:pPr>
-            <w:r>
-              <w:rPr>
-                <w:rStyle w:val="VerbatimChar"/>
-              </w:rPr>
-              <w:t xml:space="preserve">       0.865</w:t>
-            </w:r>
-          </w:p>
-        </w:tc>
-        <w:tc>
-          <w:p>
-            <w:pPr>
-              <w:pStyle w:val="SourceCode"/>
-              <w:jc w:val="left"/>
-            </w:pPr>
-            <w:r>
-              <w:rPr>
-                <w:rStyle w:val="VerbatimChar"/>
-              </w:rPr>
-              <w:t xml:space="preserve">            0.056</w:t>
-            </w:r>
-          </w:p>
-        </w:tc>
-      </w:tr>
-    </w:tbl>
     <w:p>
       <w:pPr>
         <w:pStyle w:val="CaptionedFigure"/>

</xml_diff>

<commit_message>
Translate second author's affiliation to English; add lead-in sentence before Methods pipeline figure
</commit_message>
<xml_diff>
--- a/manuscrito/manuscript.docx
+++ b/manuscrito/manuscript.docx
@@ -32,7 +32,7 @@
         <w:pStyle w:val="BodyText"/>
       </w:pPr>
       <w:r>
-        <w:t xml:space="preserve">² Facultad de Ciencias Económicas, Administrativas y Contables, Universidad Libre Seccional Pereira, Pereira, Colombia</w:t>
+        <w:t xml:space="preserve">² Faculty of Economic, Administrative and Accounting Sciences, Universidad Libre Seccional Pereira, Pereira, Colombia</w:t>
       </w:r>
     </w:p>
     <w:p>
@@ -395,6 +395,14 @@
       </w:pPr>
       <w:r>
         <w:t xml:space="preserve">3. Methods</w:t>
+      </w:r>
+    </w:p>
+    <w:p>
+      <w:pPr>
+        <w:pStyle w:val="FirstParagraph"/>
+      </w:pPr>
+      <w:r>
+        <w:t xml:space="preserve">The pipeline proceeds through six stages, from a Web of Science search to the final Index of Perspective Fragmentation, summarized in Figure 1 and detailed in the subsections that follow.</w:t>
       </w:r>
     </w:p>
     <w:p>

</xml_diff>

<commit_message>
Fix text loss caused by LaTeX figure floats
Pandoc was auto-wrapping standalone images in numbered LaTeX 'figure'
floats, which the float-placement algorithm could reposition in ways
that corrupted nearby content (the 4.3 Robustness heading and most of
its paragraph were being dropped near page 13-14). Fixed by disabling
the implicit_figures extension and using manually numbered, non-floating
captions instead — images and captions now render exactly where they
appear in the source, with no float-related side effects.
</commit_message>
<xml_diff>
--- a/manuscrito/manuscript.docx
+++ b/manuscrito/manuscript.docx
@@ -407,14 +407,14 @@
     </w:p>
     <w:p>
       <w:pPr>
-        <w:pStyle w:val="CaptionedFigure"/>
+        <w:pStyle w:val="BodyText"/>
       </w:pPr>
       <w:r>
         <w:drawing>
           <wp:inline>
             <wp:extent cx="5334000" cy="1215364"/>
             <wp:effectExtent b="0" l="0" r="0" t="0"/>
-            <wp:docPr descr="Methodological pipeline: from Web of Science title search to the Index of Perspective Fragmentation (six stages)." title="" id="1" name="Picture"/>
+            <wp:docPr descr="" title="" id="1" name="Picture"/>
             <a:graphic>
               <a:graphicData uri="http://schemas.openxmlformats.org/drawingml/2006/picture">
                 <pic:pic>
@@ -454,8 +454,18 @@
     </w:p>
     <w:p>
       <w:pPr>
-        <w:pStyle w:val="ImageCaption"/>
-      </w:pPr>
+        <w:pStyle w:val="BodyText"/>
+      </w:pPr>
+      <w:r>
+        <w:rPr>
+          <w:bCs/>
+          <w:b/>
+        </w:rPr>
+        <w:t xml:space="preserve">Figure 1.</w:t>
+      </w:r>
+      <w:r>
+        <w:t xml:space="preserve"> </w:t>
+      </w:r>
       <w:r>
         <w:t xml:space="preserve">Methodological pipeline: from Web of Science title search to the Index of Perspective Fragmentation (six stages).</w:t>
       </w:r>
@@ -1047,14 +1057,14 @@
     </w:p>
     <w:p>
       <w:pPr>
-        <w:pStyle w:val="CaptionedFigure"/>
+        <w:pStyle w:val="BodyText"/>
       </w:pPr>
       <w:r>
         <w:drawing>
           <wp:inline>
             <wp:extent cx="5334000" cy="3593084"/>
             <wp:effectExtent b="0" l="0" r="0" t="0"/>
-            <wp:docPr descr="Co-citation network of the RVRP anchor field. Node color denotes Louvain community; node size denotes PageRank centrality; only the top-45 most central nodes per cluster and intra-cluster edges are shown for legibility." title="" id="1" name="Picture"/>
+            <wp:docPr descr="" title="" id="1" name="Picture"/>
             <a:graphic>
               <a:graphicData uri="http://schemas.openxmlformats.org/drawingml/2006/picture">
                 <pic:pic>
@@ -1094,8 +1104,18 @@
     </w:p>
     <w:p>
       <w:pPr>
-        <w:pStyle w:val="ImageCaption"/>
-      </w:pPr>
+        <w:pStyle w:val="BodyText"/>
+      </w:pPr>
+      <w:r>
+        <w:rPr>
+          <w:bCs/>
+          <w:b/>
+        </w:rPr>
+        <w:t xml:space="preserve">Figure 2.</w:t>
+      </w:r>
+      <w:r>
+        <w:t xml:space="preserve"> </w:t>
+      </w:r>
       <w:r>
         <w:t xml:space="preserve">Co-citation network of the RVRP anchor field. Node color denotes Louvain community; node size denotes PageRank centrality; only the top-45 most central nodes per cluster and intra-cluster edges are shown for legibility.</w:t>
       </w:r>
@@ -1436,14 +1456,14 @@
     </w:p>
     <w:p>
       <w:pPr>
-        <w:pStyle w:val="CaptionedFigure"/>
+        <w:pStyle w:val="BodyText"/>
       </w:pPr>
       <w:r>
         <w:drawing>
           <wp:inline>
             <wp:extent cx="5334000" cy="3565708"/>
             <wp:effectExtent b="0" l="0" r="0" t="0"/>
-            <wp:docPr descr="Co-citation network of the RVRP literature under the controlled replication (identical 469-article corpus to the anchor study, Topic search)." title="" id="1" name="Picture"/>
+            <wp:docPr descr="" title="" id="1" name="Picture"/>
             <a:graphic>
               <a:graphicData uri="http://schemas.openxmlformats.org/drawingml/2006/picture">
                 <pic:pic>
@@ -1483,8 +1503,18 @@
     </w:p>
     <w:p>
       <w:pPr>
-        <w:pStyle w:val="ImageCaption"/>
-      </w:pPr>
+        <w:pStyle w:val="BodyText"/>
+      </w:pPr>
+      <w:r>
+        <w:rPr>
+          <w:bCs/>
+          <w:b/>
+        </w:rPr>
+        <w:t xml:space="preserve">Figure 3.</w:t>
+      </w:r>
+      <w:r>
+        <w:t xml:space="preserve"> </w:t>
+      </w:r>
       <w:r>
         <w:t xml:space="preserve">Co-citation network of the RVRP literature under the controlled replication (identical 469-article corpus to the anchor study, Topic search).</w:t>
       </w:r>
@@ -3598,14 +3628,14 @@
     </w:p>
     <w:p>
       <w:pPr>
-        <w:pStyle w:val="CaptionedFigure"/>
+        <w:pStyle w:val="BodyText"/>
       </w:pPr>
       <w:r>
         <w:drawing>
           <wp:inline>
             <wp:extent cx="5334000" cy="3817836"/>
             <wp:effectExtent b="0" l="0" r="0" t="0"/>
-            <wp:docPr descr="Co-citation network of Supply Chain Resilience, the field with the lowest observed IFP (0.328)." title="" id="1" name="Picture"/>
+            <wp:docPr descr="" title="" id="1" name="Picture"/>
             <a:graphic>
               <a:graphicData uri="http://schemas.openxmlformats.org/drawingml/2006/picture">
                 <pic:pic>
@@ -3645,22 +3675,32 @@
     </w:p>
     <w:p>
       <w:pPr>
-        <w:pStyle w:val="ImageCaption"/>
-      </w:pPr>
+        <w:pStyle w:val="BodyText"/>
+      </w:pPr>
+      <w:r>
+        <w:rPr>
+          <w:bCs/>
+          <w:b/>
+        </w:rPr>
+        <w:t xml:space="preserve">Figure 4.</w:t>
+      </w:r>
+      <w:r>
+        <w:t xml:space="preserve"> </w:t>
+      </w:r>
       <w:r>
         <w:t xml:space="preserve">Co-citation network of Supply Chain Resilience, the field with the lowest observed IFP (0.328).</w:t>
       </w:r>
     </w:p>
     <w:p>
       <w:pPr>
-        <w:pStyle w:val="CaptionedFigure"/>
+        <w:pStyle w:val="BodyText"/>
       </w:pPr>
       <w:r>
         <w:drawing>
           <wp:inline>
             <wp:extent cx="5334000" cy="3637291"/>
             <wp:effectExtent b="0" l="0" r="0" t="0"/>
-            <wp:docPr descr="Co-citation network of Sustainable Urban Mobility, the field with the highest observed IFP (0.640)." title="" id="1" name="Picture"/>
+            <wp:docPr descr="" title="" id="1" name="Picture"/>
             <a:graphic>
               <a:graphicData uri="http://schemas.openxmlformats.org/drawingml/2006/picture">
                 <pic:pic>
@@ -3700,22 +3740,32 @@
     </w:p>
     <w:p>
       <w:pPr>
-        <w:pStyle w:val="ImageCaption"/>
-      </w:pPr>
+        <w:pStyle w:val="BodyText"/>
+      </w:pPr>
+      <w:r>
+        <w:rPr>
+          <w:bCs/>
+          <w:b/>
+        </w:rPr>
+        <w:t xml:space="preserve">Figure 5.</w:t>
+      </w:r>
+      <w:r>
+        <w:t xml:space="preserve"> </w:t>
+      </w:r>
       <w:r>
         <w:t xml:space="preserve">Co-citation network of Sustainable Urban Mobility, the field with the highest observed IFP (0.640).</w:t>
       </w:r>
     </w:p>
     <w:p>
       <w:pPr>
-        <w:pStyle w:val="CaptionedFigure"/>
+        <w:pStyle w:val="BodyText"/>
       </w:pPr>
       <w:r>
         <w:drawing>
           <wp:inline>
             <wp:extent cx="5334000" cy="4441062"/>
             <wp:effectExtent b="0" l="0" r="0" t="0"/>
-            <wp:docPr descr="Comparative ranking of IFP across all 20 fields." title="" id="1" name="Picture"/>
+            <wp:docPr descr="" title="" id="1" name="Picture"/>
             <a:graphic>
               <a:graphicData uri="http://schemas.openxmlformats.org/drawingml/2006/picture">
                 <pic:pic>
@@ -3755,8 +3805,18 @@
     </w:p>
     <w:p>
       <w:pPr>
-        <w:pStyle w:val="ImageCaption"/>
-      </w:pPr>
+        <w:pStyle w:val="BodyText"/>
+      </w:pPr>
+      <w:r>
+        <w:rPr>
+          <w:bCs/>
+          <w:b/>
+        </w:rPr>
+        <w:t xml:space="preserve">Figure 6.</w:t>
+      </w:r>
+      <w:r>
+        <w:t xml:space="preserve"> </w:t>
+      </w:r>
       <w:r>
         <w:t xml:space="preserve">Comparative ranking of IFP across all 20 fields.</w:t>
       </w:r>
@@ -3799,14 +3859,14 @@
     </w:p>
     <w:p>
       <w:pPr>
-        <w:pStyle w:val="CaptionedFigure"/>
+        <w:pStyle w:val="BodyText"/>
       </w:pPr>
       <w:r>
         <w:drawing>
           <wp:inline>
             <wp:extent cx="5334000" cy="2513391"/>
             <wp:effectExtent b="0" l="0" r="0" t="0"/>
-            <wp:docPr descr="Robustness check: IFP plotted against the number of source articles (left) and the number of nodes in the pruned network (right), across all 20 fields. Dashed lines show ordinary least-squares fits; neither correlation is statistically significant at α = 0.05." title="" id="1" name="Picture"/>
+            <wp:docPr descr="" title="" id="1" name="Picture"/>
             <a:graphic>
               <a:graphicData uri="http://schemas.openxmlformats.org/drawingml/2006/picture">
                 <pic:pic>
@@ -3846,8 +3906,18 @@
     </w:p>
     <w:p>
       <w:pPr>
-        <w:pStyle w:val="ImageCaption"/>
-      </w:pPr>
+        <w:pStyle w:val="BodyText"/>
+      </w:pPr>
+      <w:r>
+        <w:rPr>
+          <w:bCs/>
+          <w:b/>
+        </w:rPr>
+        <w:t xml:space="preserve">Figure 7.</w:t>
+      </w:r>
+      <w:r>
+        <w:t xml:space="preserve"> </w:t>
+      </w:r>
       <w:r>
         <w:t xml:space="preserve">Robustness check: IFP plotted against the number of source articles (left) and the number of nodes in the pruned network (right), across all 20 fields. Dashed lines show ordinary least-squares fits; neither correlation is statistically significant at α = 0.05.</w:t>
       </w:r>

</xml_diff>

<commit_message>
Add missing in-text callouts and analysis for Figures 2, 3, and 6
Figure 6 (the comparative IFP ranking) previously had no in-text
reference or analysis beyond its caption. Added a paragraph noting
the largest gap in the ranking (0.379 to 0.441, verified against the
data) separates a low-fragmentation tier of four fields from the
rest, tying into the Section 4.4 qualitative patterns. Also added
explicit callouts for Figures 2 and 3 (the RVRP validation networks),
which had surrounding analysis but no numbered reference.
</commit_message>
<xml_diff>
--- a/manuscrito/manuscript.docx
+++ b/manuscrito/manuscript.docx
@@ -1052,7 +1052,7 @@
         <w:pStyle w:val="FirstParagraph"/>
       </w:pPr>
       <w:r>
-        <w:t xml:space="preserve">The automated pipeline identified six significant perspectives in the Title-search RVRP corpus (IFP = 0.526, Q = 0.613, inter-cluster proportion = 0.216; n = 393 articles, pruned network = 1,630 nodes) and seven in the controlled, identical-corpus Topic-search replication (IFP = 0.564, Q = 0.549, inter-cluster proportion = 0.268; n = 469 articles, pruned network = 2,329 nodes) — both modularity values exceeding the anchor study’s Q = 0.474, consistent with at least comparably well-defined community structure under either search strategy. Table 2 maps both automated results onto the anchor study’s four manually interpreted perspectives.</w:t>
+        <w:t xml:space="preserve">The automated pipeline identified six significant perspectives in the Title-search RVRP corpus (IFP = 0.526, Q = 0.613, inter-cluster proportion = 0.216; n = 393 articles, pruned network = 1,630 nodes) and seven in the controlled, identical-corpus Topic-search replication (IFP = 0.564, Q = 0.549, inter-cluster proportion = 0.268; n = 469 articles, pruned network = 2,329 nodes) — both modularity values exceeding the anchor study’s Q = 0.474, consistent with at least comparably well-defined community structure under either search strategy. Table 2 maps both automated results onto the anchor study’s four manually interpreted perspectives. Figure 2 shows the resulting Title-search network: the six perspectives form clearly separated, internally dense communities, with no visual overlap between clusters of the kind that would signal an artifact of the type discussed in Section 3.7.</w:t>
       </w:r>
     </w:p>
     <w:p>
@@ -1451,7 +1451,7 @@
         <w:t xml:space="preserve"> </w:t>
       </w:r>
       <w:r>
-        <w:t xml:space="preserve">out of nine detected, versus our fixed 3%-of-nodes significance threshold applied uniformly across 20 fields. We report this as an honest limitation of the mechanical, threshold-based approach required for cross-field comparability (Section 6), not as a claim that Perspective 4 does not exist in the literature.</w:t>
+        <w:t xml:space="preserve">out of nine detected, versus our fixed 3%-of-nodes significance threshold applied uniformly across 20 fields. We report this as an honest limitation of the mechanical, threshold-based approach required for cross-field comparability (Section 6), not as a claim that Perspective 4 does not exist in the literature. Figure 3 shows the corresponding controlled-replication network: seven communities, again clearly separated, with the two Inventory-Routing-Problem variants (Table 2) forming visually distinct clusters rather than a single merged one.</w:t>
       </w:r>
     </w:p>
     <w:p>
@@ -3754,6 +3754,14 @@
       </w:r>
       <w:r>
         <w:t xml:space="preserve">Co-citation network of Sustainable Urban Mobility, the field with the highest observed IFP (0.640).</w:t>
+      </w:r>
+    </w:p>
+    <w:p>
+      <w:pPr>
+        <w:pStyle w:val="BodyText"/>
+      </w:pPr>
+      <w:r>
+        <w:t xml:space="preserve">Figure 6 presents this ranking visually, ordered from lowest to highest IFP. The distribution is not uniform: a small tier of four fields (Supply Chain Resilience, Research Integrity, Corporate Social Responsibility, and CRISPR Gene Editing) sits clearly apart, below an IFP of 0.38, separated by the largest single gap in the ranking (0.379 to 0.441) from the remaining sixteen fields, which increase comparatively gradually up to the highest-fragmentation tier. This separation is consistent with the qualitative distinction developed in Section 4.4: the low-IFP tier consists of fields organized around a small set of widely shared foundational citations, while the fields above the gap increasingly combine distinct substantive sub-questions, competing methodological toolkits, or both.</w:t>
       </w:r>
     </w:p>
     <w:p>

</xml_diff>

<commit_message>
Trim abstract to 200 words for journal submission form limit
</commit_message>
<xml_diff>
--- a/manuscrito/manuscript.docx
+++ b/manuscrito/manuscript.docx
@@ -64,25 +64,7 @@
         <w:pStyle w:val="FirstParagraph"/>
       </w:pPr>
       <w:r>
-        <w:t xml:space="preserve">Co-citation analysis has long been used to map the</w:t>
-      </w:r>
-      <w:r>
-        <w:t xml:space="preserve"> </w:t>
-      </w:r>
-      <w:r>
-        <w:t xml:space="preserve">“</w:t>
-      </w:r>
-      <w:r>
-        <w:t xml:space="preserve">intellectual structure</w:t>
-      </w:r>
-      <w:r>
-        <w:t xml:space="preserve">”</w:t>
-      </w:r>
-      <w:r>
-        <w:t xml:space="preserve"> </w:t>
-      </w:r>
-      <w:r>
-        <w:t xml:space="preserve">of a research field — the distinct schools of thought, or</w:t>
+        <w:t xml:space="preserve">Co-citation analysis maps a research field’s intellectual structure into distinct schools of thought, or</w:t>
       </w:r>
       <w:r>
         <w:t xml:space="preserve"> </w:t>
@@ -95,7 +77,7 @@
         <w:t xml:space="preserve">perspectives</w:t>
       </w:r>
       <w:r>
-        <w:t xml:space="preserve">, that a body of literature organizes itself into. Traditionally this mapping is done by hand for a single field at a time, which makes it labor-intensive, difficult to reproduce, and — critically — impossible to compare across fields, since no two manual studies use the same corpus size, clustering parameters, or naming conventions. We present an automated, end-to-end pipeline that standardizes this process: a Web of Science title-field search is converted into a co-citation network, pruned to a fixed target size regardless of raw corpus volume, partitioned into communities with the Louvain algorithm, ranked internally with PageRank, and automatically labeled using a large language model grounded in resolved reference titles. From these components we derive the</w:t>
+        <w:t xml:space="preserve">, but is traditionally done by hand for one field at a time, labor-intensive and incomparable across studies using different corpus sizes, clustering parameters, or naming conventions. We present an automated pipeline that standardizes this process: a Web of Science title-field search is converted into a co-citation network, pruned to a fixed target size regardless of corpus volume, partitioned with the Louvain algorithm, ranked with PageRank, and automatically labeled with a large language model. From these components we derive the</w:t>
       </w:r>
       <w:r>
         <w:t xml:space="preserve"> </w:t>
@@ -108,23 +90,7 @@
         <w:t xml:space="preserve">Index of Perspective Fragmentation (IFP)</w:t>
       </w:r>
       <w:r>
-        <w:t xml:space="preserve">, a composite measure combining network modularity, the proportion of inter-cluster citations, and the number of significant perspectives. We validate the pipeline against a manually constructed co-citation map of the Refrigerated Vehicle Routing Problem (RVRP) literature published in</w:t>
-      </w:r>
-      <w:r>
-        <w:t xml:space="preserve"> </w:t>
-      </w:r>
-      <w:r>
-        <w:rPr>
-          <w:iCs/>
-          <w:i/>
-        </w:rPr>
-        <w:t xml:space="preserve">Frontiers in Research Metrics and Analytics</w:t>
-      </w:r>
-      <w:r>
-        <w:t xml:space="preserve"> </w:t>
-      </w:r>
-      <w:r>
-        <w:t xml:space="preserve">(Aristizábal Torres et al., 2026), then apply it comparatively to 20 research fields spanning the natural sciences, social sciences, health, technology, and environmental science. IFP ranges from 0.328 (Supply Chain Resilience) to 0.640 (Sustainable Urban Mobility) and shows no significant correlation with corpus size (r = -0.220, p = 0.352 for article count; r = -0.128, p = 0.589 for network size), indicating that the index captures genuine structural properties of a field rather than an artifact of sample volume. We further document a recurring source of measurement bias — narrow, single-facet search queries that spuriously split a single coherent perspective into near-duplicate clusters — and the safeguards we developed against it. The pipeline, code, and full dataset are made publicly available.</w:t>
+        <w:t xml:space="preserve">, combining network modularity, inter-cluster citation proportion, and perspective count. We validate the pipeline against a manually constructed co-citation map of the Refrigerated Vehicle Routing Problem literature (Aristizábal Torres et al., 2026), then apply it to 20 fields spanning the natural and social sciences, health, and technology. IFP ranges from 0.328 to 0.640 and shows no significant correlation with corpus size, indicating it captures genuine structural properties rather than sample-volume artifacts. We also document a source of measurement bias, narrow search queries that spuriously split perspectives into near-duplicate clusters, and the safeguards developed against it. Pipeline, code, and dataset are publicly available.</w:t>
       </w:r>
     </w:p>
     <w:p>

</xml_diff>